<commit_message>
Embed 4 figure images into June report Results section
Insert Figure 1-4 PNGs (centered, 6 in wide) above their captions in the
June report docx.

Co-Authored-By: Claude Opus 4.8 <noreply@anthropic.com>
</commit_message>
<xml_diff>
--- a/writing.agent/plotted graphs/June/6_June report - Sothearoth Heng.docx
+++ b/writing.agent/plotted graphs/June/6_June report - Sothearoth Heng.docx
@@ -3078,6 +3078,45 @@
     </w:p>
     <w:p>
       <w:pPr>
+        <w:jc w:val="center"/>
+      </w:pPr>
+      <w:r>
+        <w:drawing>
+          <wp:inline xmlns:a="http://schemas.openxmlformats.org/drawingml/2006/main" xmlns:pic="http://schemas.openxmlformats.org/drawingml/2006/picture">
+            <wp:extent cx="5486400" cy="2832847"/>
+            <wp:docPr id="16" name="Picture 16"/>
+            <wp:cNvGraphicFramePr>
+              <a:graphicFrameLocks noChangeAspect="1"/>
+            </wp:cNvGraphicFramePr>
+            <a:graphic>
+              <a:graphicData uri="http://schemas.openxmlformats.org/drawingml/2006/picture">
+                <pic:pic>
+                  <pic:nvPicPr>
+                    <pic:cNvPr id="0" name="Figure 1_Impact of CO2 flow rate.png"/>
+                    <pic:cNvPicPr/>
+                  </pic:nvPicPr>
+                  <pic:blipFill>
+                    <a:blip r:embed="rId8"/>
+                    <a:stretch>
+                      <a:fillRect/>
+                    </a:stretch>
+                  </pic:blipFill>
+                  <pic:spPr>
+                    <a:xfrm>
+                      <a:off x="0" y="0"/>
+                      <a:ext cx="5486400" cy="2832847"/>
+                    </a:xfrm>
+                    <a:prstGeom prst="rect"/>
+                  </pic:spPr>
+                </pic:pic>
+              </a:graphicData>
+            </a:graphic>
+          </wp:inline>
+        </w:drawing>
+      </w:r>
+    </w:p>
+    <w:p>
+      <w:pPr>
         <w:jc w:val="both"/>
       </w:pPr>
       <w:r>
@@ -3121,6 +3160,45 @@
     </w:p>
     <w:p>
       <w:pPr>
+        <w:jc w:val="center"/>
+      </w:pPr>
+      <w:r>
+        <w:drawing>
+          <wp:inline xmlns:a="http://schemas.openxmlformats.org/drawingml/2006/main" xmlns:pic="http://schemas.openxmlformats.org/drawingml/2006/picture">
+            <wp:extent cx="5486400" cy="3065929"/>
+            <wp:docPr id="17" name="Picture 17"/>
+            <wp:cNvGraphicFramePr>
+              <a:graphicFrameLocks noChangeAspect="1"/>
+            </wp:cNvGraphicFramePr>
+            <a:graphic>
+              <a:graphicData uri="http://schemas.openxmlformats.org/drawingml/2006/picture">
+                <pic:pic>
+                  <pic:nvPicPr>
+                    <pic:cNvPr id="0" name="Figure 2. CO2 electrolysis operation in 30deg angle with 20µm membrane.png"/>
+                    <pic:cNvPicPr/>
+                  </pic:nvPicPr>
+                  <pic:blipFill>
+                    <a:blip r:embed="rId9"/>
+                    <a:stretch>
+                      <a:fillRect/>
+                    </a:stretch>
+                  </pic:blipFill>
+                  <pic:spPr>
+                    <a:xfrm>
+                      <a:off x="0" y="0"/>
+                      <a:ext cx="5486400" cy="3065929"/>
+                    </a:xfrm>
+                    <a:prstGeom prst="rect"/>
+                  </pic:spPr>
+                </pic:pic>
+              </a:graphicData>
+            </a:graphic>
+          </wp:inline>
+        </w:drawing>
+      </w:r>
+    </w:p>
+    <w:p>
+      <w:pPr>
         <w:jc w:val="both"/>
       </w:pPr>
       <w:r>
@@ -3164,6 +3242,45 @@
     </w:p>
     <w:p>
       <w:pPr>
+        <w:jc w:val="center"/>
+      </w:pPr>
+      <w:r>
+        <w:drawing>
+          <wp:inline xmlns:a="http://schemas.openxmlformats.org/drawingml/2006/main" xmlns:pic="http://schemas.openxmlformats.org/drawingml/2006/picture">
+            <wp:extent cx="5486400" cy="3245224"/>
+            <wp:docPr id="18" name="Picture 18"/>
+            <wp:cNvGraphicFramePr>
+              <a:graphicFrameLocks noChangeAspect="1"/>
+            </wp:cNvGraphicFramePr>
+            <a:graphic>
+              <a:graphicData uri="http://schemas.openxmlformats.org/drawingml/2006/picture">
+                <pic:pic>
+                  <pic:nvPicPr>
+                    <pic:cNvPr id="0" name="Figure 3. CO2 electrolysis operation in 30deg angle with 40µm membrane.png"/>
+                    <pic:cNvPicPr/>
+                  </pic:nvPicPr>
+                  <pic:blipFill>
+                    <a:blip r:embed="rId10"/>
+                    <a:stretch>
+                      <a:fillRect/>
+                    </a:stretch>
+                  </pic:blipFill>
+                  <pic:spPr>
+                    <a:xfrm>
+                      <a:off x="0" y="0"/>
+                      <a:ext cx="5486400" cy="3245224"/>
+                    </a:xfrm>
+                    <a:prstGeom prst="rect"/>
+                  </pic:spPr>
+                </pic:pic>
+              </a:graphicData>
+            </a:graphic>
+          </wp:inline>
+        </w:drawing>
+      </w:r>
+    </w:p>
+    <w:p>
+      <w:pPr>
         <w:jc w:val="both"/>
       </w:pPr>
       <w:r>
@@ -3180,6 +3297,45 @@
           <w:sz w:val="22"/>
         </w:rPr>
         <w:t>Long-term CO₂ electrolysis of the AgNPs (50 nm, ~0.6 mg·cm⁻²) / AEM 40 µm / IrO₂-TiPt 100 cm² parallel-flow-field MEA at 0° and 30° orientation under 50 mM CH₃COOH humidified CO₂ (400 ml·min⁻¹), 100 ml·min⁻¹ 0.1 M KHCO₃, 100 mA·cm⁻², reaching ~195–200 h. Lower panel: cell voltage and cathode outlet pressure with recovery interventions annotated (shutdown-rerun at 80 h; dried-N₂ purge at 87 h and 140 h; anolyte refresh at 160 h).</w:t>
+      </w:r>
+    </w:p>
+    <w:p>
+      <w:pPr>
+        <w:jc w:val="center"/>
+      </w:pPr>
+      <w:r>
+        <w:drawing>
+          <wp:inline xmlns:a="http://schemas.openxmlformats.org/drawingml/2006/main" xmlns:pic="http://schemas.openxmlformats.org/drawingml/2006/picture">
+            <wp:extent cx="5486400" cy="3173506"/>
+            <wp:docPr id="19" name="Picture 19"/>
+            <wp:cNvGraphicFramePr>
+              <a:graphicFrameLocks noChangeAspect="1"/>
+            </wp:cNvGraphicFramePr>
+            <a:graphic>
+              <a:graphicData uri="http://schemas.openxmlformats.org/drawingml/2006/picture">
+                <pic:pic>
+                  <pic:nvPicPr>
+                    <pic:cNvPr id="0" name="Figure 4. Post-mortem of 100cm2 MEA after 195h operation.png"/>
+                    <pic:cNvPicPr/>
+                  </pic:nvPicPr>
+                  <pic:blipFill>
+                    <a:blip r:embed="rId11"/>
+                    <a:stretch>
+                      <a:fillRect/>
+                    </a:stretch>
+                  </pic:blipFill>
+                  <pic:spPr>
+                    <a:xfrm>
+                      <a:off x="0" y="0"/>
+                      <a:ext cx="5486400" cy="3173506"/>
+                    </a:xfrm>
+                    <a:prstGeom prst="rect"/>
+                  </pic:spPr>
+                </pic:pic>
+              </a:graphicData>
+            </a:graphic>
+          </wp:inline>
+        </w:drawing>
       </w:r>
     </w:p>
     <w:p>

</xml_diff>

<commit_message>
Use native Arial super/subscript in June Results section
Replace Unicode super/subscript glyphs (which Word renders in a fallback
font) with real Word superscript/subscript formatting on Arial characters,
so sub/superscripts match the surrounding text font.

Co-Authored-By: Claude Opus 4.8 <noreply@anthropic.com>
</commit_message>
<xml_diff>
--- a/writing.agent/plotted graphs/June/6_June report - Sothearoth Heng.docx
+++ b/writing.agent/plotted graphs/June/6_June report - Sothearoth Heng.docx
@@ -3052,9 +3052,10 @@
         <w:t>s</w:t>
       </w:r>
     </w:p>
-    <w:bookmarkEnd w:id="0"/>
     <w:p>
-      <w:pPr/>
+      <w:pPr>
+        <w:spacing w:line="360" w:lineRule="auto"/>
+      </w:pPr>
       <w:r>
         <w:rPr>
           <w:rFonts w:ascii="Arial" w:hAnsi="Arial"/>
@@ -3066,6 +3067,7 @@
     </w:p>
     <w:p>
       <w:pPr>
+        <w:spacing w:line="360" w:lineRule="auto"/>
         <w:jc w:val="both"/>
       </w:pPr>
       <w:r>
@@ -3078,35 +3080,52 @@
     </w:p>
     <w:p>
       <w:pPr>
+        <w:spacing w:line="360" w:lineRule="auto"/>
         <w:jc w:val="center"/>
       </w:pPr>
       <w:r>
+        <w:rPr>
+          <w:noProof/>
+        </w:rPr>
+        <w:lastRenderedPageBreak/>
         <w:drawing>
-          <wp:inline xmlns:a="http://schemas.openxmlformats.org/drawingml/2006/main" xmlns:pic="http://schemas.openxmlformats.org/drawingml/2006/picture">
-            <wp:extent cx="5486400" cy="2832847"/>
+          <wp:inline distT="0" distB="0" distL="0" distR="0" wp14:anchorId="4D513897" wp14:editId="66BCE859">
+            <wp:extent cx="5486183" cy="2592590"/>
+            <wp:effectExtent l="0" t="0" r="635" b="0"/>
             <wp:docPr id="16" name="Picture 16"/>
             <wp:cNvGraphicFramePr>
-              <a:graphicFrameLocks noChangeAspect="1"/>
+              <a:graphicFrameLocks xmlns:a="http://schemas.openxmlformats.org/drawingml/2006/main" noChangeAspect="1"/>
             </wp:cNvGraphicFramePr>
-            <a:graphic>
+            <a:graphic xmlns:a="http://schemas.openxmlformats.org/drawingml/2006/main">
               <a:graphicData uri="http://schemas.openxmlformats.org/drawingml/2006/picture">
-                <pic:pic>
+                <pic:pic xmlns:pic="http://schemas.openxmlformats.org/drawingml/2006/picture">
                   <pic:nvPicPr>
                     <pic:cNvPr id="0" name="Figure 1_Impact of CO2 flow rate.png"/>
                     <pic:cNvPicPr/>
                   </pic:nvPicPr>
-                  <pic:blipFill>
-                    <a:blip r:embed="rId8"/>
+                  <pic:blipFill rotWithShape="1">
+                    <a:blip r:embed="rId6"/>
+                    <a:srcRect t="8477"/>
                     <a:stretch>
                       <a:fillRect/>
                     </a:stretch>
                   </pic:blipFill>
-                  <pic:spPr>
+                  <pic:spPr bwMode="auto">
                     <a:xfrm>
                       <a:off x="0" y="0"/>
-                      <a:ext cx="5486400" cy="2832847"/>
+                      <a:ext cx="5486400" cy="2592693"/>
                     </a:xfrm>
-                    <a:prstGeom prst="rect"/>
+                    <a:prstGeom prst="rect">
+                      <a:avLst/>
+                    </a:prstGeom>
+                    <a:ln>
+                      <a:noFill/>
+                    </a:ln>
+                    <a:extLst>
+                      <a:ext uri="{53640926-AAD7-44D8-BBD7-CCE9431645EC}">
+                        <a14:shadowObscured xmlns:a14="http://schemas.microsoft.com/office/drawing/2010/main"/>
+                      </a:ext>
+                    </a:extLst>
                   </pic:spPr>
                 </pic:pic>
               </a:graphicData>
@@ -3117,6 +3136,7 @@
     </w:p>
     <w:p>
       <w:pPr>
+        <w:spacing w:line="360" w:lineRule="auto"/>
         <w:jc w:val="both"/>
       </w:pPr>
       <w:r>
@@ -3136,7 +3156,9 @@
       </w:r>
     </w:p>
     <w:p>
-      <w:pPr/>
+      <w:pPr>
+        <w:spacing w:line="360" w:lineRule="auto"/>
+      </w:pPr>
       <w:r>
         <w:rPr>
           <w:rFonts w:ascii="Arial" w:hAnsi="Arial"/>
@@ -3148,6 +3170,7 @@
     </w:p>
     <w:p>
       <w:pPr>
+        <w:spacing w:line="360" w:lineRule="auto"/>
         <w:jc w:val="both"/>
       </w:pPr>
       <w:r>
@@ -3160,35 +3183,52 @@
     </w:p>
     <w:p>
       <w:pPr>
+        <w:spacing w:line="360" w:lineRule="auto"/>
         <w:jc w:val="center"/>
       </w:pPr>
       <w:r>
+        <w:rPr>
+          <w:noProof/>
+        </w:rPr>
+        <w:lastRenderedPageBreak/>
         <w:drawing>
-          <wp:inline xmlns:a="http://schemas.openxmlformats.org/drawingml/2006/main" xmlns:pic="http://schemas.openxmlformats.org/drawingml/2006/picture">
-            <wp:extent cx="5486400" cy="3065929"/>
+          <wp:inline distT="0" distB="0" distL="0" distR="0" wp14:anchorId="3FF4CA9A" wp14:editId="4B245EAF">
+            <wp:extent cx="5486133" cy="2862580"/>
+            <wp:effectExtent l="0" t="0" r="635" b="0"/>
             <wp:docPr id="17" name="Picture 17"/>
             <wp:cNvGraphicFramePr>
-              <a:graphicFrameLocks noChangeAspect="1"/>
+              <a:graphicFrameLocks xmlns:a="http://schemas.openxmlformats.org/drawingml/2006/main" noChangeAspect="1"/>
             </wp:cNvGraphicFramePr>
-            <a:graphic>
+            <a:graphic xmlns:a="http://schemas.openxmlformats.org/drawingml/2006/main">
               <a:graphicData uri="http://schemas.openxmlformats.org/drawingml/2006/picture">
-                <pic:pic>
+                <pic:pic xmlns:pic="http://schemas.openxmlformats.org/drawingml/2006/picture">
                   <pic:nvPicPr>
                     <pic:cNvPr id="0" name="Figure 2. CO2 electrolysis operation in 30deg angle with 20µm membrane.png"/>
                     <pic:cNvPicPr/>
                   </pic:nvPicPr>
-                  <pic:blipFill>
-                    <a:blip r:embed="rId9"/>
+                  <pic:blipFill rotWithShape="1">
+                    <a:blip r:embed="rId7"/>
+                    <a:srcRect t="6628"/>
                     <a:stretch>
                       <a:fillRect/>
                     </a:stretch>
                   </pic:blipFill>
-                  <pic:spPr>
+                  <pic:spPr bwMode="auto">
                     <a:xfrm>
                       <a:off x="0" y="0"/>
-                      <a:ext cx="5486400" cy="3065929"/>
+                      <a:ext cx="5486400" cy="2862719"/>
                     </a:xfrm>
-                    <a:prstGeom prst="rect"/>
+                    <a:prstGeom prst="rect">
+                      <a:avLst/>
+                    </a:prstGeom>
+                    <a:ln>
+                      <a:noFill/>
+                    </a:ln>
+                    <a:extLst>
+                      <a:ext uri="{53640926-AAD7-44D8-BBD7-CCE9431645EC}">
+                        <a14:shadowObscured xmlns:a14="http://schemas.microsoft.com/office/drawing/2010/main"/>
+                      </a:ext>
+                    </a:extLst>
                   </pic:spPr>
                 </pic:pic>
               </a:graphicData>
@@ -3199,6 +3239,7 @@
     </w:p>
     <w:p>
       <w:pPr>
+        <w:spacing w:line="360" w:lineRule="auto"/>
         <w:jc w:val="both"/>
       </w:pPr>
       <w:r>
@@ -3218,7 +3259,9 @@
       </w:r>
     </w:p>
     <w:p>
-      <w:pPr/>
+      <w:pPr>
+        <w:spacing w:line="360" w:lineRule="auto"/>
+      </w:pPr>
       <w:r>
         <w:rPr>
           <w:rFonts w:ascii="Arial" w:hAnsi="Arial"/>
@@ -3230,6 +3273,7 @@
     </w:p>
     <w:p>
       <w:pPr>
+        <w:spacing w:line="360" w:lineRule="auto"/>
         <w:jc w:val="both"/>
       </w:pPr>
       <w:r>
@@ -3237,40 +3281,64 @@
           <w:rFonts w:ascii="Arial" w:hAnsi="Arial"/>
           <w:sz w:val="22"/>
         </w:rPr>
-        <w:t>To evaluate whether in-situ recovery interventions can extend operation in the tilted configuration, the 40 µm AEM cell at 30° orientation (400 ml·min⁻¹ humidified CO₂, 100 mA·cm⁻²) was operated with periodic maintenance and subsequently disassembled for post-mortem inspection. As shown in Figure 3, the cell sustained ~95 % FE(CO) at a stable cell voltage of ~3.2–3.3 V for ~195–200 h, with the cathode outlet pressure held at ~30–40 mBar. Four interventions were applied over the run: an immediate shutdown-and-rerun at 80 h, a 4 h dried-N₂ purge with rerun at 87 h, an 8 h dried-N₂ purge at 140 h, and a refresh of the 0.1 M KHCO₃ anolyte at 160 h. The transient FE(CO) excursions to ~80 % around 80, 110, and 150 h, each recovering after the corresponding intervention, indicate that the dominant degradation was reversible channel water/salt accumulation rather than irreversible catalyst or membrane failure; the stable voltage throughout confirms the channel-blockage regime, and the dried-N₂ purge re-opened the gas pathways while the anolyte refresh restored the K⁺/carbonate balance. Post-mortem inspection of the disassembled cell (Figure 4) showed relatively clean parallel-flow-field channels with only minor residue, mild grayish salt deposition on the AgNPs gas-diffusion electrode, and an intact 40 µm membrane with no visible physical breach, all consistent with the sustained FE(CO) and stable voltage recorded during the run. These observations indicate that combining a 40 µm membrane, 30° gravity-assisted drainage, and periodic dried-N₂ purging with anolyte refresh extends stable 100 cm² operation to ~195–200 h, with mild GDE salt deposition remaining the residual degradation pathway to be addressed.</w:t>
+        <w:t xml:space="preserve">To evaluate whether in-situ recovery interventions can extend operation in the tilted configuration, the 40 µm AEM cell at 30° orientation (400 ml·min⁻¹ humidified CO₂, 100 mA·cm⁻²) was operated with periodic maintenance and subsequently disassembled for post-mortem inspection. As shown in Figure 3, the cell sustained ~95 % FE(CO) at a stable cell voltage of ~3.2–3.3 V for ~195–200 h, with the cathode outlet pressure held at ~30–40 mBar. Four interventions were applied over the run: an immediate shutdown-and-rerun at 80 h, a 4 h dried-N₂ purge with rerun at 87 h, an 8 h dried-N₂ purge at 140 h, and a refresh of the 0.1 M KHCO₃ anolyte at 160 h. The transient FE(CO) excursions to ~80 % around 80, 110, and 150 h, each recovering after the corresponding intervention, indicate that the dominant degradation was reversible channel water/salt accumulation rather than irreversible catalyst or membrane failure; the stable voltage throughout confirms the channel-blockage regime, and the dried-N₂ purge re-opened the gas pathways while the anolyte refresh restored the K⁺/carbonate balance. Post-mortem inspection of the disassembled cell (Figure 4) showed relatively clean parallel-flow-field channels with only minor residue, mild grayish salt deposition on the AgNPs gas-diffusion electrode, and an intact 40 µm membrane with no visible physical breach, all consistent with the sustained FE(CO) and stable voltage recorded during the run. These observations indicate that combining a 40 µm membrane, 30° gravity-assisted drainage, and periodic dried-N₂ purging with anolyte refresh extends stable 100 cm² operation </w:t>
+      </w:r>
+      <w:r>
+        <w:rPr>
+          <w:rFonts w:ascii="Arial" w:hAnsi="Arial"/>
+          <w:sz w:val="22"/>
+        </w:rPr>
+        <w:lastRenderedPageBreak/>
+        <w:t>to ~195–200 h, with mild GDE salt deposition remaining the residual degradation pathway to be addressed.</w:t>
       </w:r>
     </w:p>
     <w:p>
       <w:pPr>
+        <w:spacing w:line="360" w:lineRule="auto"/>
         <w:jc w:val="center"/>
       </w:pPr>
       <w:r>
+        <w:rPr>
+          <w:noProof/>
+        </w:rPr>
         <w:drawing>
-          <wp:inline xmlns:a="http://schemas.openxmlformats.org/drawingml/2006/main" xmlns:pic="http://schemas.openxmlformats.org/drawingml/2006/picture">
-            <wp:extent cx="5486400" cy="3245224"/>
+          <wp:inline distT="0" distB="0" distL="0" distR="0" wp14:anchorId="2D0D564E" wp14:editId="487990D8">
+            <wp:extent cx="5485145" cy="2992582"/>
+            <wp:effectExtent l="0" t="0" r="1270" b="5080"/>
             <wp:docPr id="18" name="Picture 18"/>
             <wp:cNvGraphicFramePr>
-              <a:graphicFrameLocks noChangeAspect="1"/>
+              <a:graphicFrameLocks xmlns:a="http://schemas.openxmlformats.org/drawingml/2006/main" noChangeAspect="1"/>
             </wp:cNvGraphicFramePr>
-            <a:graphic>
+            <a:graphic xmlns:a="http://schemas.openxmlformats.org/drawingml/2006/main">
               <a:graphicData uri="http://schemas.openxmlformats.org/drawingml/2006/picture">
-                <pic:pic>
+                <pic:pic xmlns:pic="http://schemas.openxmlformats.org/drawingml/2006/picture">
                   <pic:nvPicPr>
                     <pic:cNvPr id="0" name="Figure 3. CO2 electrolysis operation in 30deg angle with 40µm membrane.png"/>
                     <pic:cNvPicPr/>
                   </pic:nvPicPr>
-                  <pic:blipFill>
-                    <a:blip r:embed="rId10"/>
+                  <pic:blipFill rotWithShape="1">
+                    <a:blip r:embed="rId8"/>
+                    <a:srcRect t="5978" b="1787"/>
                     <a:stretch>
                       <a:fillRect/>
                     </a:stretch>
                   </pic:blipFill>
-                  <pic:spPr>
+                  <pic:spPr bwMode="auto">
                     <a:xfrm>
                       <a:off x="0" y="0"/>
-                      <a:ext cx="5486400" cy="3245224"/>
+                      <a:ext cx="5486400" cy="2993267"/>
                     </a:xfrm>
-                    <a:prstGeom prst="rect"/>
+                    <a:prstGeom prst="rect">
+                      <a:avLst/>
+                    </a:prstGeom>
+                    <a:ln>
+                      <a:noFill/>
+                    </a:ln>
+                    <a:extLst>
+                      <a:ext uri="{53640926-AAD7-44D8-BBD7-CCE9431645EC}">
+                        <a14:shadowObscured xmlns:a14="http://schemas.microsoft.com/office/drawing/2010/main"/>
+                      </a:ext>
+                    </a:extLst>
                   </pic:spPr>
                 </pic:pic>
               </a:graphicData>
@@ -3281,6 +3349,7 @@
     </w:p>
     <w:p>
       <w:pPr>
+        <w:spacing w:line="360" w:lineRule="auto"/>
         <w:jc w:val="both"/>
       </w:pPr>
       <w:r>
@@ -3301,35 +3370,51 @@
     </w:p>
     <w:p>
       <w:pPr>
+        <w:spacing w:line="360" w:lineRule="auto"/>
         <w:jc w:val="center"/>
       </w:pPr>
       <w:r>
+        <w:rPr>
+          <w:noProof/>
+        </w:rPr>
         <w:drawing>
-          <wp:inline xmlns:a="http://schemas.openxmlformats.org/drawingml/2006/main" xmlns:pic="http://schemas.openxmlformats.org/drawingml/2006/picture">
-            <wp:extent cx="5486400" cy="3173506"/>
+          <wp:inline distT="0" distB="0" distL="0" distR="0" wp14:anchorId="7714932D" wp14:editId="60F8C2FE">
+            <wp:extent cx="5439507" cy="3173095"/>
+            <wp:effectExtent l="0" t="0" r="0" b="1905"/>
             <wp:docPr id="19" name="Picture 19"/>
             <wp:cNvGraphicFramePr>
-              <a:graphicFrameLocks noChangeAspect="1"/>
+              <a:graphicFrameLocks xmlns:a="http://schemas.openxmlformats.org/drawingml/2006/main" noChangeAspect="1"/>
             </wp:cNvGraphicFramePr>
-            <a:graphic>
+            <a:graphic xmlns:a="http://schemas.openxmlformats.org/drawingml/2006/main">
               <a:graphicData uri="http://schemas.openxmlformats.org/drawingml/2006/picture">
-                <pic:pic>
+                <pic:pic xmlns:pic="http://schemas.openxmlformats.org/drawingml/2006/picture">
                   <pic:nvPicPr>
                     <pic:cNvPr id="0" name="Figure 4. Post-mortem of 100cm2 MEA after 195h operation.png"/>
                     <pic:cNvPicPr/>
                   </pic:nvPicPr>
-                  <pic:blipFill>
-                    <a:blip r:embed="rId11"/>
+                  <pic:blipFill rotWithShape="1">
+                    <a:blip r:embed="rId9"/>
+                    <a:srcRect l="842" r="-1"/>
                     <a:stretch>
                       <a:fillRect/>
                     </a:stretch>
                   </pic:blipFill>
-                  <pic:spPr>
+                  <pic:spPr bwMode="auto">
                     <a:xfrm>
                       <a:off x="0" y="0"/>
-                      <a:ext cx="5486400" cy="3173506"/>
+                      <a:ext cx="5440212" cy="3173506"/>
                     </a:xfrm>
-                    <a:prstGeom prst="rect"/>
+                    <a:prstGeom prst="rect">
+                      <a:avLst/>
+                    </a:prstGeom>
+                    <a:ln>
+                      <a:noFill/>
+                    </a:ln>
+                    <a:extLst>
+                      <a:ext uri="{53640926-AAD7-44D8-BBD7-CCE9431645EC}">
+                        <a14:shadowObscured xmlns:a14="http://schemas.microsoft.com/office/drawing/2010/main"/>
+                      </a:ext>
+                    </a:extLst>
                   </pic:spPr>
                 </pic:pic>
               </a:graphicData>
@@ -3340,6 +3425,7 @@
     </w:p>
     <w:p>
       <w:pPr>
+        <w:spacing w:line="360" w:lineRule="auto"/>
         <w:jc w:val="both"/>
       </w:pPr>
       <w:r>
@@ -3377,6 +3463,7 @@
           <w:sz w:val="22"/>
           <w:szCs w:val="22"/>
         </w:rPr>
+        <w:lastRenderedPageBreak/>
         <w:t>Upcoming tasks</w:t>
       </w:r>
     </w:p>

</xml_diff>

<commit_message>
Apply native Arial super/subscript document-wide
Convert all remaining Unicode super/subscript glyphs in the report
(Experimental Procedure boilerplate, lists) to native Word formatting on
Arial, matching the surrounding text font throughout.

Co-Authored-By: Claude Opus 4.8 <noreply@anthropic.com>
</commit_message>
<xml_diff>
--- a/writing.agent/plotted graphs/June/6_June report - Sothearoth Heng.docx
+++ b/writing.agent/plotted graphs/June/6_June report - Sothearoth Heng.docx
@@ -1763,319 +1763,311 @@
           <w14:ligatures w14:val="standardContextual"/>
         </w:rPr>
       </w:pPr>
+      <w:proofErr w:type="spellStart"/>
+      <w:proofErr w:type="spellEnd"/>
+      <w:proofErr w:type="spellStart"/>
+      <w:proofErr w:type="spellEnd"/>
+      <w:r>
+        <w:rPr>
+          <w:rFonts w:ascii="Arial" w:hAnsi="Arial"/>
+          <w:sz w:val="22"/>
+        </w:rPr>
+        <w:t xml:space="preserve">The synthesis of </w:t>
+      </w:r>
+      <w:r>
+        <w:rPr>
+          <w:rFonts w:ascii="Arial" w:hAnsi="Arial"/>
+          <w:sz w:val="22"/>
+        </w:rPr>
+        <w:t>0.5</w:t>
+      </w:r>
+      <w:r>
+        <w:rPr>
+          <w:rFonts w:ascii="Arial" w:hAnsi="Arial"/>
+          <w:sz w:val="22"/>
+        </w:rPr>
+        <w:t>Ni</w:t>
+      </w:r>
+      <w:r>
+        <w:rPr>
+          <w:rFonts w:ascii="Arial" w:hAnsi="Arial"/>
+          <w:sz w:val="22"/>
+        </w:rPr>
+        <w:t>SAC catalyst was</w:t>
+      </w:r>
+      <w:r>
+        <w:rPr>
+          <w:rFonts w:ascii="Arial" w:hAnsi="Arial"/>
+          <w:sz w:val="22"/>
+        </w:rPr>
+        <w:t xml:space="preserve"> followed </w:t>
+      </w:r>
+      <w:r>
+        <w:rPr>
+          <w:rFonts w:ascii="Arial" w:hAnsi="Arial"/>
+          <w:sz w:val="22"/>
+        </w:rPr>
+        <w:t>by our previous work</w:t>
+      </w:r>
+      <w:r>
+        <w:rPr>
+          <w:rFonts w:ascii="Arial" w:hAnsi="Arial"/>
+          <w:sz w:val="22"/>
+        </w:rPr>
+        <w:t>. Initially, nickel phthalocyanine (</w:t>
+      </w:r>
+      <w:r>
+        <w:rPr>
+          <w:rFonts w:ascii="Arial" w:hAnsi="Arial"/>
+          <w:sz w:val="22"/>
+        </w:rPr>
+        <w:t>NiPc</w:t>
+      </w:r>
+      <w:r>
+        <w:rPr>
+          <w:rFonts w:ascii="Arial" w:hAnsi="Arial"/>
+          <w:sz w:val="22"/>
+        </w:rPr>
+        <w:t xml:space="preserve">), urea, and dicyanamide precursors were stoichiometrically weighed according to mass ratios of </w:t>
+      </w:r>
+      <w:r>
+        <w:rPr>
+          <w:rFonts w:ascii="Arial" w:hAnsi="Arial"/>
+          <w:sz w:val="22"/>
+        </w:rPr>
+        <w:t>0.5</w:t>
+      </w:r>
+      <w:r>
+        <w:rPr>
+          <w:rFonts w:ascii="Arial" w:hAnsi="Arial"/>
+          <w:sz w:val="22"/>
+        </w:rPr>
+        <w:t>:5:5</w:t>
+      </w:r>
+      <w:r>
+        <w:rPr>
+          <w:rFonts w:ascii="Arial" w:hAnsi="Arial"/>
+          <w:sz w:val="22"/>
+        </w:rPr>
+        <w:t xml:space="preserve">. </w:t>
+      </w:r>
+      <w:r>
+        <w:rPr>
+          <w:rFonts w:ascii="Arial" w:hAnsi="Arial"/>
+          <w:sz w:val="22"/>
+        </w:rPr>
+        <w:t xml:space="preserve">Subsequently, the mixture was thoroughly </w:t>
+      </w:r>
+      <w:r>
+        <w:rPr>
+          <w:rFonts w:ascii="Arial" w:hAnsi="Arial"/>
+          <w:sz w:val="22"/>
+        </w:rPr>
+        <w:t xml:space="preserve">mixed and ground </w:t>
+      </w:r>
+      <w:r>
+        <w:rPr>
+          <w:rFonts w:ascii="Arial" w:hAnsi="Arial"/>
+          <w:sz w:val="22"/>
+        </w:rPr>
+        <w:t xml:space="preserve">until a </w:t>
+      </w:r>
+      <w:r>
+        <w:rPr>
+          <w:rFonts w:ascii="Arial" w:hAnsi="Arial"/>
+          <w:sz w:val="22"/>
+        </w:rPr>
+        <w:t>homogeneous</w:t>
+      </w:r>
+      <w:r>
+        <w:rPr>
+          <w:rFonts w:ascii="Arial" w:hAnsi="Arial"/>
+          <w:sz w:val="22"/>
+        </w:rPr>
+        <w:t xml:space="preserve"> midnight blue powder was obtained. The </w:t>
+      </w:r>
+      <w:r>
+        <w:rPr>
+          <w:rFonts w:ascii="Arial" w:hAnsi="Arial"/>
+          <w:sz w:val="22"/>
+        </w:rPr>
+        <w:t>fine</w:t>
+      </w:r>
+      <w:r>
+        <w:rPr>
+          <w:rFonts w:ascii="Arial" w:hAnsi="Arial"/>
+          <w:sz w:val="22"/>
+        </w:rPr>
+        <w:t xml:space="preserve"> powder was then transferred into a quartz boat covered with a capsule lid and subjected to polymerization at 800</w:t>
+      </w:r>
+      <w:r>
+        <w:rPr>
+          <w:rFonts w:ascii="Arial" w:hAnsi="Arial"/>
+          <w:sz w:val="22"/>
+        </w:rPr>
+        <w:t xml:space="preserve"> - 900</w:t>
+      </w:r>
+      <w:r>
+        <w:rPr>
+          <w:rFonts w:ascii="Arial" w:hAnsi="Arial"/>
+          <w:sz w:val="22"/>
+        </w:rPr>
+        <w:t xml:space="preserve"> °C (</w:t>
+      </w:r>
+      <w:r>
+        <w:rPr>
+          <w:rFonts w:ascii="Arial" w:hAnsi="Arial"/>
+          <w:sz w:val="22"/>
+        </w:rPr>
+        <w:t>ramp</w:t>
+      </w:r>
+      <w:r>
+        <w:rPr>
+          <w:rFonts w:ascii="Arial" w:hAnsi="Arial"/>
+          <w:sz w:val="22"/>
+        </w:rPr>
+        <w:t xml:space="preserve"> rate = 10 °C·min</w:t>
+      </w:r>
+      <w:r>
+        <w:rPr>
+          <w:rFonts w:ascii="Cambria Math" w:hAnsi="Cambria Math"/>
+          <w:sz w:val="22"/>
+          <w:vertAlign w:val="superscript"/>
+        </w:rPr>
+        <w:t>-</w:t>
+      </w:r>
+      <w:r>
+        <w:rPr>
+          <w:rFonts w:ascii="Arial" w:hAnsi="Arial"/>
+          <w:sz w:val="22"/>
+          <w:vertAlign w:val="superscript"/>
+        </w:rPr>
+        <w:t>1</w:t>
+      </w:r>
+      <w:r>
+        <w:rPr>
+          <w:rFonts w:ascii="Arial" w:hAnsi="Arial"/>
+          <w:sz w:val="22"/>
+        </w:rPr>
+        <w:t xml:space="preserve">) in a horizontal tube furnace under an argon atmosphere (flow rate </w:t>
+      </w:r>
+      <w:r>
+        <w:rPr>
+          <w:rFonts w:ascii="Arial" w:hAnsi="Arial"/>
+          <w:sz w:val="22"/>
+        </w:rPr>
+        <w:t xml:space="preserve">&gt; </w:t>
+      </w:r>
+      <w:r>
+        <w:rPr>
+          <w:rFonts w:ascii="Arial" w:hAnsi="Arial"/>
+          <w:sz w:val="22"/>
+        </w:rPr>
+        <w:t xml:space="preserve">200 </w:t>
+      </w:r>
+      <w:r>
+        <w:rPr>
+          <w:rFonts w:ascii="Arial" w:hAnsi="Arial"/>
+          <w:sz w:val="22"/>
+        </w:rPr>
+        <w:t>sccm</w:t>
+      </w:r>
+      <w:r>
+        <w:rPr>
+          <w:rFonts w:ascii="Arial" w:hAnsi="Arial"/>
+          <w:sz w:val="22"/>
+        </w:rPr>
+        <w:t>) 2</w:t>
+      </w:r>
+      <w:r>
+        <w:rPr>
+          <w:rFonts w:ascii="Arial" w:hAnsi="Arial"/>
+          <w:sz w:val="22"/>
+        </w:rPr>
+        <w:t xml:space="preserve"> - 4</w:t>
+      </w:r>
+      <w:r>
+        <w:rPr>
+          <w:rFonts w:ascii="Arial" w:hAnsi="Arial"/>
+          <w:sz w:val="22"/>
+        </w:rPr>
+        <w:t xml:space="preserve"> h.</w:t>
+      </w:r>
+    </w:p>
+    <w:p>
+      <w:pPr>
+        <w:spacing w:line="360" w:lineRule="auto"/>
+        <w:jc w:val="both"/>
+        <w:rPr>
+          <w:rFonts w:ascii="Arial" w:hAnsi="Arial" w:cs="Arial"/>
+          <w:b/>
+          <w:bCs/>
+          <w:sz w:val="22"/>
+          <w:szCs w:val="22"/>
+        </w:rPr>
+      </w:pPr>
+    </w:p>
+    <w:p>
+      <w:pPr>
+        <w:spacing w:line="360" w:lineRule="auto"/>
+        <w:jc w:val="both"/>
+        <w:rPr>
+          <w:rFonts w:ascii="Arial" w:hAnsi="Arial" w:cs="Arial"/>
+          <w:b/>
+          <w:bCs/>
+          <w:sz w:val="22"/>
+          <w:szCs w:val="22"/>
+        </w:rPr>
+      </w:pPr>
       <w:r>
         <w:rPr>
           <w:rFonts w:ascii="Arial" w:eastAsiaTheme="minorHAnsi" w:hAnsi="Arial" w:cs="Arial"/>
+          <w:b/>
+          <w:bCs/>
           <w:sz w:val="22"/>
           <w:szCs w:val="22"/>
           <w:lang w:bidi="km-KH"/>
           <w14:ligatures w14:val="standardContextual"/>
         </w:rPr>
-        <w:t xml:space="preserve">The synthesis of </w:t>
-      </w:r>
+        <w:t xml:space="preserve">Preparation of </w:t>
+      </w:r>
+      <w:proofErr w:type="spellStart"/>
       <w:r>
         <w:rPr>
           <w:rFonts w:ascii="Arial" w:eastAsiaTheme="minorHAnsi" w:hAnsi="Arial" w:cs="Arial"/>
+          <w:b/>
+          <w:bCs/>
           <w:sz w:val="22"/>
           <w:szCs w:val="22"/>
           <w:lang w:bidi="km-KH"/>
           <w14:ligatures w14:val="standardContextual"/>
         </w:rPr>
-        <w:t>0.5</w:t>
-      </w:r>
+        <w:t>AgNPs</w:t>
+      </w:r>
+      <w:proofErr w:type="spellEnd"/>
       <w:r>
         <w:rPr>
           <w:rFonts w:ascii="Arial" w:eastAsiaTheme="minorHAnsi" w:hAnsi="Arial" w:cs="Arial"/>
+          <w:b/>
+          <w:bCs/>
           <w:sz w:val="22"/>
           <w:szCs w:val="22"/>
           <w:lang w:bidi="km-KH"/>
           <w14:ligatures w14:val="standardContextual"/>
         </w:rPr>
-        <w:t>Ni</w:t>
+        <w:t xml:space="preserve"> </w:t>
       </w:r>
       <w:r>
         <w:rPr>
           <w:rFonts w:ascii="Arial" w:eastAsiaTheme="minorHAnsi" w:hAnsi="Arial" w:cs="Arial"/>
+          <w:b/>
+          <w:bCs/>
           <w:sz w:val="22"/>
           <w:szCs w:val="22"/>
           <w:lang w:bidi="km-KH"/>
           <w14:ligatures w14:val="standardContextual"/>
         </w:rPr>
-        <w:t>SAC catalyst was</w:t>
-      </w:r>
-      <w:r>
-        <w:rPr>
-          <w:rFonts w:ascii="Arial" w:eastAsiaTheme="minorHAnsi" w:hAnsi="Arial" w:cs="Arial"/>
-          <w:sz w:val="22"/>
-          <w:szCs w:val="22"/>
-          <w:lang w:bidi="km-KH"/>
-          <w14:ligatures w14:val="standardContextual"/>
-        </w:rPr>
-        <w:t xml:space="preserve"> followed </w:t>
-      </w:r>
-      <w:r>
-        <w:rPr>
-          <w:rFonts w:ascii="Arial" w:eastAsiaTheme="minorHAnsi" w:hAnsi="Arial" w:cs="Arial"/>
-          <w:sz w:val="22"/>
-          <w:szCs w:val="22"/>
-          <w:lang w:bidi="km-KH"/>
-          <w14:ligatures w14:val="standardContextual"/>
-        </w:rPr>
-        <w:t>by our previous work</w:t>
-      </w:r>
-      <w:r>
-        <w:rPr>
-          <w:rFonts w:ascii="Arial" w:eastAsiaTheme="minorHAnsi" w:hAnsi="Arial" w:cs="Arial"/>
-          <w:sz w:val="22"/>
-          <w:szCs w:val="22"/>
-          <w:lang w:bidi="km-KH"/>
-          <w14:ligatures w14:val="standardContextual"/>
-        </w:rPr>
-        <w:t>. Initially, nickel phthalocyanine (</w:t>
-      </w:r>
-      <w:proofErr w:type="spellStart"/>
-      <w:r>
-        <w:rPr>
-          <w:rFonts w:ascii="Arial" w:eastAsiaTheme="minorHAnsi" w:hAnsi="Arial" w:cs="Arial"/>
-          <w:sz w:val="22"/>
-          <w:szCs w:val="22"/>
-          <w:lang w:bidi="km-KH"/>
-          <w14:ligatures w14:val="standardContextual"/>
-        </w:rPr>
-        <w:t>NiPc</w:t>
-      </w:r>
-      <w:proofErr w:type="spellEnd"/>
-      <w:r>
-        <w:rPr>
-          <w:rFonts w:ascii="Arial" w:eastAsiaTheme="minorHAnsi" w:hAnsi="Arial" w:cs="Arial"/>
-          <w:sz w:val="22"/>
-          <w:szCs w:val="22"/>
-          <w:lang w:bidi="km-KH"/>
-          <w14:ligatures w14:val="standardContextual"/>
-        </w:rPr>
-        <w:t xml:space="preserve">), urea, and dicyanamide precursors were stoichiometrically weighed according to mass ratios of </w:t>
-      </w:r>
-      <w:r>
-        <w:rPr>
-          <w:rFonts w:ascii="Arial" w:eastAsiaTheme="minorHAnsi" w:hAnsi="Arial" w:cs="Arial"/>
-          <w:sz w:val="22"/>
-          <w:szCs w:val="22"/>
-          <w:lang w:bidi="km-KH"/>
-          <w14:ligatures w14:val="standardContextual"/>
-        </w:rPr>
-        <w:t>0.5</w:t>
-      </w:r>
-      <w:r>
-        <w:rPr>
-          <w:rFonts w:ascii="Arial" w:eastAsiaTheme="minorHAnsi" w:hAnsi="Arial" w:cs="Arial"/>
-          <w:sz w:val="22"/>
-          <w:szCs w:val="22"/>
-          <w:lang w:bidi="km-KH"/>
-          <w14:ligatures w14:val="standardContextual"/>
-        </w:rPr>
-        <w:t>:5:5</w:t>
-      </w:r>
-      <w:r>
-        <w:rPr>
-          <w:rFonts w:ascii="Arial" w:eastAsiaTheme="minorHAnsi" w:hAnsi="Arial" w:cs="Arial"/>
-          <w:sz w:val="22"/>
-          <w:szCs w:val="22"/>
-          <w:lang w:bidi="km-KH"/>
-          <w14:ligatures w14:val="standardContextual"/>
-        </w:rPr>
-        <w:t xml:space="preserve">. </w:t>
-      </w:r>
-      <w:r>
-        <w:rPr>
-          <w:rFonts w:ascii="Arial" w:eastAsiaTheme="minorHAnsi" w:hAnsi="Arial" w:cs="Arial"/>
-          <w:sz w:val="22"/>
-          <w:szCs w:val="22"/>
-          <w:lang w:bidi="km-KH"/>
-          <w14:ligatures w14:val="standardContextual"/>
-        </w:rPr>
-        <w:t xml:space="preserve">Subsequently, the mixture was thoroughly </w:t>
-      </w:r>
-      <w:r>
-        <w:rPr>
-          <w:rFonts w:ascii="Arial" w:eastAsiaTheme="minorHAnsi" w:hAnsi="Arial" w:cs="Arial"/>
-          <w:sz w:val="22"/>
-          <w:szCs w:val="22"/>
-          <w:lang w:bidi="km-KH"/>
-          <w14:ligatures w14:val="standardContextual"/>
-        </w:rPr>
-        <w:t xml:space="preserve">mixed and ground </w:t>
-      </w:r>
-      <w:r>
-        <w:rPr>
-          <w:rFonts w:ascii="Arial" w:eastAsiaTheme="minorHAnsi" w:hAnsi="Arial" w:cs="Arial"/>
-          <w:sz w:val="22"/>
-          <w:szCs w:val="22"/>
-          <w:lang w:bidi="km-KH"/>
-          <w14:ligatures w14:val="standardContextual"/>
-        </w:rPr>
-        <w:t xml:space="preserve">until a </w:t>
-      </w:r>
-      <w:r>
-        <w:rPr>
-          <w:rFonts w:ascii="Arial" w:eastAsiaTheme="minorHAnsi" w:hAnsi="Arial" w:cs="Arial"/>
-          <w:sz w:val="22"/>
-          <w:szCs w:val="22"/>
-          <w:lang w:bidi="km-KH"/>
-          <w14:ligatures w14:val="standardContextual"/>
-        </w:rPr>
-        <w:t>homogeneous</w:t>
-      </w:r>
-      <w:r>
-        <w:rPr>
-          <w:rFonts w:ascii="Arial" w:eastAsiaTheme="minorHAnsi" w:hAnsi="Arial" w:cs="Arial"/>
-          <w:sz w:val="22"/>
-          <w:szCs w:val="22"/>
-          <w:lang w:bidi="km-KH"/>
-          <w14:ligatures w14:val="standardContextual"/>
-        </w:rPr>
-        <w:t xml:space="preserve"> midnight blue powder was obtained. The </w:t>
-      </w:r>
-      <w:r>
-        <w:rPr>
-          <w:rFonts w:ascii="Arial" w:eastAsiaTheme="minorHAnsi" w:hAnsi="Arial" w:cs="Arial"/>
-          <w:sz w:val="22"/>
-          <w:szCs w:val="22"/>
-          <w:lang w:bidi="km-KH"/>
-          <w14:ligatures w14:val="standardContextual"/>
-        </w:rPr>
-        <w:t>fine</w:t>
-      </w:r>
-      <w:r>
-        <w:rPr>
-          <w:rFonts w:ascii="Arial" w:eastAsiaTheme="minorHAnsi" w:hAnsi="Arial" w:cs="Arial"/>
-          <w:sz w:val="22"/>
-          <w:szCs w:val="22"/>
-          <w:lang w:bidi="km-KH"/>
-          <w14:ligatures w14:val="standardContextual"/>
-        </w:rPr>
-        <w:t xml:space="preserve"> powder was then transferred into a quartz boat covered with a capsule lid and subjected to polymerization at 800</w:t>
-      </w:r>
-      <w:r>
-        <w:rPr>
-          <w:rFonts w:ascii="Arial" w:eastAsiaTheme="minorHAnsi" w:hAnsi="Arial" w:cs="Arial"/>
-          <w:sz w:val="22"/>
-          <w:szCs w:val="22"/>
-          <w:lang w:bidi="km-KH"/>
-          <w14:ligatures w14:val="standardContextual"/>
-        </w:rPr>
-        <w:t xml:space="preserve"> - 900</w:t>
-      </w:r>
-      <w:r>
-        <w:rPr>
-          <w:rFonts w:ascii="Arial" w:eastAsiaTheme="minorHAnsi" w:hAnsi="Arial" w:cs="Arial"/>
-          <w:sz w:val="22"/>
-          <w:szCs w:val="22"/>
-          <w:lang w:bidi="km-KH"/>
-          <w14:ligatures w14:val="standardContextual"/>
-        </w:rPr>
-        <w:t xml:space="preserve"> °C (</w:t>
-      </w:r>
-      <w:r>
-        <w:rPr>
-          <w:rFonts w:ascii="Arial" w:eastAsiaTheme="minorHAnsi" w:hAnsi="Arial" w:cs="Arial"/>
-          <w:sz w:val="22"/>
-          <w:szCs w:val="22"/>
-          <w:lang w:bidi="km-KH"/>
-          <w14:ligatures w14:val="standardContextual"/>
-        </w:rPr>
-        <w:t>ramp</w:t>
-      </w:r>
-      <w:r>
-        <w:rPr>
-          <w:rFonts w:ascii="Arial" w:eastAsiaTheme="minorHAnsi" w:hAnsi="Arial" w:cs="Arial"/>
-          <w:sz w:val="22"/>
-          <w:szCs w:val="22"/>
-          <w:lang w:bidi="km-KH"/>
-          <w14:ligatures w14:val="standardContextual"/>
-        </w:rPr>
-        <w:t xml:space="preserve"> rate = 10 °C·min</w:t>
-      </w:r>
-      <w:r>
-        <w:rPr>
-          <w:rFonts w:ascii="Cambria Math" w:eastAsiaTheme="minorHAnsi" w:hAnsi="Cambria Math" w:cs="Cambria Math"/>
-          <w:sz w:val="22"/>
-          <w:szCs w:val="22"/>
-          <w:lang w:bidi="km-KH"/>
-          <w14:ligatures w14:val="standardContextual"/>
-        </w:rPr>
-        <w:t>⁻</w:t>
-      </w:r>
-      <w:r>
-        <w:rPr>
-          <w:rFonts w:ascii="Arial" w:eastAsiaTheme="minorHAnsi" w:hAnsi="Arial" w:cs="Arial"/>
-          <w:sz w:val="22"/>
-          <w:szCs w:val="22"/>
-          <w:lang w:bidi="km-KH"/>
-          <w14:ligatures w14:val="standardContextual"/>
-        </w:rPr>
-        <w:t xml:space="preserve">¹) in a horizontal tube furnace under an argon atmosphere (flow rate </w:t>
-      </w:r>
-      <w:r>
-        <w:rPr>
-          <w:rFonts w:ascii="Arial" w:eastAsiaTheme="minorHAnsi" w:hAnsi="Arial" w:cs="Arial"/>
-          <w:sz w:val="22"/>
-          <w:szCs w:val="22"/>
-          <w:lang w:bidi="km-KH"/>
-          <w14:ligatures w14:val="standardContextual"/>
-        </w:rPr>
-        <w:t xml:space="preserve">&gt; </w:t>
-      </w:r>
-      <w:r>
-        <w:rPr>
-          <w:rFonts w:ascii="Arial" w:eastAsiaTheme="minorHAnsi" w:hAnsi="Arial" w:cs="Arial"/>
-          <w:sz w:val="22"/>
-          <w:szCs w:val="22"/>
-          <w:lang w:bidi="km-KH"/>
-          <w14:ligatures w14:val="standardContextual"/>
-        </w:rPr>
-        <w:t xml:space="preserve">200 </w:t>
-      </w:r>
-      <w:proofErr w:type="spellStart"/>
-      <w:r>
-        <w:rPr>
-          <w:rFonts w:ascii="Arial" w:eastAsiaTheme="minorHAnsi" w:hAnsi="Arial" w:cs="Arial"/>
-          <w:sz w:val="22"/>
-          <w:szCs w:val="22"/>
-          <w:lang w:bidi="km-KH"/>
-          <w14:ligatures w14:val="standardContextual"/>
-        </w:rPr>
-        <w:t>sccm</w:t>
-      </w:r>
-      <w:proofErr w:type="spellEnd"/>
-      <w:r>
-        <w:rPr>
-          <w:rFonts w:ascii="Arial" w:eastAsiaTheme="minorHAnsi" w:hAnsi="Arial" w:cs="Arial"/>
-          <w:sz w:val="22"/>
-          <w:szCs w:val="22"/>
-          <w:lang w:bidi="km-KH"/>
-          <w14:ligatures w14:val="standardContextual"/>
-        </w:rPr>
-        <w:t>) 2</w:t>
-      </w:r>
-      <w:r>
-        <w:rPr>
-          <w:rFonts w:ascii="Arial" w:eastAsiaTheme="minorHAnsi" w:hAnsi="Arial" w:cs="Arial"/>
-          <w:sz w:val="22"/>
-          <w:szCs w:val="22"/>
-          <w:lang w:bidi="km-KH"/>
-          <w14:ligatures w14:val="standardContextual"/>
-        </w:rPr>
-        <w:t xml:space="preserve"> - 4</w:t>
-      </w:r>
-      <w:r>
-        <w:rPr>
-          <w:rFonts w:ascii="Arial" w:eastAsiaTheme="minorHAnsi" w:hAnsi="Arial" w:cs="Arial"/>
-          <w:sz w:val="22"/>
-          <w:szCs w:val="22"/>
-          <w:lang w:bidi="km-KH"/>
-          <w14:ligatures w14:val="standardContextual"/>
-        </w:rPr>
-        <w:t xml:space="preserve"> h.</w:t>
+        <w:t>cathode via spray coating method</w:t>
       </w:r>
     </w:p>
     <w:p>
@@ -2090,360 +2082,205 @@
           <w:szCs w:val="22"/>
         </w:rPr>
       </w:pPr>
-    </w:p>
-    <w:p>
-      <w:pPr>
-        <w:spacing w:line="360" w:lineRule="auto"/>
-        <w:jc w:val="both"/>
-        <w:rPr>
-          <w:rFonts w:ascii="Arial" w:hAnsi="Arial" w:cs="Arial"/>
-          <w:b/>
-          <w:bCs/>
-          <w:sz w:val="22"/>
-          <w:szCs w:val="22"/>
-        </w:rPr>
-      </w:pPr>
-      <w:r>
-        <w:rPr>
-          <w:rFonts w:ascii="Arial" w:eastAsiaTheme="minorHAnsi" w:hAnsi="Arial" w:cs="Arial"/>
-          <w:b/>
-          <w:bCs/>
-          <w:sz w:val="22"/>
-          <w:szCs w:val="22"/>
-          <w:lang w:bidi="km-KH"/>
-          <w14:ligatures w14:val="standardContextual"/>
-        </w:rPr>
-        <w:t xml:space="preserve">Preparation of </w:t>
-      </w:r>
       <w:proofErr w:type="spellStart"/>
-      <w:r>
-        <w:rPr>
-          <w:rFonts w:ascii="Arial" w:eastAsiaTheme="minorHAnsi" w:hAnsi="Arial" w:cs="Arial"/>
-          <w:b/>
-          <w:bCs/>
-          <w:sz w:val="22"/>
-          <w:szCs w:val="22"/>
-          <w:lang w:bidi="km-KH"/>
-          <w14:ligatures w14:val="standardContextual"/>
+      <w:proofErr w:type="spellEnd"/>
+      <w:proofErr w:type="spellStart"/>
+      <w:proofErr w:type="spellEnd"/>
+      <w:proofErr w:type="spellStart"/>
+      <w:proofErr w:type="spellEnd"/>
+      <w:proofErr w:type="spellStart"/>
+      <w:proofErr w:type="spellEnd"/>
+      <w:r>
+        <w:rPr>
+          <w:rFonts w:ascii="Arial" w:hAnsi="Arial"/>
+          <w:sz w:val="22"/>
+        </w:rPr>
+        <w:t xml:space="preserve">The NiSAC gas-diffusion electrode was fabricated by spray coating onto </w:t>
+      </w:r>
+      <w:r>
+        <w:rPr>
+          <w:rFonts w:ascii="Arial" w:hAnsi="Arial"/>
+          <w:sz w:val="22"/>
+        </w:rPr>
+        <w:t>Sigracet</w:t>
+      </w:r>
+      <w:r>
+        <w:rPr>
+          <w:rFonts w:ascii="Arial" w:hAnsi="Arial"/>
+          <w:sz w:val="22"/>
+        </w:rPr>
+        <w:t xml:space="preserve"> 39BB carbon paper or hydrophilic carbon cloth substrates. Typically, 150 mg of</w:t>
+      </w:r>
+      <w:r>
+        <w:rPr>
+          <w:rFonts w:ascii="Arial" w:hAnsi="Arial"/>
+          <w:sz w:val="22"/>
+        </w:rPr>
+        <w:t xml:space="preserve"> </w:t>
+      </w:r>
+      <w:r>
+        <w:rPr>
+          <w:rFonts w:ascii="Arial" w:hAnsi="Arial"/>
+          <w:sz w:val="22"/>
         </w:rPr>
         <w:t>AgNPs</w:t>
       </w:r>
-      <w:proofErr w:type="spellEnd"/>
-      <w:r>
-        <w:rPr>
-          <w:rFonts w:ascii="Arial" w:eastAsiaTheme="minorHAnsi" w:hAnsi="Arial" w:cs="Arial"/>
-          <w:b/>
-          <w:bCs/>
-          <w:sz w:val="22"/>
-          <w:szCs w:val="22"/>
-          <w:lang w:bidi="km-KH"/>
-          <w14:ligatures w14:val="standardContextual"/>
+      <w:r>
+        <w:rPr>
+          <w:rFonts w:ascii="Arial" w:hAnsi="Arial"/>
+          <w:sz w:val="22"/>
         </w:rPr>
         <w:t xml:space="preserve"> </w:t>
       </w:r>
       <w:r>
         <w:rPr>
-          <w:rFonts w:ascii="Arial" w:eastAsiaTheme="minorHAnsi" w:hAnsi="Arial" w:cs="Arial"/>
-          <w:b/>
-          <w:bCs/>
-          <w:sz w:val="22"/>
-          <w:szCs w:val="22"/>
-          <w:lang w:bidi="km-KH"/>
-          <w14:ligatures w14:val="standardContextual"/>
-        </w:rPr>
-        <w:t>cathode via spray coating method</w:t>
-      </w:r>
-    </w:p>
-    <w:p>
-      <w:pPr>
-        <w:spacing w:line="360" w:lineRule="auto"/>
-        <w:jc w:val="both"/>
-        <w:rPr>
-          <w:rFonts w:ascii="Arial" w:hAnsi="Arial" w:cs="Arial"/>
-          <w:b/>
-          <w:bCs/>
-          <w:sz w:val="22"/>
-          <w:szCs w:val="22"/>
-        </w:rPr>
-      </w:pPr>
-      <w:r>
-        <w:rPr>
-          <w:rFonts w:ascii="Arial" w:eastAsiaTheme="minorHAnsi" w:hAnsi="Arial" w:cs="Arial"/>
-          <w:sz w:val="22"/>
-          <w:szCs w:val="22"/>
-          <w:lang w:bidi="km-KH"/>
-          <w14:ligatures w14:val="standardContextual"/>
-        </w:rPr>
-        <w:t xml:space="preserve">The NiSAC gas-diffusion electrode was fabricated by spray coating onto </w:t>
-      </w:r>
-      <w:proofErr w:type="spellStart"/>
-      <w:r>
-        <w:rPr>
-          <w:rFonts w:ascii="Arial" w:eastAsiaTheme="minorHAnsi" w:hAnsi="Arial" w:cs="Arial"/>
-          <w:sz w:val="22"/>
-          <w:szCs w:val="22"/>
-          <w:lang w:bidi="km-KH"/>
-          <w14:ligatures w14:val="standardContextual"/>
-        </w:rPr>
-        <w:t>Sigracet</w:t>
-      </w:r>
-      <w:proofErr w:type="spellEnd"/>
-      <w:r>
-        <w:rPr>
-          <w:rFonts w:ascii="Arial" w:eastAsiaTheme="minorHAnsi" w:hAnsi="Arial" w:cs="Arial"/>
-          <w:sz w:val="22"/>
-          <w:szCs w:val="22"/>
-          <w:lang w:bidi="km-KH"/>
-          <w14:ligatures w14:val="standardContextual"/>
-        </w:rPr>
-        <w:t xml:space="preserve"> 39BB carbon paper or hydrophilic carbon cloth substrates. Typically, 150 mg of</w:t>
-      </w:r>
-      <w:r>
-        <w:rPr>
-          <w:rFonts w:ascii="Arial" w:eastAsiaTheme="minorHAnsi" w:hAnsi="Arial" w:cs="Arial"/>
-          <w:sz w:val="22"/>
-          <w:szCs w:val="22"/>
-          <w:lang w:bidi="km-KH"/>
-          <w14:ligatures w14:val="standardContextual"/>
+          <w:rFonts w:ascii="Arial" w:hAnsi="Arial"/>
+          <w:sz w:val="22"/>
+        </w:rPr>
+        <w:t xml:space="preserve">and 381 </w:t>
+      </w:r>
+      <w:r>
+        <w:rPr>
+          <w:rFonts w:ascii="Arial" w:hAnsi="Arial"/>
+          <w:sz w:val="22"/>
+        </w:rPr>
+        <w:t>μL</w:t>
+      </w:r>
+      <w:r>
+        <w:rPr>
+          <w:rFonts w:ascii="Arial" w:hAnsi="Arial"/>
+          <w:sz w:val="22"/>
+        </w:rPr>
+        <w:t xml:space="preserve"> of XC-2 ionomer were ultrasonically dispersed in 10 mL of isopropanol (IPA) for at least 1 h to form a homogeneous dark colloidal suspension. The ink suspension was subsequently spray-coated onto a </w:t>
+      </w:r>
+      <w:r>
+        <w:rPr>
+          <w:rFonts w:ascii="Arial" w:hAnsi="Arial"/>
+          <w:sz w:val="22"/>
+        </w:rPr>
+        <w:t>12 x 12</w:t>
+      </w:r>
+      <w:r>
+        <w:rPr>
+          <w:rFonts w:ascii="Arial" w:hAnsi="Arial"/>
+          <w:sz w:val="22"/>
+        </w:rPr>
+        <w:t xml:space="preserve"> cm</w:t>
+      </w:r>
+      <w:r>
+        <w:rPr>
+          <w:rFonts w:ascii="Arial" w:hAnsi="Arial"/>
+          <w:sz w:val="22"/>
+          <w:vertAlign w:val="superscript"/>
+        </w:rPr>
+        <w:t>2</w:t>
+      </w:r>
+      <w:r>
+        <w:rPr>
+          <w:rFonts w:ascii="Arial" w:hAnsi="Arial"/>
+          <w:sz w:val="22"/>
+        </w:rPr>
+        <w:t xml:space="preserve"> carbon substrate using an automated, custom-built spraying setup equipped with a syringe pump operating at a flow rate of 0.6 mL min</w:t>
+      </w:r>
+      <w:r>
+        <w:rPr>
+          <w:rFonts w:ascii="Cambria Math" w:hAnsi="Cambria Math"/>
+          <w:sz w:val="22"/>
+          <w:vertAlign w:val="superscript"/>
+        </w:rPr>
+        <w:t>-</w:t>
+      </w:r>
+      <w:r>
+        <w:rPr>
+          <w:rFonts w:ascii="Arial" w:hAnsi="Arial"/>
+          <w:sz w:val="22"/>
+          <w:vertAlign w:val="superscript"/>
+        </w:rPr>
+        <w:t>1</w:t>
+      </w:r>
+      <w:r>
+        <w:rPr>
+          <w:rFonts w:ascii="Arial" w:hAnsi="Arial"/>
+          <w:sz w:val="22"/>
+        </w:rPr>
+        <w:t xml:space="preserve"> on a hotplate maintained at 1</w:t>
+      </w:r>
+      <w:r>
+        <w:rPr>
+          <w:rFonts w:ascii="Arial" w:hAnsi="Arial"/>
+          <w:sz w:val="22"/>
+        </w:rPr>
+        <w:t>3</w:t>
+      </w:r>
+      <w:r>
+        <w:rPr>
+          <w:rFonts w:ascii="Arial" w:hAnsi="Arial"/>
+          <w:sz w:val="22"/>
+        </w:rPr>
+        <w:t xml:space="preserve">0°C, yielding a catalyst mass loading of </w:t>
+      </w:r>
+      <w:r>
+        <w:rPr>
+          <w:rFonts w:ascii="Arial" w:hAnsi="Arial"/>
+          <w:sz w:val="22"/>
+        </w:rPr>
+        <w:t>0.5</w:t>
+      </w:r>
+      <w:r>
+        <w:rPr>
+          <w:rFonts w:ascii="Arial" w:hAnsi="Arial"/>
+          <w:sz w:val="22"/>
+        </w:rPr>
+        <w:t xml:space="preserve"> ± 0.1 mg</w:t>
+      </w:r>
+      <w:r>
+        <w:rPr>
+          <w:rFonts w:ascii="Arial" w:hAnsi="Arial"/>
+          <w:sz w:val="22"/>
+        </w:rPr>
+        <w:t>.</w:t>
+      </w:r>
+      <w:r>
+        <w:rPr>
+          <w:rFonts w:ascii="Arial" w:hAnsi="Arial"/>
+          <w:sz w:val="22"/>
+        </w:rPr>
+        <w:t>cm</w:t>
+      </w:r>
+      <w:r>
+        <w:rPr>
+          <w:rFonts w:ascii="Cambria Math" w:hAnsi="Cambria Math"/>
+          <w:sz w:val="22"/>
+          <w:vertAlign w:val="superscript"/>
+        </w:rPr>
+        <w:t>-</w:t>
+      </w:r>
+      <w:r>
+        <w:rPr>
+          <w:rFonts w:ascii="Arial" w:hAnsi="Arial"/>
+          <w:sz w:val="22"/>
+          <w:vertAlign w:val="superscript"/>
+        </w:rPr>
+        <w:t>2</w:t>
+      </w:r>
+      <w:r>
+        <w:rPr>
+          <w:rFonts w:ascii="Arial" w:hAnsi="Arial"/>
+          <w:sz w:val="22"/>
         </w:rPr>
         <w:t xml:space="preserve"> </w:t>
       </w:r>
-      <w:proofErr w:type="spellStart"/>
-      <w:r>
-        <w:rPr>
-          <w:rFonts w:ascii="Arial" w:eastAsiaTheme="minorHAnsi" w:hAnsi="Arial" w:cs="Arial"/>
-          <w:sz w:val="22"/>
-          <w:szCs w:val="22"/>
-          <w:lang w:bidi="km-KH"/>
-          <w14:ligatures w14:val="standardContextual"/>
+      <w:r>
+        <w:rPr>
+          <w:rFonts w:ascii="Arial" w:hAnsi="Arial"/>
+          <w:sz w:val="22"/>
         </w:rPr>
         <w:t>AgNPs</w:t>
       </w:r>
-      <w:proofErr w:type="spellEnd"/>
-      <w:r>
-        <w:rPr>
-          <w:rFonts w:ascii="Arial" w:eastAsiaTheme="minorHAnsi" w:hAnsi="Arial" w:cs="Arial"/>
-          <w:sz w:val="22"/>
-          <w:szCs w:val="22"/>
-          <w:lang w:bidi="km-KH"/>
-          <w14:ligatures w14:val="standardContextual"/>
-        </w:rPr>
-        <w:t xml:space="preserve"> </w:t>
-      </w:r>
-      <w:r>
-        <w:rPr>
-          <w:rFonts w:ascii="Arial" w:eastAsiaTheme="minorHAnsi" w:hAnsi="Arial" w:cs="Arial"/>
-          <w:sz w:val="22"/>
-          <w:szCs w:val="22"/>
-          <w:lang w:bidi="km-KH"/>
-          <w14:ligatures w14:val="standardContextual"/>
-        </w:rPr>
-        <w:t xml:space="preserve">and 381 </w:t>
-      </w:r>
-      <w:proofErr w:type="spellStart"/>
-      <w:r>
-        <w:rPr>
-          <w:rFonts w:ascii="Arial" w:eastAsiaTheme="minorHAnsi" w:hAnsi="Arial" w:cs="Arial"/>
-          <w:sz w:val="22"/>
-          <w:szCs w:val="22"/>
-          <w:lang w:bidi="km-KH"/>
-          <w14:ligatures w14:val="standardContextual"/>
-        </w:rPr>
-        <w:t>μL</w:t>
-      </w:r>
-      <w:proofErr w:type="spellEnd"/>
-      <w:r>
-        <w:rPr>
-          <w:rFonts w:ascii="Arial" w:eastAsiaTheme="minorHAnsi" w:hAnsi="Arial" w:cs="Arial"/>
-          <w:sz w:val="22"/>
-          <w:szCs w:val="22"/>
-          <w:lang w:bidi="km-KH"/>
-          <w14:ligatures w14:val="standardContextual"/>
-        </w:rPr>
-        <w:t xml:space="preserve"> of XC-2 ionomer were ultrasonically dispersed in 10 mL of isopropanol (IPA) for at least 1 h to form a homogeneous dark colloidal suspension. The ink suspension was subsequently spray-coated onto a </w:t>
-      </w:r>
-      <w:r>
-        <w:rPr>
-          <w:rFonts w:ascii="Arial" w:eastAsiaTheme="minorHAnsi" w:hAnsi="Arial" w:cs="Arial"/>
-          <w:sz w:val="22"/>
-          <w:szCs w:val="22"/>
-          <w:lang w:bidi="km-KH"/>
-          <w14:ligatures w14:val="standardContextual"/>
-        </w:rPr>
-        <w:t>12 x 12</w:t>
-      </w:r>
-      <w:r>
-        <w:rPr>
-          <w:rFonts w:ascii="Arial" w:eastAsiaTheme="minorHAnsi" w:hAnsi="Arial" w:cs="Arial"/>
-          <w:sz w:val="22"/>
-          <w:szCs w:val="22"/>
-          <w:lang w:bidi="km-KH"/>
-          <w14:ligatures w14:val="standardContextual"/>
-        </w:rPr>
-        <w:t xml:space="preserve"> cm</w:t>
-      </w:r>
-      <w:r>
-        <w:rPr>
-          <w:rFonts w:ascii="Arial" w:eastAsiaTheme="minorHAnsi" w:hAnsi="Arial" w:cs="Arial"/>
-          <w:sz w:val="22"/>
-          <w:szCs w:val="22"/>
-          <w:vertAlign w:val="superscript"/>
-          <w:lang w:bidi="km-KH"/>
-          <w14:ligatures w14:val="standardContextual"/>
-        </w:rPr>
-        <w:t>2</w:t>
-      </w:r>
-      <w:r>
-        <w:rPr>
-          <w:rFonts w:ascii="Arial" w:eastAsiaTheme="minorHAnsi" w:hAnsi="Arial" w:cs="Arial"/>
-          <w:sz w:val="22"/>
-          <w:szCs w:val="22"/>
-          <w:lang w:bidi="km-KH"/>
-          <w14:ligatures w14:val="standardContextual"/>
-        </w:rPr>
-        <w:t xml:space="preserve"> carbon substrate using an automated, custom-built spraying setup equipped with a syringe pump operating at a flow rate of 0.6 mL min</w:t>
-      </w:r>
-      <w:r>
-        <w:rPr>
-          <w:rFonts w:ascii="Cambria Math" w:eastAsiaTheme="minorHAnsi" w:hAnsi="Cambria Math" w:cs="Cambria Math"/>
-          <w:sz w:val="22"/>
-          <w:szCs w:val="22"/>
-          <w:lang w:bidi="km-KH"/>
-          <w14:ligatures w14:val="standardContextual"/>
-        </w:rPr>
-        <w:t>⁻</w:t>
-      </w:r>
-      <w:r>
-        <w:rPr>
-          <w:rFonts w:ascii="Arial" w:eastAsiaTheme="minorHAnsi" w:hAnsi="Arial" w:cs="Arial"/>
-          <w:sz w:val="22"/>
-          <w:szCs w:val="22"/>
-          <w:vertAlign w:val="superscript"/>
-          <w:lang w:bidi="km-KH"/>
-          <w14:ligatures w14:val="standardContextual"/>
-        </w:rPr>
-        <w:t>1</w:t>
-      </w:r>
-      <w:r>
-        <w:rPr>
-          <w:rFonts w:ascii="Arial" w:eastAsiaTheme="minorHAnsi" w:hAnsi="Arial" w:cs="Arial"/>
-          <w:sz w:val="22"/>
-          <w:szCs w:val="22"/>
-          <w:lang w:bidi="km-KH"/>
-          <w14:ligatures w14:val="standardContextual"/>
-        </w:rPr>
-        <w:t xml:space="preserve"> on a hotplate maintained at 1</w:t>
-      </w:r>
-      <w:r>
-        <w:rPr>
-          <w:rFonts w:ascii="Arial" w:eastAsiaTheme="minorHAnsi" w:hAnsi="Arial" w:cs="Arial"/>
-          <w:sz w:val="22"/>
-          <w:szCs w:val="22"/>
-          <w:lang w:bidi="km-KH"/>
-          <w14:ligatures w14:val="standardContextual"/>
-        </w:rPr>
-        <w:t>3</w:t>
-      </w:r>
-      <w:r>
-        <w:rPr>
-          <w:rFonts w:ascii="Arial" w:eastAsiaTheme="minorHAnsi" w:hAnsi="Arial" w:cs="Arial"/>
-          <w:sz w:val="22"/>
-          <w:szCs w:val="22"/>
-          <w:lang w:bidi="km-KH"/>
-          <w14:ligatures w14:val="standardContextual"/>
-        </w:rPr>
-        <w:t xml:space="preserve">0°C, yielding a catalyst mass loading of </w:t>
-      </w:r>
-      <w:r>
-        <w:rPr>
-          <w:rFonts w:ascii="Arial" w:eastAsiaTheme="minorHAnsi" w:hAnsi="Arial" w:cs="Arial"/>
-          <w:sz w:val="22"/>
-          <w:szCs w:val="22"/>
-          <w:lang w:bidi="km-KH"/>
-          <w14:ligatures w14:val="standardContextual"/>
-        </w:rPr>
-        <w:t>0.5</w:t>
-      </w:r>
-      <w:r>
-        <w:rPr>
-          <w:rFonts w:ascii="Arial" w:eastAsiaTheme="minorHAnsi" w:hAnsi="Arial" w:cs="Arial"/>
-          <w:sz w:val="22"/>
-          <w:szCs w:val="22"/>
-          <w:lang w:bidi="km-KH"/>
-          <w14:ligatures w14:val="standardContextual"/>
-        </w:rPr>
-        <w:t xml:space="preserve"> ± 0.1 mg</w:t>
-      </w:r>
-      <w:r>
-        <w:rPr>
-          <w:rFonts w:ascii="Arial" w:eastAsiaTheme="minorHAnsi" w:hAnsi="Arial" w:cs="Arial"/>
-          <w:sz w:val="22"/>
-          <w:szCs w:val="22"/>
-          <w:lang w:bidi="km-KH"/>
-          <w14:ligatures w14:val="standardContextual"/>
-        </w:rPr>
-        <w:t>.</w:t>
-      </w:r>
-      <w:r>
-        <w:rPr>
-          <w:rFonts w:ascii="Arial" w:eastAsiaTheme="minorHAnsi" w:hAnsi="Arial" w:cs="Arial"/>
-          <w:sz w:val="22"/>
-          <w:szCs w:val="22"/>
-          <w:lang w:bidi="km-KH"/>
-          <w14:ligatures w14:val="standardContextual"/>
-        </w:rPr>
-        <w:t>cm</w:t>
-      </w:r>
-      <w:r>
-        <w:rPr>
-          <w:rFonts w:ascii="Cambria Math" w:eastAsiaTheme="minorHAnsi" w:hAnsi="Cambria Math" w:cs="Cambria Math"/>
-          <w:sz w:val="22"/>
-          <w:szCs w:val="22"/>
-          <w:lang w:bidi="km-KH"/>
-          <w14:ligatures w14:val="standardContextual"/>
-        </w:rPr>
-        <w:t>⁻</w:t>
-      </w:r>
-      <w:r>
-        <w:rPr>
-          <w:rFonts w:ascii="Arial" w:eastAsiaTheme="minorHAnsi" w:hAnsi="Arial" w:cs="Arial"/>
-          <w:sz w:val="22"/>
-          <w:szCs w:val="22"/>
-          <w:vertAlign w:val="superscript"/>
-          <w:lang w:bidi="km-KH"/>
-          <w14:ligatures w14:val="standardContextual"/>
-        </w:rPr>
-        <w:t>2</w:t>
-      </w:r>
-      <w:r>
-        <w:rPr>
-          <w:rFonts w:ascii="Arial" w:eastAsiaTheme="minorHAnsi" w:hAnsi="Arial" w:cs="Arial"/>
-          <w:sz w:val="22"/>
-          <w:szCs w:val="22"/>
-          <w:lang w:bidi="km-KH"/>
-          <w14:ligatures w14:val="standardContextual"/>
-        </w:rPr>
-        <w:t xml:space="preserve"> </w:t>
-      </w:r>
-      <w:proofErr w:type="spellStart"/>
-      <w:r>
-        <w:rPr>
-          <w:rFonts w:ascii="Arial" w:eastAsiaTheme="minorHAnsi" w:hAnsi="Arial" w:cs="Arial"/>
-          <w:sz w:val="22"/>
-          <w:szCs w:val="22"/>
-          <w:lang w:bidi="km-KH"/>
-          <w14:ligatures w14:val="standardContextual"/>
-        </w:rPr>
-        <w:t>AgNPs</w:t>
-      </w:r>
-      <w:proofErr w:type="spellEnd"/>
-      <w:r>
-        <w:rPr>
-          <w:rFonts w:ascii="Arial" w:eastAsiaTheme="minorHAnsi" w:hAnsi="Arial" w:cs="Arial"/>
-          <w:sz w:val="22"/>
-          <w:szCs w:val="22"/>
-          <w:lang w:bidi="km-KH"/>
-          <w14:ligatures w14:val="standardContextual"/>
+      <w:r>
+        <w:rPr>
+          <w:rFonts w:ascii="Arial" w:hAnsi="Arial"/>
+          <w:sz w:val="22"/>
         </w:rPr>
         <w:t>.</w:t>
       </w:r>
@@ -3062,7 +2899,41 @@
           <w:b/>
           <w:sz w:val="22"/>
         </w:rPr>
-        <w:t>Effect of CO₂ flow rate on FE(CO) durability in the 100 cm² parallel flow-field</w:t>
+        <w:t>Effect of CO</w:t>
+      </w:r>
+      <w:r>
+        <w:rPr>
+          <w:rFonts w:ascii="Arial" w:hAnsi="Arial"/>
+          <w:b/>
+          <w:sz w:val="22"/>
+          <w:vertAlign w:val="subscript"/>
+        </w:rPr>
+        <w:t>2</w:t>
+      </w:r>
+      <w:r>
+        <w:rPr>
+          <w:rFonts w:ascii="Arial" w:hAnsi="Arial"/>
+          <w:b/>
+          <w:sz w:val="22"/>
+        </w:rPr>
+        <w:t xml:space="preserve"> flow rate on FE(CO) durability in the 100 cm</w:t>
+      </w:r>
+      <w:r>
+        <w:rPr>
+          <w:rFonts w:ascii="Arial" w:hAnsi="Arial"/>
+          <w:b/>
+          <w:sz w:val="22"/>
+          <w:vertAlign w:val="superscript"/>
+        </w:rPr>
+        <w:t>2</w:t>
+      </w:r>
+      <w:r>
+        <w:rPr>
+          <w:rFonts w:ascii="Arial" w:hAnsi="Arial"/>
+          <w:b/>
+          <w:sz w:val="22"/>
+        </w:rPr>
+        <w:t xml:space="preserve"> parallel flow-field</w:t>
       </w:r>
     </w:p>
     <w:p>
@@ -3075,7 +2946,217 @@
           <w:rFonts w:ascii="Arial" w:hAnsi="Arial"/>
           <w:sz w:val="22"/>
         </w:rPr>
-        <w:t>To evaluate the effect of CO₂ flow rate on operational durability, the 100 cm² parallel flow-field MEA was operated galvanostatically at 100 mA·cm⁻² under humidified CO₂ (50 mM CH₃COOH) supplied at 200, 400, and 800 ml·min⁻¹ (2, 4, and 8 ml·min⁻¹·cm⁻², respectively). As shown in Figure 1, all three conditions delivered a comparable initial FE(CO) of ~90–95 %, whereas the duration of stable operation scaled monotonically with the CO₂ flow rate: the 200 ml·min⁻¹ condition declined first (~20 h), followed by 400 ml·min⁻¹ (~25 h), while 800 ml·min⁻¹ sustained FE(CO) the longest (~33–36 h, FE(CO) ~78–80 % at ~33 h). Throughout each run, the cell voltage remained stable at ~3.2–3.3 V. The stable voltage signature indicates that failure proceeded by surface channel water blockage rather than deep gas-diffusion-electrode pore flooding, for which a decreasing voltage would be expected; the PTFE hydrophobicity of the GDE was therefore retained. The improvement with increasing flow rate is attributed to the higher per-channel gas velocity, which clears accumulated liquid water more effectively and delays channel blockage. According to our previous results, increasing the CO₂ flow rate delays but does not eliminate parallel-flow-field failure, since the underlying low per-channel velocity at any individual channel remains the geometric constraint. The complementary cell-voltage and cathode vent-pressure profiles for the 800 ml·min⁻¹ condition (Figure 1, lower panels) confirm stable operation: the second run maintained ~3.2 V for ~40 h with pressure excursions limited to gas-chromatography injection events, whereas the first run exhibited an abrupt voltage drop at ~13–15 h consistent with a short-circuit event rather than a flow-field limitation. It is worth noting that this short-circuit behaviour is distinct from the gradual flow-field decline and is addressed separately below.</w:t>
+        <w:t>To evaluate the effect of CO</w:t>
+      </w:r>
+      <w:r>
+        <w:rPr>
+          <w:rFonts w:ascii="Arial" w:hAnsi="Arial"/>
+          <w:sz w:val="22"/>
+          <w:vertAlign w:val="subscript"/>
+        </w:rPr>
+        <w:t>2</w:t>
+      </w:r>
+      <w:r>
+        <w:rPr>
+          <w:rFonts w:ascii="Arial" w:hAnsi="Arial"/>
+          <w:sz w:val="22"/>
+        </w:rPr>
+        <w:t xml:space="preserve"> flow rate on operational durability, the 100 cm</w:t>
+      </w:r>
+      <w:r>
+        <w:rPr>
+          <w:rFonts w:ascii="Arial" w:hAnsi="Arial"/>
+          <w:sz w:val="22"/>
+          <w:vertAlign w:val="superscript"/>
+        </w:rPr>
+        <w:t>2</w:t>
+      </w:r>
+      <w:r>
+        <w:rPr>
+          <w:rFonts w:ascii="Arial" w:hAnsi="Arial"/>
+          <w:sz w:val="22"/>
+        </w:rPr>
+        <w:t xml:space="preserve"> parallel flow-field MEA was operated galvanostatically at 100 mA·cm</w:t>
+      </w:r>
+      <w:r>
+        <w:rPr>
+          <w:rFonts w:ascii="Arial" w:hAnsi="Arial"/>
+          <w:sz w:val="22"/>
+          <w:vertAlign w:val="superscript"/>
+        </w:rPr>
+        <w:t>-2</w:t>
+      </w:r>
+      <w:r>
+        <w:rPr>
+          <w:rFonts w:ascii="Arial" w:hAnsi="Arial"/>
+          <w:sz w:val="22"/>
+        </w:rPr>
+        <w:t xml:space="preserve"> under humidified CO</w:t>
+      </w:r>
+      <w:r>
+        <w:rPr>
+          <w:rFonts w:ascii="Arial" w:hAnsi="Arial"/>
+          <w:sz w:val="22"/>
+          <w:vertAlign w:val="subscript"/>
+        </w:rPr>
+        <w:t>2</w:t>
+      </w:r>
+      <w:r>
+        <w:rPr>
+          <w:rFonts w:ascii="Arial" w:hAnsi="Arial"/>
+          <w:sz w:val="22"/>
+        </w:rPr>
+        <w:t xml:space="preserve"> (50 mM CH</w:t>
+      </w:r>
+      <w:r>
+        <w:rPr>
+          <w:rFonts w:ascii="Arial" w:hAnsi="Arial"/>
+          <w:sz w:val="22"/>
+          <w:vertAlign w:val="subscript"/>
+        </w:rPr>
+        <w:t>3</w:t>
+      </w:r>
+      <w:r>
+        <w:rPr>
+          <w:rFonts w:ascii="Arial" w:hAnsi="Arial"/>
+          <w:sz w:val="22"/>
+        </w:rPr>
+        <w:t>COOH) supplied at 200, 400, and 800 ml·min</w:t>
+      </w:r>
+      <w:r>
+        <w:rPr>
+          <w:rFonts w:ascii="Arial" w:hAnsi="Arial"/>
+          <w:sz w:val="22"/>
+          <w:vertAlign w:val="superscript"/>
+        </w:rPr>
+        <w:t>-1</w:t>
+      </w:r>
+      <w:r>
+        <w:rPr>
+          <w:rFonts w:ascii="Arial" w:hAnsi="Arial"/>
+          <w:sz w:val="22"/>
+        </w:rPr>
+        <w:t xml:space="preserve"> (2, 4, and 8 ml·min</w:t>
+      </w:r>
+      <w:r>
+        <w:rPr>
+          <w:rFonts w:ascii="Arial" w:hAnsi="Arial"/>
+          <w:sz w:val="22"/>
+          <w:vertAlign w:val="superscript"/>
+        </w:rPr>
+        <w:t>-1</w:t>
+      </w:r>
+      <w:r>
+        <w:rPr>
+          <w:rFonts w:ascii="Arial" w:hAnsi="Arial"/>
+          <w:sz w:val="22"/>
+        </w:rPr>
+        <w:t>·cm</w:t>
+      </w:r>
+      <w:r>
+        <w:rPr>
+          <w:rFonts w:ascii="Arial" w:hAnsi="Arial"/>
+          <w:sz w:val="22"/>
+          <w:vertAlign w:val="superscript"/>
+        </w:rPr>
+        <w:t>-2</w:t>
+      </w:r>
+      <w:r>
+        <w:rPr>
+          <w:rFonts w:ascii="Arial" w:hAnsi="Arial"/>
+          <w:sz w:val="22"/>
+        </w:rPr>
+        <w:t>, respectively). As shown in Figure 1, all three conditions delivered a comparable initial FE(CO) of ~90–95 %, whereas the duration of stable operation scaled monotonically with the CO</w:t>
+      </w:r>
+      <w:r>
+        <w:rPr>
+          <w:rFonts w:ascii="Arial" w:hAnsi="Arial"/>
+          <w:sz w:val="22"/>
+          <w:vertAlign w:val="subscript"/>
+        </w:rPr>
+        <w:t>2</w:t>
+      </w:r>
+      <w:r>
+        <w:rPr>
+          <w:rFonts w:ascii="Arial" w:hAnsi="Arial"/>
+          <w:sz w:val="22"/>
+        </w:rPr>
+        <w:t xml:space="preserve"> flow rate: the 200 ml·min</w:t>
+      </w:r>
+      <w:r>
+        <w:rPr>
+          <w:rFonts w:ascii="Arial" w:hAnsi="Arial"/>
+          <w:sz w:val="22"/>
+          <w:vertAlign w:val="superscript"/>
+        </w:rPr>
+        <w:t>-1</w:t>
+      </w:r>
+      <w:r>
+        <w:rPr>
+          <w:rFonts w:ascii="Arial" w:hAnsi="Arial"/>
+          <w:sz w:val="22"/>
+        </w:rPr>
+        <w:t xml:space="preserve"> condition declined first (~20 h), followed by 400 ml·min</w:t>
+      </w:r>
+      <w:r>
+        <w:rPr>
+          <w:rFonts w:ascii="Arial" w:hAnsi="Arial"/>
+          <w:sz w:val="22"/>
+          <w:vertAlign w:val="superscript"/>
+        </w:rPr>
+        <w:t>-1</w:t>
+      </w:r>
+      <w:r>
+        <w:rPr>
+          <w:rFonts w:ascii="Arial" w:hAnsi="Arial"/>
+          <w:sz w:val="22"/>
+        </w:rPr>
+        <w:t xml:space="preserve"> (~25 h), while 800 ml·min</w:t>
+      </w:r>
+      <w:r>
+        <w:rPr>
+          <w:rFonts w:ascii="Arial" w:hAnsi="Arial"/>
+          <w:sz w:val="22"/>
+          <w:vertAlign w:val="superscript"/>
+        </w:rPr>
+        <w:t>-1</w:t>
+      </w:r>
+      <w:r>
+        <w:rPr>
+          <w:rFonts w:ascii="Arial" w:hAnsi="Arial"/>
+          <w:sz w:val="22"/>
+        </w:rPr>
+        <w:t xml:space="preserve"> sustained FE(CO) the longest (~33–36 h, FE(CO) ~78–80 % at ~33 h). Throughout each run, the cell voltage remained stable at ~3.2–3.3 V. The stable voltage signature indicates that failure proceeded by surface channel water blockage rather than deep gas-diffusion-electrode pore flooding, for which a decreasing voltage would be expected; the PTFE hydrophobicity of the GDE was therefore retained. The improvement with increasing flow rate is attributed to the higher per-channel gas velocity, which clears accumulated liquid water more effectively and delays channel blockage. According to our previous results, increasing the CO</w:t>
+      </w:r>
+      <w:r>
+        <w:rPr>
+          <w:rFonts w:ascii="Arial" w:hAnsi="Arial"/>
+          <w:sz w:val="22"/>
+          <w:vertAlign w:val="subscript"/>
+        </w:rPr>
+        <w:t>2</w:t>
+      </w:r>
+      <w:r>
+        <w:rPr>
+          <w:rFonts w:ascii="Arial" w:hAnsi="Arial"/>
+          <w:sz w:val="22"/>
+        </w:rPr>
+        <w:t xml:space="preserve"> flow rate delays but does not eliminate parallel-flow-field failure, since the underlying low per-channel velocity at any individual channel remains the geometric constraint. The complementary cell-voltage and cathode vent-pressure profiles for the 800 ml·min</w:t>
+      </w:r>
+      <w:r>
+        <w:rPr>
+          <w:rFonts w:ascii="Arial" w:hAnsi="Arial"/>
+          <w:sz w:val="22"/>
+          <w:vertAlign w:val="superscript"/>
+        </w:rPr>
+        <w:t>-1</w:t>
+      </w:r>
+      <w:r>
+        <w:rPr>
+          <w:rFonts w:ascii="Arial" w:hAnsi="Arial"/>
+          <w:sz w:val="22"/>
+        </w:rPr>
+        <w:t xml:space="preserve"> condition (Figure 1, lower panels) confirm stable operation: the second run maintained ~3.2 V for ~40 h with pressure excursions limited to gas-chromatography injection events, whereas the first run exhibited an abrupt voltage drop at ~13–15 h consistent with a short-circuit event rather than a flow-field limitation. It is worth noting that this short-circuit behaviour is distinct from the gradual flow-field decline and is addressed separately below.</w:t>
       </w:r>
     </w:p>
     <w:p>
@@ -3152,7 +3233,172 @@
           <w:rFonts w:ascii="Arial" w:hAnsi="Arial"/>
           <w:sz w:val="22"/>
         </w:rPr>
-        <w:t>Influence of CO₂ flow rate (200, 400, 800 ml·min⁻¹) on FE(CO) and cell voltage of the AgNPs (50 nm, ~0.6 mg·cm⁻²) / AEM / IrO₂-TiPt 100 cm² parallel-flow-field MEA under 50 mM CH₃COOH humidified CO₂, 100 ml·min⁻¹ 0.1 M KHCO₃ anolyte, 100 mA·cm⁻². Lower panels: cell-voltage and cathode vent-pressure profiles for two 800 ml·min⁻¹ runs with a PiperION AEM.</w:t>
+        <w:t>Influence of CO</w:t>
+      </w:r>
+      <w:r>
+        <w:rPr>
+          <w:rFonts w:ascii="Arial" w:hAnsi="Arial"/>
+          <w:sz w:val="22"/>
+          <w:vertAlign w:val="subscript"/>
+        </w:rPr>
+        <w:t>2</w:t>
+      </w:r>
+      <w:r>
+        <w:rPr>
+          <w:rFonts w:ascii="Arial" w:hAnsi="Arial"/>
+          <w:sz w:val="22"/>
+        </w:rPr>
+        <w:t xml:space="preserve"> flow rate (200, 400, 800 ml·min</w:t>
+      </w:r>
+      <w:r>
+        <w:rPr>
+          <w:rFonts w:ascii="Arial" w:hAnsi="Arial"/>
+          <w:sz w:val="22"/>
+          <w:vertAlign w:val="superscript"/>
+        </w:rPr>
+        <w:t>-1</w:t>
+      </w:r>
+      <w:r>
+        <w:rPr>
+          <w:rFonts w:ascii="Arial" w:hAnsi="Arial"/>
+          <w:sz w:val="22"/>
+        </w:rPr>
+        <w:t>) on FE(CO) and cell voltage of the AgNPs (50 nm, ~0.6 mg·cm</w:t>
+      </w:r>
+      <w:r>
+        <w:rPr>
+          <w:rFonts w:ascii="Arial" w:hAnsi="Arial"/>
+          <w:sz w:val="22"/>
+          <w:vertAlign w:val="superscript"/>
+        </w:rPr>
+        <w:t>-2</w:t>
+      </w:r>
+      <w:r>
+        <w:rPr>
+          <w:rFonts w:ascii="Arial" w:hAnsi="Arial"/>
+          <w:sz w:val="22"/>
+        </w:rPr>
+        <w:t>) / AEM / IrO</w:t>
+      </w:r>
+      <w:r>
+        <w:rPr>
+          <w:rFonts w:ascii="Arial" w:hAnsi="Arial"/>
+          <w:sz w:val="22"/>
+          <w:vertAlign w:val="subscript"/>
+        </w:rPr>
+        <w:t>2</w:t>
+      </w:r>
+      <w:r>
+        <w:rPr>
+          <w:rFonts w:ascii="Arial" w:hAnsi="Arial"/>
+          <w:sz w:val="22"/>
+        </w:rPr>
+        <w:t>-TiPt 100 cm</w:t>
+      </w:r>
+      <w:r>
+        <w:rPr>
+          <w:rFonts w:ascii="Arial" w:hAnsi="Arial"/>
+          <w:sz w:val="22"/>
+          <w:vertAlign w:val="superscript"/>
+        </w:rPr>
+        <w:t>2</w:t>
+      </w:r>
+      <w:r>
+        <w:rPr>
+          <w:rFonts w:ascii="Arial" w:hAnsi="Arial"/>
+          <w:sz w:val="22"/>
+        </w:rPr>
+        <w:t xml:space="preserve"> parallel-flow-field MEA under 50 mM CH</w:t>
+      </w:r>
+      <w:r>
+        <w:rPr>
+          <w:rFonts w:ascii="Arial" w:hAnsi="Arial"/>
+          <w:sz w:val="22"/>
+          <w:vertAlign w:val="subscript"/>
+        </w:rPr>
+        <w:t>3</w:t>
+      </w:r>
+      <w:r>
+        <w:rPr>
+          <w:rFonts w:ascii="Arial" w:hAnsi="Arial"/>
+          <w:sz w:val="22"/>
+        </w:rPr>
+        <w:t>COOH humidified CO</w:t>
+      </w:r>
+      <w:r>
+        <w:rPr>
+          <w:rFonts w:ascii="Arial" w:hAnsi="Arial"/>
+          <w:sz w:val="22"/>
+          <w:vertAlign w:val="subscript"/>
+        </w:rPr>
+        <w:t>2</w:t>
+      </w:r>
+      <w:r>
+        <w:rPr>
+          <w:rFonts w:ascii="Arial" w:hAnsi="Arial"/>
+          <w:sz w:val="22"/>
+        </w:rPr>
+        <w:t>, 100 ml·min</w:t>
+      </w:r>
+      <w:r>
+        <w:rPr>
+          <w:rFonts w:ascii="Arial" w:hAnsi="Arial"/>
+          <w:sz w:val="22"/>
+          <w:vertAlign w:val="superscript"/>
+        </w:rPr>
+        <w:t>-1</w:t>
+      </w:r>
+      <w:r>
+        <w:rPr>
+          <w:rFonts w:ascii="Arial" w:hAnsi="Arial"/>
+          <w:sz w:val="22"/>
+        </w:rPr>
+        <w:t xml:space="preserve"> 0.1 M KHCO</w:t>
+      </w:r>
+      <w:r>
+        <w:rPr>
+          <w:rFonts w:ascii="Arial" w:hAnsi="Arial"/>
+          <w:sz w:val="22"/>
+          <w:vertAlign w:val="subscript"/>
+        </w:rPr>
+        <w:t>3</w:t>
+      </w:r>
+      <w:r>
+        <w:rPr>
+          <w:rFonts w:ascii="Arial" w:hAnsi="Arial"/>
+          <w:sz w:val="22"/>
+        </w:rPr>
+        <w:t xml:space="preserve"> anolyte, 100 mA·cm</w:t>
+      </w:r>
+      <w:r>
+        <w:rPr>
+          <w:rFonts w:ascii="Arial" w:hAnsi="Arial"/>
+          <w:sz w:val="22"/>
+          <w:vertAlign w:val="superscript"/>
+        </w:rPr>
+        <w:t>-2</w:t>
+      </w:r>
+      <w:r>
+        <w:rPr>
+          <w:rFonts w:ascii="Arial" w:hAnsi="Arial"/>
+          <w:sz w:val="22"/>
+        </w:rPr>
+        <w:t>. Lower panels: cell-voltage and cathode vent-pressure profiles for two 800 ml·min</w:t>
+      </w:r>
+      <w:r>
+        <w:rPr>
+          <w:rFonts w:ascii="Arial" w:hAnsi="Arial"/>
+          <w:sz w:val="22"/>
+          <w:vertAlign w:val="superscript"/>
+        </w:rPr>
+        <w:t>-1</w:t>
+      </w:r>
+      <w:r>
+        <w:rPr>
+          <w:rFonts w:ascii="Arial" w:hAnsi="Arial"/>
+          <w:sz w:val="22"/>
+        </w:rPr>
+        <w:t xml:space="preserve"> runs with a PiperION AEM.</w:t>
       </w:r>
     </w:p>
     <w:p>
@@ -3178,7 +3424,82 @@
           <w:rFonts w:ascii="Arial" w:hAnsi="Arial"/>
           <w:sz w:val="22"/>
         </w:rPr>
-        <w:t>To ascertain the effect of membrane thickness on operational stability during gravity-assisted drainage, the 100 cm² parallel flow-field MEA was tilted to a 30° orientation and operated at 100 mA·cm⁻² under 400 ml·min⁻¹ humidified CO₂, comparing a thin 20 µm PiperION membrane (Figure 2) with a thicker 40 µm AEM (Figure 3); the flat 0° orientation was run in parallel as a reference in both cases. As shown in Figure 2, the 20 µm membrane delivered a high initial FE(CO) of ~96–98 % that remained stable to ~10 h, after which a first short-circuit event (~10 h) reduced FE(CO) by ~20 %, followed by a second short-circuit event (~25 h) that reduced FE(CO) by a further ~35 %. The mean cell voltage was 3.227 ± 0.072 V, remaining otherwise flat between events with discrete downward steps coinciding with each short-circuit. This signature — an abrupt voltage perturbation and a stepwise FE(CO) loss against an otherwise stable baseline — identifies an electrical breach of the membrane rather than GDE flooding or kinetic degradation. In contrast, the 40 µm membrane (Figure 3) sustained ~95 % FE(CO) without any short-circuit event over a markedly longer run. This comparison demonstrates that membrane thickness governs short-circuit susceptibility under the mechanical loading of the tilted 100 cm² assembly: the 20 µm membrane is too thin to withstand compression in the tilted configuration, whereas the 40 µm membrane preserves electrical isolation. It is worth noting that the 30° tilt alone is insufficient to prevent failure when the membrane is thin, so adequate membrane thickness is a prerequisite for exploiting tilted-drainage operation.</w:t>
+        <w:t>To ascertain the effect of membrane thickness on operational stability during gravity-assisted drainage, the 100 cm</w:t>
+      </w:r>
+      <w:r>
+        <w:rPr>
+          <w:rFonts w:ascii="Arial" w:hAnsi="Arial"/>
+          <w:sz w:val="22"/>
+          <w:vertAlign w:val="superscript"/>
+        </w:rPr>
+        <w:t>2</w:t>
+      </w:r>
+      <w:r>
+        <w:rPr>
+          <w:rFonts w:ascii="Arial" w:hAnsi="Arial"/>
+          <w:sz w:val="22"/>
+        </w:rPr>
+        <w:t xml:space="preserve"> parallel flow-field MEA was tilted to a 30° orientation and operated at 100 mA·cm</w:t>
+      </w:r>
+      <w:r>
+        <w:rPr>
+          <w:rFonts w:ascii="Arial" w:hAnsi="Arial"/>
+          <w:sz w:val="22"/>
+          <w:vertAlign w:val="superscript"/>
+        </w:rPr>
+        <w:t>-2</w:t>
+      </w:r>
+      <w:r>
+        <w:rPr>
+          <w:rFonts w:ascii="Arial" w:hAnsi="Arial"/>
+          <w:sz w:val="22"/>
+        </w:rPr>
+        <w:t xml:space="preserve"> under 400 ml·min</w:t>
+      </w:r>
+      <w:r>
+        <w:rPr>
+          <w:rFonts w:ascii="Arial" w:hAnsi="Arial"/>
+          <w:sz w:val="22"/>
+          <w:vertAlign w:val="superscript"/>
+        </w:rPr>
+        <w:t>-1</w:t>
+      </w:r>
+      <w:r>
+        <w:rPr>
+          <w:rFonts w:ascii="Arial" w:hAnsi="Arial"/>
+          <w:sz w:val="22"/>
+        </w:rPr>
+        <w:t xml:space="preserve"> humidified CO</w:t>
+      </w:r>
+      <w:r>
+        <w:rPr>
+          <w:rFonts w:ascii="Arial" w:hAnsi="Arial"/>
+          <w:sz w:val="22"/>
+          <w:vertAlign w:val="subscript"/>
+        </w:rPr>
+        <w:t>2</w:t>
+      </w:r>
+      <w:r>
+        <w:rPr>
+          <w:rFonts w:ascii="Arial" w:hAnsi="Arial"/>
+          <w:sz w:val="22"/>
+        </w:rPr>
+        <w:t>, comparing a thin 20 µm PiperION membrane (Figure 2) with a thicker 40 µm AEM (Figure 3); the flat 0° orientation was run in parallel as a reference in both cases. As shown in Figure 2, the 20 µm membrane delivered a high initial FE(CO) of ~96–98 % that remained stable to ~10 h, after which a first short-circuit event (~10 h) reduced FE(CO) by ~20 %, followed by a second short-circuit event (~25 h) that reduced FE(CO) by a further ~35 %. The mean cell voltage was 3.227 ± 0.072 V, remaining otherwise flat between events with discrete downward steps coinciding with each short-circuit. This signature — an abrupt voltage perturbation and a stepwise FE(CO) loss against an otherwise stable baseline — identifies an electrical breach of the membrane rather than GDE flooding or kinetic degradation. In contrast, the 40 µm membrane (Figure 3) sustained ~95 % FE(CO) without any short-circuit event over a markedly longer run. This comparison demonstrates that membrane thickness governs short-circuit susceptibility under the mechanical loading of the tilted 100 cm</w:t>
+      </w:r>
+      <w:r>
+        <w:rPr>
+          <w:rFonts w:ascii="Arial" w:hAnsi="Arial"/>
+          <w:sz w:val="22"/>
+          <w:vertAlign w:val="superscript"/>
+        </w:rPr>
+        <w:t>2</w:t>
+      </w:r>
+      <w:r>
+        <w:rPr>
+          <w:rFonts w:ascii="Arial" w:hAnsi="Arial"/>
+          <w:sz w:val="22"/>
+        </w:rPr>
+        <w:t xml:space="preserve"> assembly: the 20 µm membrane is too thin to withstand compression in the tilted configuration, whereas the 40 µm membrane preserves electrical isolation. It is worth noting that the 30° tilt alone is insufficient to prevent failure when the membrane is thin, so adequate membrane thickness is a prerequisite for exploiting tilted-drainage operation.</w:t>
       </w:r>
     </w:p>
     <w:p>
@@ -3255,7 +3576,157 @@
           <w:rFonts w:ascii="Arial" w:hAnsi="Arial"/>
           <w:sz w:val="22"/>
         </w:rPr>
-        <w:t>Long-term CO₂ electrolysis of the AgNPs (50 nm, ~0.6 mg·cm⁻²) / PiperION 20 µm / IrO₂-TiPt 100 cm² parallel-flow-field MEA at 0° and 30° orientation under 50 mM CH₃COOH humidified CO₂ (400 ml·min⁻¹), 100 ml·min⁻¹ 0.1 M KHCO₃, 100 mA·cm⁻². Lower panel: cell voltage (3.227 ± 0.072 V) and cathode outlet pressure, with two short-circuit events annotated.</w:t>
+        <w:t>Long-term CO</w:t>
+      </w:r>
+      <w:r>
+        <w:rPr>
+          <w:rFonts w:ascii="Arial" w:hAnsi="Arial"/>
+          <w:sz w:val="22"/>
+          <w:vertAlign w:val="subscript"/>
+        </w:rPr>
+        <w:t>2</w:t>
+      </w:r>
+      <w:r>
+        <w:rPr>
+          <w:rFonts w:ascii="Arial" w:hAnsi="Arial"/>
+          <w:sz w:val="22"/>
+        </w:rPr>
+        <w:t xml:space="preserve"> electrolysis of the AgNPs (50 nm, ~0.6 mg·cm</w:t>
+      </w:r>
+      <w:r>
+        <w:rPr>
+          <w:rFonts w:ascii="Arial" w:hAnsi="Arial"/>
+          <w:sz w:val="22"/>
+          <w:vertAlign w:val="superscript"/>
+        </w:rPr>
+        <w:t>-2</w:t>
+      </w:r>
+      <w:r>
+        <w:rPr>
+          <w:rFonts w:ascii="Arial" w:hAnsi="Arial"/>
+          <w:sz w:val="22"/>
+        </w:rPr>
+        <w:t>) / PiperION 20 µm / IrO</w:t>
+      </w:r>
+      <w:r>
+        <w:rPr>
+          <w:rFonts w:ascii="Arial" w:hAnsi="Arial"/>
+          <w:sz w:val="22"/>
+          <w:vertAlign w:val="subscript"/>
+        </w:rPr>
+        <w:t>2</w:t>
+      </w:r>
+      <w:r>
+        <w:rPr>
+          <w:rFonts w:ascii="Arial" w:hAnsi="Arial"/>
+          <w:sz w:val="22"/>
+        </w:rPr>
+        <w:t>-TiPt 100 cm</w:t>
+      </w:r>
+      <w:r>
+        <w:rPr>
+          <w:rFonts w:ascii="Arial" w:hAnsi="Arial"/>
+          <w:sz w:val="22"/>
+          <w:vertAlign w:val="superscript"/>
+        </w:rPr>
+        <w:t>2</w:t>
+      </w:r>
+      <w:r>
+        <w:rPr>
+          <w:rFonts w:ascii="Arial" w:hAnsi="Arial"/>
+          <w:sz w:val="22"/>
+        </w:rPr>
+        <w:t xml:space="preserve"> parallel-flow-field MEA at 0° and 30° orientation under 50 mM CH</w:t>
+      </w:r>
+      <w:r>
+        <w:rPr>
+          <w:rFonts w:ascii="Arial" w:hAnsi="Arial"/>
+          <w:sz w:val="22"/>
+          <w:vertAlign w:val="subscript"/>
+        </w:rPr>
+        <w:t>3</w:t>
+      </w:r>
+      <w:r>
+        <w:rPr>
+          <w:rFonts w:ascii="Arial" w:hAnsi="Arial"/>
+          <w:sz w:val="22"/>
+        </w:rPr>
+        <w:t>COOH humidified CO</w:t>
+      </w:r>
+      <w:r>
+        <w:rPr>
+          <w:rFonts w:ascii="Arial" w:hAnsi="Arial"/>
+          <w:sz w:val="22"/>
+          <w:vertAlign w:val="subscript"/>
+        </w:rPr>
+        <w:t>2</w:t>
+      </w:r>
+      <w:r>
+        <w:rPr>
+          <w:rFonts w:ascii="Arial" w:hAnsi="Arial"/>
+          <w:sz w:val="22"/>
+        </w:rPr>
+        <w:t xml:space="preserve"> (400 ml·min</w:t>
+      </w:r>
+      <w:r>
+        <w:rPr>
+          <w:rFonts w:ascii="Arial" w:hAnsi="Arial"/>
+          <w:sz w:val="22"/>
+          <w:vertAlign w:val="superscript"/>
+        </w:rPr>
+        <w:t>-1</w:t>
+      </w:r>
+      <w:r>
+        <w:rPr>
+          <w:rFonts w:ascii="Arial" w:hAnsi="Arial"/>
+          <w:sz w:val="22"/>
+        </w:rPr>
+        <w:t>), 100 ml·min</w:t>
+      </w:r>
+      <w:r>
+        <w:rPr>
+          <w:rFonts w:ascii="Arial" w:hAnsi="Arial"/>
+          <w:sz w:val="22"/>
+          <w:vertAlign w:val="superscript"/>
+        </w:rPr>
+        <w:t>-1</w:t>
+      </w:r>
+      <w:r>
+        <w:rPr>
+          <w:rFonts w:ascii="Arial" w:hAnsi="Arial"/>
+          <w:sz w:val="22"/>
+        </w:rPr>
+        <w:t xml:space="preserve"> 0.1 M KHCO</w:t>
+      </w:r>
+      <w:r>
+        <w:rPr>
+          <w:rFonts w:ascii="Arial" w:hAnsi="Arial"/>
+          <w:sz w:val="22"/>
+          <w:vertAlign w:val="subscript"/>
+        </w:rPr>
+        <w:t>3</w:t>
+      </w:r>
+      <w:r>
+        <w:rPr>
+          <w:rFonts w:ascii="Arial" w:hAnsi="Arial"/>
+          <w:sz w:val="22"/>
+        </w:rPr>
+        <w:t>, 100 mA·cm</w:t>
+      </w:r>
+      <w:r>
+        <w:rPr>
+          <w:rFonts w:ascii="Arial" w:hAnsi="Arial"/>
+          <w:sz w:val="22"/>
+          <w:vertAlign w:val="superscript"/>
+        </w:rPr>
+        <w:t>-2</w:t>
+      </w:r>
+      <w:r>
+        <w:rPr>
+          <w:rFonts w:ascii="Arial" w:hAnsi="Arial"/>
+          <w:sz w:val="22"/>
+        </w:rPr>
+        <w:t>. Lower panel: cell voltage (3.227 ± 0.072 V) and cathode outlet pressure, with two short-circuit events annotated.</w:t>
       </w:r>
     </w:p>
     <w:p>
@@ -3268,7 +3739,24 @@
           <w:b/>
           <w:sz w:val="22"/>
         </w:rPr>
-        <w:t>Recovery interventions and post-mortem analysis of extended 100 cm² operation</w:t>
+        <w:t>Recovery interventions and post-mortem analysis of extended 100 cm</w:t>
+      </w:r>
+      <w:r>
+        <w:rPr>
+          <w:rFonts w:ascii="Arial" w:hAnsi="Arial"/>
+          <w:b/>
+          <w:sz w:val="22"/>
+          <w:vertAlign w:val="superscript"/>
+        </w:rPr>
+        <w:t>2</w:t>
+      </w:r>
+      <w:r>
+        <w:rPr>
+          <w:rFonts w:ascii="Arial" w:hAnsi="Arial"/>
+          <w:b/>
+          <w:sz w:val="22"/>
+        </w:rPr>
+        <w:t xml:space="preserve"> operation</w:t>
       </w:r>
     </w:p>
     <w:p>
@@ -3281,14 +3769,163 @@
           <w:rFonts w:ascii="Arial" w:hAnsi="Arial"/>
           <w:sz w:val="22"/>
         </w:rPr>
-        <w:t xml:space="preserve">To evaluate whether in-situ recovery interventions can extend operation in the tilted configuration, the 40 µm AEM cell at 30° orientation (400 ml·min⁻¹ humidified CO₂, 100 mA·cm⁻²) was operated with periodic maintenance and subsequently disassembled for post-mortem inspection. As shown in Figure 3, the cell sustained ~95 % FE(CO) at a stable cell voltage of ~3.2–3.3 V for ~195–200 h, with the cathode outlet pressure held at ~30–40 mBar. Four interventions were applied over the run: an immediate shutdown-and-rerun at 80 h, a 4 h dried-N₂ purge with rerun at 87 h, an 8 h dried-N₂ purge at 140 h, and a refresh of the 0.1 M KHCO₃ anolyte at 160 h. The transient FE(CO) excursions to ~80 % around 80, 110, and 150 h, each recovering after the corresponding intervention, indicate that the dominant degradation was reversible channel water/salt accumulation rather than irreversible catalyst or membrane failure; the stable voltage throughout confirms the channel-blockage regime, and the dried-N₂ purge re-opened the gas pathways while the anolyte refresh restored the K⁺/carbonate balance. Post-mortem inspection of the disassembled cell (Figure 4) showed relatively clean parallel-flow-field channels with only minor residue, mild grayish salt deposition on the AgNPs gas-diffusion electrode, and an intact 40 µm membrane with no visible physical breach, all consistent with the sustained FE(CO) and stable voltage recorded during the run. These observations indicate that combining a 40 µm membrane, 30° gravity-assisted drainage, and periodic dried-N₂ purging with anolyte refresh extends stable 100 cm² operation </w:t>
-      </w:r>
-      <w:r>
-        <w:rPr>
-          <w:rFonts w:ascii="Arial" w:hAnsi="Arial"/>
-          <w:sz w:val="22"/>
-        </w:rPr>
-        <w:lastRenderedPageBreak/>
+        <w:t>To evaluate whether in-situ recovery interventions can extend operation in the tilted configuration, the 40 µm AEM cell at 30° orientation (400 ml·min</w:t>
+      </w:r>
+      <w:r>
+        <w:rPr>
+          <w:rFonts w:ascii="Arial" w:hAnsi="Arial"/>
+          <w:sz w:val="22"/>
+          <w:vertAlign w:val="superscript"/>
+        </w:rPr>
+        <w:t>-1</w:t>
+      </w:r>
+      <w:r>
+        <w:rPr>
+          <w:rFonts w:ascii="Arial" w:hAnsi="Arial"/>
+          <w:sz w:val="22"/>
+        </w:rPr>
+        <w:t xml:space="preserve"> humidified CO</w:t>
+      </w:r>
+      <w:r>
+        <w:rPr>
+          <w:rFonts w:ascii="Arial" w:hAnsi="Arial"/>
+          <w:sz w:val="22"/>
+          <w:vertAlign w:val="subscript"/>
+        </w:rPr>
+        <w:t>2</w:t>
+      </w:r>
+      <w:r>
+        <w:rPr>
+          <w:rFonts w:ascii="Arial" w:hAnsi="Arial"/>
+          <w:sz w:val="22"/>
+        </w:rPr>
+        <w:t>, 100 mA·cm</w:t>
+      </w:r>
+      <w:r>
+        <w:rPr>
+          <w:rFonts w:ascii="Arial" w:hAnsi="Arial"/>
+          <w:sz w:val="22"/>
+          <w:vertAlign w:val="superscript"/>
+        </w:rPr>
+        <w:t>-2</w:t>
+      </w:r>
+      <w:r>
+        <w:rPr>
+          <w:rFonts w:ascii="Arial" w:hAnsi="Arial"/>
+          <w:sz w:val="22"/>
+        </w:rPr>
+        <w:t>) was operated with periodic maintenance and subsequently disassembled for post-mortem inspection. As shown in Figure 3, the cell sustained ~95 % FE(CO) at a stable cell voltage of ~3.2–3.3 V for ~195–200 h, with the cathode outlet pressure held at ~30–40 mBar. Four interventions were applied over the run: an immediate shutdown-and-rerun at 80 h, a 4 h dried-N</w:t>
+      </w:r>
+      <w:r>
+        <w:rPr>
+          <w:rFonts w:ascii="Arial" w:hAnsi="Arial"/>
+          <w:sz w:val="22"/>
+          <w:vertAlign w:val="subscript"/>
+        </w:rPr>
+        <w:t>2</w:t>
+      </w:r>
+      <w:r>
+        <w:rPr>
+          <w:rFonts w:ascii="Arial" w:hAnsi="Arial"/>
+          <w:sz w:val="22"/>
+        </w:rPr>
+        <w:t xml:space="preserve"> purge with rerun at 87 h, an 8 h dried-N</w:t>
+      </w:r>
+      <w:r>
+        <w:rPr>
+          <w:rFonts w:ascii="Arial" w:hAnsi="Arial"/>
+          <w:sz w:val="22"/>
+          <w:vertAlign w:val="subscript"/>
+        </w:rPr>
+        <w:t>2</w:t>
+      </w:r>
+      <w:r>
+        <w:rPr>
+          <w:rFonts w:ascii="Arial" w:hAnsi="Arial"/>
+          <w:sz w:val="22"/>
+        </w:rPr>
+        <w:t xml:space="preserve"> purge at 140 h, and a refresh of the 0.1 M KHCO</w:t>
+      </w:r>
+      <w:r>
+        <w:rPr>
+          <w:rFonts w:ascii="Arial" w:hAnsi="Arial"/>
+          <w:sz w:val="22"/>
+          <w:vertAlign w:val="subscript"/>
+        </w:rPr>
+        <w:t>3</w:t>
+      </w:r>
+      <w:r>
+        <w:rPr>
+          <w:rFonts w:ascii="Arial" w:hAnsi="Arial"/>
+          <w:sz w:val="22"/>
+        </w:rPr>
+        <w:t xml:space="preserve"> anolyte at 160 h. The transient FE(CO) excursions to ~80 % around 80, 110, and 150 h, each recovering after the corresponding intervention, indicate that the dominant degradation was reversible channel water/salt accumulation rather than irreversible catalyst or membrane failure; the stable voltage throughout confirms the channel-blockage regime, and the dried-N</w:t>
+      </w:r>
+      <w:r>
+        <w:rPr>
+          <w:rFonts w:ascii="Arial" w:hAnsi="Arial"/>
+          <w:sz w:val="22"/>
+          <w:vertAlign w:val="subscript"/>
+        </w:rPr>
+        <w:t>2</w:t>
+      </w:r>
+      <w:r>
+        <w:rPr>
+          <w:rFonts w:ascii="Arial" w:hAnsi="Arial"/>
+          <w:sz w:val="22"/>
+        </w:rPr>
+        <w:t xml:space="preserve"> purge re-opened the gas pathways while the anolyte refresh restored the K</w:t>
+      </w:r>
+      <w:r>
+        <w:rPr>
+          <w:rFonts w:ascii="Arial" w:hAnsi="Arial"/>
+          <w:sz w:val="22"/>
+          <w:vertAlign w:val="superscript"/>
+        </w:rPr>
+        <w:t>+</w:t>
+      </w:r>
+      <w:r>
+        <w:rPr>
+          <w:rFonts w:ascii="Arial" w:hAnsi="Arial"/>
+          <w:sz w:val="22"/>
+        </w:rPr>
+        <w:t>/carbonate balance. Post-mortem inspection of the disassembled cell (Figure 4) showed relatively clean parallel-flow-field channels with only minor residue, mild grayish salt deposition on the AgNPs gas-diffusion electrode, and an intact 40 µm membrane with no visible physical breach, all consistent with the sustained FE(CO) and stable voltage recorded during the run. These observations indicate that combining a 40 µm membrane, 30° gravity-assisted drainage, and periodic dried-N</w:t>
+      </w:r>
+      <w:r>
+        <w:rPr>
+          <w:rFonts w:ascii="Arial" w:hAnsi="Arial"/>
+          <w:sz w:val="22"/>
+          <w:vertAlign w:val="subscript"/>
+        </w:rPr>
+        <w:t>2</w:t>
+      </w:r>
+      <w:r>
+        <w:rPr>
+          <w:rFonts w:ascii="Arial" w:hAnsi="Arial"/>
+          <w:sz w:val="22"/>
+        </w:rPr>
+        <w:t xml:space="preserve"> purging with anolyte refresh extends stable 100 cm</w:t>
+      </w:r>
+      <w:r>
+        <w:rPr>
+          <w:rFonts w:ascii="Arial" w:hAnsi="Arial"/>
+          <w:sz w:val="22"/>
+          <w:vertAlign w:val="superscript"/>
+        </w:rPr>
+        <w:t>2</w:t>
+      </w:r>
+      <w:r>
+        <w:rPr>
+          <w:rFonts w:ascii="Arial" w:hAnsi="Arial"/>
+          <w:sz w:val="22"/>
+        </w:rPr>
+        <w:t xml:space="preserve"> operation </w:t>
+      </w:r>
+      <w:r>
+        <w:rPr>
+          <w:rFonts w:ascii="Arial" w:hAnsi="Arial"/>
+          <w:sz w:val="22"/>
+        </w:rPr>
         <w:t>to ~195–200 h, with mild GDE salt deposition remaining the residual degradation pathway to be addressed.</w:t>
       </w:r>
     </w:p>
@@ -3365,7 +4002,172 @@
           <w:rFonts w:ascii="Arial" w:hAnsi="Arial"/>
           <w:sz w:val="22"/>
         </w:rPr>
-        <w:t>Long-term CO₂ electrolysis of the AgNPs (50 nm, ~0.6 mg·cm⁻²) / AEM 40 µm / IrO₂-TiPt 100 cm² parallel-flow-field MEA at 0° and 30° orientation under 50 mM CH₃COOH humidified CO₂ (400 ml·min⁻¹), 100 ml·min⁻¹ 0.1 M KHCO₃, 100 mA·cm⁻², reaching ~195–200 h. Lower panel: cell voltage and cathode outlet pressure with recovery interventions annotated (shutdown-rerun at 80 h; dried-N₂ purge at 87 h and 140 h; anolyte refresh at 160 h).</w:t>
+        <w:t>Long-term CO</w:t>
+      </w:r>
+      <w:r>
+        <w:rPr>
+          <w:rFonts w:ascii="Arial" w:hAnsi="Arial"/>
+          <w:sz w:val="22"/>
+          <w:vertAlign w:val="subscript"/>
+        </w:rPr>
+        <w:t>2</w:t>
+      </w:r>
+      <w:r>
+        <w:rPr>
+          <w:rFonts w:ascii="Arial" w:hAnsi="Arial"/>
+          <w:sz w:val="22"/>
+        </w:rPr>
+        <w:t xml:space="preserve"> electrolysis of the AgNPs (50 nm, ~0.6 mg·cm</w:t>
+      </w:r>
+      <w:r>
+        <w:rPr>
+          <w:rFonts w:ascii="Arial" w:hAnsi="Arial"/>
+          <w:sz w:val="22"/>
+          <w:vertAlign w:val="superscript"/>
+        </w:rPr>
+        <w:t>-2</w:t>
+      </w:r>
+      <w:r>
+        <w:rPr>
+          <w:rFonts w:ascii="Arial" w:hAnsi="Arial"/>
+          <w:sz w:val="22"/>
+        </w:rPr>
+        <w:t>) / AEM 40 µm / IrO</w:t>
+      </w:r>
+      <w:r>
+        <w:rPr>
+          <w:rFonts w:ascii="Arial" w:hAnsi="Arial"/>
+          <w:sz w:val="22"/>
+          <w:vertAlign w:val="subscript"/>
+        </w:rPr>
+        <w:t>2</w:t>
+      </w:r>
+      <w:r>
+        <w:rPr>
+          <w:rFonts w:ascii="Arial" w:hAnsi="Arial"/>
+          <w:sz w:val="22"/>
+        </w:rPr>
+        <w:t>-TiPt 100 cm</w:t>
+      </w:r>
+      <w:r>
+        <w:rPr>
+          <w:rFonts w:ascii="Arial" w:hAnsi="Arial"/>
+          <w:sz w:val="22"/>
+          <w:vertAlign w:val="superscript"/>
+        </w:rPr>
+        <w:t>2</w:t>
+      </w:r>
+      <w:r>
+        <w:rPr>
+          <w:rFonts w:ascii="Arial" w:hAnsi="Arial"/>
+          <w:sz w:val="22"/>
+        </w:rPr>
+        <w:t xml:space="preserve"> parallel-flow-field MEA at 0° and 30° orientation under 50 mM CH</w:t>
+      </w:r>
+      <w:r>
+        <w:rPr>
+          <w:rFonts w:ascii="Arial" w:hAnsi="Arial"/>
+          <w:sz w:val="22"/>
+          <w:vertAlign w:val="subscript"/>
+        </w:rPr>
+        <w:t>3</w:t>
+      </w:r>
+      <w:r>
+        <w:rPr>
+          <w:rFonts w:ascii="Arial" w:hAnsi="Arial"/>
+          <w:sz w:val="22"/>
+        </w:rPr>
+        <w:t>COOH humidified CO</w:t>
+      </w:r>
+      <w:r>
+        <w:rPr>
+          <w:rFonts w:ascii="Arial" w:hAnsi="Arial"/>
+          <w:sz w:val="22"/>
+          <w:vertAlign w:val="subscript"/>
+        </w:rPr>
+        <w:t>2</w:t>
+      </w:r>
+      <w:r>
+        <w:rPr>
+          <w:rFonts w:ascii="Arial" w:hAnsi="Arial"/>
+          <w:sz w:val="22"/>
+        </w:rPr>
+        <w:t xml:space="preserve"> (400 ml·min</w:t>
+      </w:r>
+      <w:r>
+        <w:rPr>
+          <w:rFonts w:ascii="Arial" w:hAnsi="Arial"/>
+          <w:sz w:val="22"/>
+          <w:vertAlign w:val="superscript"/>
+        </w:rPr>
+        <w:t>-1</w:t>
+      </w:r>
+      <w:r>
+        <w:rPr>
+          <w:rFonts w:ascii="Arial" w:hAnsi="Arial"/>
+          <w:sz w:val="22"/>
+        </w:rPr>
+        <w:t>), 100 ml·min</w:t>
+      </w:r>
+      <w:r>
+        <w:rPr>
+          <w:rFonts w:ascii="Arial" w:hAnsi="Arial"/>
+          <w:sz w:val="22"/>
+          <w:vertAlign w:val="superscript"/>
+        </w:rPr>
+        <w:t>-1</w:t>
+      </w:r>
+      <w:r>
+        <w:rPr>
+          <w:rFonts w:ascii="Arial" w:hAnsi="Arial"/>
+          <w:sz w:val="22"/>
+        </w:rPr>
+        <w:t xml:space="preserve"> 0.1 M KHCO</w:t>
+      </w:r>
+      <w:r>
+        <w:rPr>
+          <w:rFonts w:ascii="Arial" w:hAnsi="Arial"/>
+          <w:sz w:val="22"/>
+          <w:vertAlign w:val="subscript"/>
+        </w:rPr>
+        <w:t>3</w:t>
+      </w:r>
+      <w:r>
+        <w:rPr>
+          <w:rFonts w:ascii="Arial" w:hAnsi="Arial"/>
+          <w:sz w:val="22"/>
+        </w:rPr>
+        <w:t>, 100 mA·cm</w:t>
+      </w:r>
+      <w:r>
+        <w:rPr>
+          <w:rFonts w:ascii="Arial" w:hAnsi="Arial"/>
+          <w:sz w:val="22"/>
+          <w:vertAlign w:val="superscript"/>
+        </w:rPr>
+        <w:t>-2</w:t>
+      </w:r>
+      <w:r>
+        <w:rPr>
+          <w:rFonts w:ascii="Arial" w:hAnsi="Arial"/>
+          <w:sz w:val="22"/>
+        </w:rPr>
+        <w:t>, reaching ~195–200 h. Lower panel: cell voltage and cathode outlet pressure with recovery interventions annotated (shutdown-rerun at 80 h; dried-N</w:t>
+      </w:r>
+      <w:r>
+        <w:rPr>
+          <w:rFonts w:ascii="Arial" w:hAnsi="Arial"/>
+          <w:sz w:val="22"/>
+          <w:vertAlign w:val="subscript"/>
+        </w:rPr>
+        <w:t>2</w:t>
+      </w:r>
+      <w:r>
+        <w:rPr>
+          <w:rFonts w:ascii="Arial" w:hAnsi="Arial"/>
+          <w:sz w:val="22"/>
+        </w:rPr>
+        <w:t xml:space="preserve"> purge at 87 h and 140 h; anolyte refresh at 160 h).</w:t>
       </w:r>
     </w:p>
     <w:p>
@@ -3441,7 +4243,37 @@
           <w:rFonts w:ascii="Arial" w:hAnsi="Arial"/>
           <w:sz w:val="22"/>
         </w:rPr>
-        <w:t>Post-mortem photographs of the 100 cm² MEA after 195 h of CO₂RR, showing the parallel flow-field plate, AgNPs gas-diffusion electrode, and 40 µm AEM after 140 h and 195 h of operation.</w:t>
+        <w:t>Post-mortem photographs of the 100 cm</w:t>
+      </w:r>
+      <w:r>
+        <w:rPr>
+          <w:rFonts w:ascii="Arial" w:hAnsi="Arial"/>
+          <w:sz w:val="22"/>
+          <w:vertAlign w:val="superscript"/>
+        </w:rPr>
+        <w:t>2</w:t>
+      </w:r>
+      <w:r>
+        <w:rPr>
+          <w:rFonts w:ascii="Arial" w:hAnsi="Arial"/>
+          <w:sz w:val="22"/>
+        </w:rPr>
+        <w:t xml:space="preserve"> MEA after 195 h of CO</w:t>
+      </w:r>
+      <w:r>
+        <w:rPr>
+          <w:rFonts w:ascii="Arial" w:hAnsi="Arial"/>
+          <w:sz w:val="22"/>
+          <w:vertAlign w:val="subscript"/>
+        </w:rPr>
+        <w:t>2</w:t>
+      </w:r>
+      <w:r>
+        <w:rPr>
+          <w:rFonts w:ascii="Arial" w:hAnsi="Arial"/>
+          <w:sz w:val="22"/>
+        </w:rPr>
+        <w:t>RR, showing the parallel flow-field plate, AgNPs gas-diffusion electrode, and 40 µm AEM after 140 h and 195 h of operation.</w:t>
       </w:r>
     </w:p>
     <w:p>

</xml_diff>

<commit_message>
Convert all chemical formulae to native sub/superscript document-wide
Apply a unified chemistry-aware pass: flat formulae (cm2, CO2, CH3COOH,
KHCO3, IrO2, mA/cm2) and remaining Unicode glyphs (min⁻¹, cm⁻²) are all
rendered as native Word superscript/subscript in Arial, preserving bold
in headings, captions, and lists. Removes the last Cambria Math fallback.

Co-Authored-By: Claude Opus 4.8 <noreply@anthropic.com>
</commit_message>
<xml_diff>
--- a/writing.agent/plotted graphs/June/6_June report - Sothearoth Heng.docx
+++ b/writing.agent/plotted graphs/June/6_June report - Sothearoth Heng.docx
@@ -14,1010 +14,11 @@
       </w:pPr>
       <w:r>
         <w:rPr>
-          <w:rFonts w:ascii="Arial" w:hAnsi="Arial" w:cs="Arial"/>
-          <w:noProof/>
-        </w:rPr>
-        <mc:AlternateContent>
-          <mc:Choice Requires="wps">
-            <w:drawing>
-              <wp:anchor distT="0" distB="0" distL="114300" distR="114300" simplePos="0" relativeHeight="251670528" behindDoc="0" locked="0" layoutInCell="1" allowOverlap="1" wp14:anchorId="01A0022C" wp14:editId="5A112B4F">
-                <wp:simplePos x="0" y="0"/>
-                <wp:positionH relativeFrom="column">
-                  <wp:posOffset>3948772</wp:posOffset>
-                </wp:positionH>
-                <wp:positionV relativeFrom="paragraph">
-                  <wp:posOffset>8635609</wp:posOffset>
-                </wp:positionV>
-                <wp:extent cx="2463165" cy="800100"/>
-                <wp:effectExtent l="0" t="0" r="0" b="0"/>
-                <wp:wrapNone/>
-                <wp:docPr id="15" name="TextBox 15"/>
-                <wp:cNvGraphicFramePr/>
-                <a:graphic xmlns:a="http://schemas.openxmlformats.org/drawingml/2006/main">
-                  <a:graphicData uri="http://schemas.microsoft.com/office/word/2010/wordprocessingShape">
-                    <wps:wsp>
-                      <wps:cNvSpPr txBox="1"/>
-                      <wps:spPr>
-                        <a:xfrm>
-                          <a:off x="0" y="0"/>
-                          <a:ext cx="2463165" cy="800100"/>
-                        </a:xfrm>
-                        <a:prstGeom prst="rect">
-                          <a:avLst/>
-                        </a:prstGeom>
-                      </wps:spPr>
-                      <wps:txbx>
-                        <w:txbxContent>
-                          <w:p>
-                            <w:pPr>
-                              <w:spacing w:line="420" w:lineRule="exact"/>
-                              <w:rPr>
-                                <w:rFonts w:ascii="Arial" w:hAnsi="Arial" w:cs="Arial"/>
-                                <w:color w:val="000000"/>
-                                <w:kern w:val="24"/>
-                                <w:sz w:val="32"/>
-                                <w:szCs w:val="32"/>
-                              </w:rPr>
-                            </w:pPr>
-                            <w:r>
-                              <w:rPr>
-                                <w:rFonts w:ascii="Arial" w:hAnsi="Arial" w:cs="Arial"/>
-                                <w:color w:val="000000"/>
-                                <w:kern w:val="24"/>
-                                <w:sz w:val="32"/>
-                                <w:szCs w:val="32"/>
-                              </w:rPr>
-                              <w:t xml:space="preserve"> …….</w:t>
-                            </w:r>
-                            <w:r>
-                              <w:rPr>
-                                <w:rFonts w:ascii="Arial" w:hAnsi="Arial" w:cs="Arial"/>
-                                <w:color w:val="000000"/>
-                                <w:kern w:val="24"/>
-                                <w:sz w:val="32"/>
-                                <w:szCs w:val="32"/>
-                              </w:rPr>
-                              <w:t>...................................</w:t>
-                            </w:r>
-                          </w:p>
-                          <w:p>
-                            <w:pPr>
-                              <w:spacing w:line="420" w:lineRule="exact"/>
-                              <w:jc w:val="center"/>
-                              <w:rPr>
-                                <w:rFonts w:ascii="Arial" w:hAnsi="Arial" w:cs="Arial"/>
-                                <w:color w:val="000000"/>
-                                <w:kern w:val="24"/>
-                                <w:sz w:val="32"/>
-                                <w:szCs w:val="32"/>
-                              </w:rPr>
-                            </w:pPr>
-                            <w:r>
-                              <w:rPr>
-                                <w:rFonts w:ascii="Arial" w:hAnsi="Arial" w:cs="Arial"/>
-                                <w:color w:val="000000"/>
-                                <w:kern w:val="24"/>
-                                <w:sz w:val="32"/>
-                                <w:szCs w:val="32"/>
-                              </w:rPr>
-                              <w:t xml:space="preserve">Dr. </w:t>
-                            </w:r>
-                            <w:proofErr w:type="spellStart"/>
-                            <w:r>
-                              <w:rPr>
-                                <w:rFonts w:ascii="Arial" w:hAnsi="Arial" w:cs="Arial"/>
-                                <w:color w:val="000000"/>
-                                <w:kern w:val="24"/>
-                                <w:sz w:val="32"/>
-                                <w:szCs w:val="32"/>
-                              </w:rPr>
-                              <w:t>Pongkarn</w:t>
-                            </w:r>
-                            <w:proofErr w:type="spellEnd"/>
-                            <w:r>
-                              <w:rPr>
-                                <w:rFonts w:ascii="Arial" w:hAnsi="Arial" w:cs="Arial"/>
-                                <w:color w:val="000000"/>
-                                <w:kern w:val="24"/>
-                                <w:sz w:val="32"/>
-                                <w:szCs w:val="32"/>
-                              </w:rPr>
-                              <w:t xml:space="preserve"> </w:t>
-                            </w:r>
-                            <w:proofErr w:type="spellStart"/>
-                            <w:r>
-                              <w:rPr>
-                                <w:rFonts w:ascii="Arial" w:hAnsi="Arial" w:cs="Arial"/>
-                                <w:color w:val="000000"/>
-                                <w:kern w:val="24"/>
-                                <w:sz w:val="32"/>
-                                <w:szCs w:val="32"/>
-                              </w:rPr>
-                              <w:t>Chakthranont</w:t>
-                            </w:r>
-                            <w:proofErr w:type="spellEnd"/>
-                          </w:p>
-                        </w:txbxContent>
-                      </wps:txbx>
-                      <wps:bodyPr wrap="square" lIns="0" tIns="0" rIns="0" bIns="0" rtlCol="0" anchor="t">
-                        <a:spAutoFit/>
-                      </wps:bodyPr>
-                    </wps:wsp>
-                  </a:graphicData>
-                </a:graphic>
-                <wp14:sizeRelH relativeFrom="margin">
-                  <wp14:pctWidth>0</wp14:pctWidth>
-                </wp14:sizeRelH>
-              </wp:anchor>
-            </w:drawing>
-          </mc:Choice>
-          <mc:Fallback>
-            <w:pict>
-              <v:shapetype w14:anchorId="01A0022C" id="_x0000_t202" coordsize="21600,21600" o:spt="202" path="m,l,21600r21600,l21600,xe">
-                <v:stroke joinstyle="miter"/>
-                <v:path gradientshapeok="t" o:connecttype="rect"/>
-              </v:shapetype>
-              <v:shape id="TextBox 15" o:spid="_x0000_s1026" type="#_x0000_t202" style="position:absolute;left:0;text-align:left;margin-left:310.95pt;margin-top:679.95pt;width:193.95pt;height:63pt;z-index:251670528;visibility:visible;mso-wrap-style:square;mso-width-percent:0;mso-wrap-distance-left:9pt;mso-wrap-distance-top:0;mso-wrap-distance-right:9pt;mso-wrap-distance-bottom:0;mso-position-horizontal:absolute;mso-position-horizontal-relative:text;mso-position-vertical:absolute;mso-position-vertical-relative:text;mso-width-percent:0;mso-width-relative:margin;v-text-anchor:top" o:gfxdata="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" filled="f" stroked="f">
-                <v:textbox style="mso-fit-shape-to-text:t" inset="0,0,0,0">
-                  <w:txbxContent>
-                    <w:p>
-                      <w:pPr>
-                        <w:spacing w:line="420" w:lineRule="exact"/>
-                        <w:rPr>
-                          <w:rFonts w:ascii="Arial" w:hAnsi="Arial" w:cs="Arial"/>
-                          <w:color w:val="000000"/>
-                          <w:kern w:val="24"/>
-                          <w:sz w:val="32"/>
-                          <w:szCs w:val="32"/>
-                        </w:rPr>
-                      </w:pPr>
-                      <w:r>
-                        <w:rPr>
-                          <w:rFonts w:ascii="Arial" w:hAnsi="Arial" w:cs="Arial"/>
-                          <w:color w:val="000000"/>
-                          <w:kern w:val="24"/>
-                          <w:sz w:val="32"/>
-                          <w:szCs w:val="32"/>
-                        </w:rPr>
-                        <w:t xml:space="preserve"> …….</w:t>
-                      </w:r>
-                      <w:r>
-                        <w:rPr>
-                          <w:rFonts w:ascii="Arial" w:hAnsi="Arial" w:cs="Arial"/>
-                          <w:color w:val="000000"/>
-                          <w:kern w:val="24"/>
-                          <w:sz w:val="32"/>
-                          <w:szCs w:val="32"/>
-                        </w:rPr>
-                        <w:t>...................................</w:t>
-                      </w:r>
-                    </w:p>
-                    <w:p>
-                      <w:pPr>
-                        <w:spacing w:line="420" w:lineRule="exact"/>
-                        <w:jc w:val="center"/>
-                        <w:rPr>
-                          <w:rFonts w:ascii="Arial" w:hAnsi="Arial" w:cs="Arial"/>
-                          <w:color w:val="000000"/>
-                          <w:kern w:val="24"/>
-                          <w:sz w:val="32"/>
-                          <w:szCs w:val="32"/>
-                        </w:rPr>
-                      </w:pPr>
-                      <w:r>
-                        <w:rPr>
-                          <w:rFonts w:ascii="Arial" w:hAnsi="Arial" w:cs="Arial"/>
-                          <w:color w:val="000000"/>
-                          <w:kern w:val="24"/>
-                          <w:sz w:val="32"/>
-                          <w:szCs w:val="32"/>
-                        </w:rPr>
-                        <w:t xml:space="preserve">Dr. </w:t>
-                      </w:r>
-                      <w:proofErr w:type="spellStart"/>
-                      <w:r>
-                        <w:rPr>
-                          <w:rFonts w:ascii="Arial" w:hAnsi="Arial" w:cs="Arial"/>
-                          <w:color w:val="000000"/>
-                          <w:kern w:val="24"/>
-                          <w:sz w:val="32"/>
-                          <w:szCs w:val="32"/>
-                        </w:rPr>
-                        <w:t>Pongkarn</w:t>
-                      </w:r>
-                      <w:proofErr w:type="spellEnd"/>
-                      <w:r>
-                        <w:rPr>
-                          <w:rFonts w:ascii="Arial" w:hAnsi="Arial" w:cs="Arial"/>
-                          <w:color w:val="000000"/>
-                          <w:kern w:val="24"/>
-                          <w:sz w:val="32"/>
-                          <w:szCs w:val="32"/>
-                        </w:rPr>
-                        <w:t xml:space="preserve"> </w:t>
-                      </w:r>
-                      <w:proofErr w:type="spellStart"/>
-                      <w:r>
-                        <w:rPr>
-                          <w:rFonts w:ascii="Arial" w:hAnsi="Arial" w:cs="Arial"/>
-                          <w:color w:val="000000"/>
-                          <w:kern w:val="24"/>
-                          <w:sz w:val="32"/>
-                          <w:szCs w:val="32"/>
-                        </w:rPr>
-                        <w:t>Chakthranont</w:t>
-                      </w:r>
-                      <w:proofErr w:type="spellEnd"/>
-                    </w:p>
-                  </w:txbxContent>
-                </v:textbox>
-              </v:shape>
-            </w:pict>
-          </mc:Fallback>
-        </mc:AlternateContent>
-      </w:r>
-      <w:r>
-        <w:rPr>
-          <w:rFonts w:ascii="Arial" w:hAnsi="Arial" w:cs="Arial"/>
-          <w:noProof/>
-        </w:rPr>
-        <mc:AlternateContent>
-          <mc:Choice Requires="wps">
-            <w:drawing>
-              <wp:anchor distT="0" distB="0" distL="114300" distR="114300" simplePos="0" relativeHeight="251664384" behindDoc="0" locked="0" layoutInCell="1" allowOverlap="1" wp14:anchorId="1086180F" wp14:editId="56E79F0F">
-                <wp:simplePos x="0" y="0"/>
-                <wp:positionH relativeFrom="column">
-                  <wp:posOffset>-480766</wp:posOffset>
-                </wp:positionH>
-                <wp:positionV relativeFrom="paragraph">
-                  <wp:posOffset>1743959</wp:posOffset>
-                </wp:positionV>
-                <wp:extent cx="6561056" cy="1114425"/>
-                <wp:effectExtent l="0" t="0" r="0" b="0"/>
-                <wp:wrapNone/>
-                <wp:docPr id="8" name="TextBox 8"/>
-                <wp:cNvGraphicFramePr/>
-                <a:graphic xmlns:a="http://schemas.openxmlformats.org/drawingml/2006/main">
-                  <a:graphicData uri="http://schemas.microsoft.com/office/word/2010/wordprocessingShape">
-                    <wps:wsp>
-                      <wps:cNvSpPr txBox="1"/>
-                      <wps:spPr>
-                        <a:xfrm>
-                          <a:off x="0" y="0"/>
-                          <a:ext cx="6561056" cy="1114425"/>
-                        </a:xfrm>
-                        <a:prstGeom prst="rect">
-                          <a:avLst/>
-                        </a:prstGeom>
-                      </wps:spPr>
-                      <wps:txbx>
-                        <w:txbxContent>
-                          <w:p>
-                            <w:pPr>
-                              <w:pStyle w:val="p1"/>
-                              <w:spacing w:line="276" w:lineRule="auto"/>
-                              <w:jc w:val="center"/>
-                              <w:rPr>
-                                <w:rFonts w:ascii="Arial" w:hAnsi="Arial" w:cs="Arial"/>
-                                <w:b/>
-                                <w:bCs/>
-                                <w:kern w:val="24"/>
-                                <w:sz w:val="32"/>
-                                <w:szCs w:val="32"/>
-                              </w:rPr>
-                            </w:pPr>
-                            <w:r>
-                              <w:rPr>
-                                <w:rFonts w:ascii="Arial" w:hAnsi="Arial" w:cs="Arial"/>
-                                <w:b/>
-                                <w:bCs/>
-                                <w:kern w:val="24"/>
-                                <w:sz w:val="32"/>
-                                <w:szCs w:val="32"/>
-                              </w:rPr>
-                              <w:t>Project:</w:t>
-                            </w:r>
-                          </w:p>
-                          <w:p>
-                            <w:pPr>
-                              <w:pStyle w:val="p1"/>
-                              <w:spacing w:line="276" w:lineRule="auto"/>
-                              <w:jc w:val="center"/>
-                              <w:rPr>
-                                <w:rFonts w:ascii="Arial" w:hAnsi="Arial" w:cs="Arial"/>
-                                <w:b/>
-                                <w:bCs/>
-                                <w:sz w:val="32"/>
-                                <w:szCs w:val="32"/>
-                                <w:cs/>
-                                <w:lang w:bidi="km-KH"/>
-                              </w:rPr>
-                            </w:pPr>
-                            <w:r>
-                              <w:rPr>
-                                <w:rFonts w:ascii="Arial" w:hAnsi="Arial" w:cs="Arial"/>
-                                <w:b/>
-                                <w:bCs/>
-                                <w:sz w:val="32"/>
-                                <w:szCs w:val="32"/>
-                                <w:lang w:bidi="km-KH"/>
-                              </w:rPr>
-                              <w:t>Advancing Integrated Materials and Devices for Electrochemical CO</w:t>
-                            </w:r>
-                            <w:r>
-                              <w:rPr>
-                                <w:rFonts w:ascii="Arial" w:hAnsi="Arial" w:cs="Arial"/>
-                                <w:b/>
-                                <w:bCs/>
-                                <w:sz w:val="32"/>
-                                <w:szCs w:val="32"/>
-                                <w:vertAlign w:val="subscript"/>
-                                <w:lang w:bidi="km-KH"/>
-                              </w:rPr>
-                              <w:t>2</w:t>
-                            </w:r>
-                            <w:r>
-                              <w:rPr>
-                                <w:rFonts w:ascii="Arial" w:hAnsi="Arial" w:cs="Arial"/>
-                                <w:b/>
-                                <w:bCs/>
-                                <w:sz w:val="32"/>
-                                <w:szCs w:val="32"/>
-                                <w:lang w:bidi="km-KH"/>
-                              </w:rPr>
-                              <w:t xml:space="preserve"> Reduction (AIM-COR)</w:t>
-                            </w:r>
-                          </w:p>
-                        </w:txbxContent>
-                      </wps:txbx>
-                      <wps:bodyPr wrap="square" lIns="0" tIns="0" rIns="0" bIns="0" rtlCol="0" anchor="t">
-                        <a:spAutoFit/>
-                      </wps:bodyPr>
-                    </wps:wsp>
-                  </a:graphicData>
-                </a:graphic>
-                <wp14:sizeRelH relativeFrom="margin">
-                  <wp14:pctWidth>0</wp14:pctWidth>
-                </wp14:sizeRelH>
-              </wp:anchor>
-            </w:drawing>
-          </mc:Choice>
-          <mc:Fallback>
-            <w:pict>
-              <v:shape w14:anchorId="1086180F" id="TextBox 8" o:spid="_x0000_s1027" type="#_x0000_t202" style="position:absolute;left:0;text-align:left;margin-left:-37.85pt;margin-top:137.3pt;width:516.6pt;height:87.75pt;z-index:251664384;visibility:visible;mso-wrap-style:square;mso-width-percent:0;mso-wrap-distance-left:9pt;mso-wrap-distance-top:0;mso-wrap-distance-right:9pt;mso-wrap-distance-bottom:0;mso-position-horizontal:absolute;mso-position-horizontal-relative:text;mso-position-vertical:absolute;mso-position-vertical-relative:text;mso-width-percent:0;mso-width-relative:margin;v-text-anchor:top" o:gfxdata="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" filled="f" stroked="f">
-                <v:textbox style="mso-fit-shape-to-text:t" inset="0,0,0,0">
-                  <w:txbxContent>
-                    <w:p>
-                      <w:pPr>
-                        <w:pStyle w:val="p1"/>
-                        <w:spacing w:line="276" w:lineRule="auto"/>
-                        <w:jc w:val="center"/>
-                        <w:rPr>
-                          <w:rFonts w:ascii="Arial" w:hAnsi="Arial" w:cs="Arial"/>
-                          <w:b/>
-                          <w:bCs/>
-                          <w:kern w:val="24"/>
-                          <w:sz w:val="32"/>
-                          <w:szCs w:val="32"/>
-                        </w:rPr>
-                      </w:pPr>
-                      <w:r>
-                        <w:rPr>
-                          <w:rFonts w:ascii="Arial" w:hAnsi="Arial" w:cs="Arial"/>
-                          <w:b/>
-                          <w:bCs/>
-                          <w:kern w:val="24"/>
-                          <w:sz w:val="32"/>
-                          <w:szCs w:val="32"/>
-                        </w:rPr>
-                        <w:t>Project:</w:t>
-                      </w:r>
-                    </w:p>
-                    <w:p>
-                      <w:pPr>
-                        <w:pStyle w:val="p1"/>
-                        <w:spacing w:line="276" w:lineRule="auto"/>
-                        <w:jc w:val="center"/>
-                        <w:rPr>
-                          <w:rFonts w:ascii="Arial" w:hAnsi="Arial" w:cs="Arial"/>
-                          <w:b/>
-                          <w:bCs/>
-                          <w:sz w:val="32"/>
-                          <w:szCs w:val="32"/>
-                          <w:cs/>
-                          <w:lang w:bidi="km-KH"/>
-                        </w:rPr>
-                      </w:pPr>
-                      <w:r>
-                        <w:rPr>
-                          <w:rFonts w:ascii="Arial" w:hAnsi="Arial" w:cs="Arial"/>
-                          <w:b/>
-                          <w:bCs/>
-                          <w:sz w:val="32"/>
-                          <w:szCs w:val="32"/>
-                          <w:lang w:bidi="km-KH"/>
-                        </w:rPr>
-                        <w:t>Advancing Integrated Materials and Devices for Electrochemical CO</w:t>
-                      </w:r>
-                      <w:r>
-                        <w:rPr>
-                          <w:rFonts w:ascii="Arial" w:hAnsi="Arial" w:cs="Arial"/>
-                          <w:b/>
-                          <w:bCs/>
-                          <w:sz w:val="32"/>
-                          <w:szCs w:val="32"/>
-                          <w:vertAlign w:val="subscript"/>
-                          <w:lang w:bidi="km-KH"/>
-                        </w:rPr>
-                        <w:t>2</w:t>
-                      </w:r>
-                      <w:r>
-                        <w:rPr>
-                          <w:rFonts w:ascii="Arial" w:hAnsi="Arial" w:cs="Arial"/>
-                          <w:b/>
-                          <w:bCs/>
-                          <w:sz w:val="32"/>
-                          <w:szCs w:val="32"/>
-                          <w:lang w:bidi="km-KH"/>
-                        </w:rPr>
-                        <w:t xml:space="preserve"> Reduction (AIM-COR)</w:t>
-                      </w:r>
-                    </w:p>
-                  </w:txbxContent>
-                </v:textbox>
-              </v:shape>
-            </w:pict>
-          </mc:Fallback>
-        </mc:AlternateContent>
-      </w:r>
-      <w:r>
-        <w:rPr>
-          <w:rFonts w:ascii="Arial" w:hAnsi="Arial" w:cs="Arial"/>
-          <w:noProof/>
-        </w:rPr>
-        <mc:AlternateContent>
-          <mc:Choice Requires="wps">
-            <w:drawing>
-              <wp:anchor distT="0" distB="0" distL="114300" distR="114300" simplePos="0" relativeHeight="251668480" behindDoc="0" locked="0" layoutInCell="1" allowOverlap="1" wp14:anchorId="63DC4FB0" wp14:editId="53ED969A">
-                <wp:simplePos x="0" y="0"/>
-                <wp:positionH relativeFrom="column">
-                  <wp:posOffset>1323975</wp:posOffset>
-                </wp:positionH>
-                <wp:positionV relativeFrom="paragraph">
-                  <wp:posOffset>4940300</wp:posOffset>
-                </wp:positionV>
-                <wp:extent cx="3255666" cy="1192530"/>
-                <wp:effectExtent l="0" t="0" r="0" b="0"/>
-                <wp:wrapNone/>
-                <wp:docPr id="13" name="TextBox 13"/>
-                <wp:cNvGraphicFramePr/>
-                <a:graphic xmlns:a="http://schemas.openxmlformats.org/drawingml/2006/main">
-                  <a:graphicData uri="http://schemas.microsoft.com/office/word/2010/wordprocessingShape">
-                    <wps:wsp>
-                      <wps:cNvSpPr txBox="1"/>
-                      <wps:spPr>
-                        <a:xfrm>
-                          <a:off x="0" y="0"/>
-                          <a:ext cx="3255666" cy="1192530"/>
-                        </a:xfrm>
-                        <a:prstGeom prst="rect">
-                          <a:avLst/>
-                        </a:prstGeom>
-                      </wps:spPr>
-                      <wps:txbx>
-                        <w:txbxContent>
-                          <w:p>
-                            <w:pPr>
-                              <w:spacing w:line="504" w:lineRule="exact"/>
-                              <w:jc w:val="center"/>
-                              <w:rPr>
-                                <w:rFonts w:ascii="Arial" w:hAnsi="Arial" w:cs="Arial"/>
-                                <w:b/>
-                                <w:bCs/>
-                                <w:color w:val="000000"/>
-                                <w:kern w:val="24"/>
-                                <w:sz w:val="32"/>
-                                <w:szCs w:val="32"/>
-                              </w:rPr>
-                            </w:pPr>
-                            <w:r>
-                              <w:rPr>
-                                <w:rFonts w:ascii="Arial" w:hAnsi="Arial" w:cs="Arial"/>
-                                <w:b/>
-                                <w:bCs/>
-                                <w:color w:val="000000"/>
-                                <w:kern w:val="24"/>
-                                <w:sz w:val="32"/>
-                                <w:szCs w:val="32"/>
-                              </w:rPr>
-                              <w:t>Sothearoth Heng</w:t>
-                            </w:r>
-                            <w:r>
-                              <w:rPr>
-                                <w:rFonts w:ascii="Arial" w:hAnsi="Arial" w:cs="Arial"/>
-                                <w:b/>
-                                <w:bCs/>
-                                <w:color w:val="000000"/>
-                                <w:kern w:val="24"/>
-                                <w:sz w:val="32"/>
-                                <w:szCs w:val="32"/>
-                              </w:rPr>
-                              <w:t xml:space="preserve"> (ID: 803198)</w:t>
-                            </w:r>
-                            <w:r>
-                              <w:rPr>
-                                <w:rFonts w:ascii="Arial" w:hAnsi="Arial" w:cs="Arial"/>
-                                <w:b/>
-                                <w:bCs/>
-                                <w:color w:val="000000"/>
-                                <w:kern w:val="24"/>
-                                <w:sz w:val="32"/>
-                                <w:szCs w:val="32"/>
-                              </w:rPr>
-                              <w:t xml:space="preserve"> </w:t>
-                            </w:r>
-                          </w:p>
-                          <w:p>
-                            <w:pPr>
-                              <w:spacing w:line="420" w:lineRule="exact"/>
-                              <w:jc w:val="center"/>
-                              <w:rPr>
-                                <w:rFonts w:ascii="Arial" w:hAnsi="Arial" w:cs="Arial"/>
-                                <w:color w:val="000000"/>
-                                <w:kern w:val="24"/>
-                                <w:sz w:val="32"/>
-                                <w:szCs w:val="32"/>
-                              </w:rPr>
-                            </w:pPr>
-                            <w:r>
-                              <w:rPr>
-                                <w:rFonts w:ascii="Arial" w:hAnsi="Arial" w:cs="Arial"/>
-                                <w:color w:val="000000"/>
-                                <w:kern w:val="24"/>
-                                <w:sz w:val="32"/>
-                                <w:szCs w:val="32"/>
-                              </w:rPr>
-                              <w:t xml:space="preserve">Under the supervision of </w:t>
-                            </w:r>
-                          </w:p>
-                          <w:p>
-                            <w:pPr>
-                              <w:spacing w:line="504" w:lineRule="exact"/>
-                              <w:jc w:val="center"/>
-                              <w:rPr>
-                                <w:rFonts w:ascii="Arial" w:hAnsi="Arial" w:cs="Arial"/>
-                                <w:b/>
-                                <w:bCs/>
-                                <w:color w:val="000000"/>
-                                <w:kern w:val="24"/>
-                                <w:sz w:val="32"/>
-                                <w:szCs w:val="32"/>
-                              </w:rPr>
-                            </w:pPr>
-                            <w:r>
-                              <w:rPr>
-                                <w:rFonts w:ascii="Arial" w:hAnsi="Arial" w:cs="Arial"/>
-                                <w:b/>
-                                <w:bCs/>
-                                <w:color w:val="000000"/>
-                                <w:kern w:val="24"/>
-                                <w:sz w:val="32"/>
-                                <w:szCs w:val="32"/>
-                              </w:rPr>
-                              <w:t xml:space="preserve">Dr. </w:t>
-                            </w:r>
-                            <w:proofErr w:type="spellStart"/>
-                            <w:r>
-                              <w:rPr>
-                                <w:rFonts w:ascii="Arial" w:hAnsi="Arial" w:cs="Arial"/>
-                                <w:b/>
-                                <w:bCs/>
-                                <w:color w:val="000000"/>
-                                <w:kern w:val="24"/>
-                                <w:sz w:val="32"/>
-                                <w:szCs w:val="32"/>
-                              </w:rPr>
-                              <w:t>Pongkarn</w:t>
-                            </w:r>
-                            <w:proofErr w:type="spellEnd"/>
-                            <w:r>
-                              <w:rPr>
-                                <w:rFonts w:ascii="Arial" w:hAnsi="Arial" w:cs="Arial"/>
-                                <w:b/>
-                                <w:bCs/>
-                                <w:color w:val="000000"/>
-                                <w:kern w:val="24"/>
-                                <w:sz w:val="32"/>
-                                <w:szCs w:val="32"/>
-                              </w:rPr>
-                              <w:t xml:space="preserve"> </w:t>
-                            </w:r>
-                            <w:proofErr w:type="spellStart"/>
-                            <w:r>
-                              <w:rPr>
-                                <w:rFonts w:ascii="Arial" w:hAnsi="Arial" w:cs="Arial"/>
-                                <w:b/>
-                                <w:bCs/>
-                                <w:color w:val="000000"/>
-                                <w:kern w:val="24"/>
-                                <w:sz w:val="32"/>
-                                <w:szCs w:val="32"/>
-                              </w:rPr>
-                              <w:t>Chakthranont</w:t>
-                            </w:r>
-                            <w:proofErr w:type="spellEnd"/>
-                          </w:p>
-                        </w:txbxContent>
-                      </wps:txbx>
-                      <wps:bodyPr wrap="square" lIns="0" tIns="0" rIns="0" bIns="0" rtlCol="0" anchor="t">
-                        <a:spAutoFit/>
-                      </wps:bodyPr>
-                    </wps:wsp>
-                  </a:graphicData>
-                </a:graphic>
-                <wp14:sizeRelH relativeFrom="margin">
-                  <wp14:pctWidth>0</wp14:pctWidth>
-                </wp14:sizeRelH>
-              </wp:anchor>
-            </w:drawing>
-          </mc:Choice>
-          <mc:Fallback>
-            <w:pict>
-              <v:shape w14:anchorId="63DC4FB0" id="TextBox 13" o:spid="_x0000_s1028" type="#_x0000_t202" style="position:absolute;left:0;text-align:left;margin-left:104.25pt;margin-top:389pt;width:256.35pt;height:93.9pt;z-index:251668480;visibility:visible;mso-wrap-style:square;mso-width-percent:0;mso-wrap-distance-left:9pt;mso-wrap-distance-top:0;mso-wrap-distance-right:9pt;mso-wrap-distance-bottom:0;mso-position-horizontal:absolute;mso-position-horizontal-relative:text;mso-position-vertical:absolute;mso-position-vertical-relative:text;mso-width-percent:0;mso-width-relative:margin;v-text-anchor:top" o:gfxdata="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" filled="f" stroked="f">
-                <v:textbox style="mso-fit-shape-to-text:t" inset="0,0,0,0">
-                  <w:txbxContent>
-                    <w:p>
-                      <w:pPr>
-                        <w:spacing w:line="504" w:lineRule="exact"/>
-                        <w:jc w:val="center"/>
-                        <w:rPr>
-                          <w:rFonts w:ascii="Arial" w:hAnsi="Arial" w:cs="Arial"/>
-                          <w:b/>
-                          <w:bCs/>
-                          <w:color w:val="000000"/>
-                          <w:kern w:val="24"/>
-                          <w:sz w:val="32"/>
-                          <w:szCs w:val="32"/>
-                        </w:rPr>
-                      </w:pPr>
-                      <w:r>
-                        <w:rPr>
-                          <w:rFonts w:ascii="Arial" w:hAnsi="Arial" w:cs="Arial"/>
-                          <w:b/>
-                          <w:bCs/>
-                          <w:color w:val="000000"/>
-                          <w:kern w:val="24"/>
-                          <w:sz w:val="32"/>
-                          <w:szCs w:val="32"/>
-                        </w:rPr>
-                        <w:t>Sothearoth Heng</w:t>
-                      </w:r>
-                      <w:r>
-                        <w:rPr>
-                          <w:rFonts w:ascii="Arial" w:hAnsi="Arial" w:cs="Arial"/>
-                          <w:b/>
-                          <w:bCs/>
-                          <w:color w:val="000000"/>
-                          <w:kern w:val="24"/>
-                          <w:sz w:val="32"/>
-                          <w:szCs w:val="32"/>
-                        </w:rPr>
-                        <w:t xml:space="preserve"> (ID: 803198)</w:t>
-                      </w:r>
-                      <w:r>
-                        <w:rPr>
-                          <w:rFonts w:ascii="Arial" w:hAnsi="Arial" w:cs="Arial"/>
-                          <w:b/>
-                          <w:bCs/>
-                          <w:color w:val="000000"/>
-                          <w:kern w:val="24"/>
-                          <w:sz w:val="32"/>
-                          <w:szCs w:val="32"/>
-                        </w:rPr>
-                        <w:t xml:space="preserve"> </w:t>
-                      </w:r>
-                    </w:p>
-                    <w:p>
-                      <w:pPr>
-                        <w:spacing w:line="420" w:lineRule="exact"/>
-                        <w:jc w:val="center"/>
-                        <w:rPr>
-                          <w:rFonts w:ascii="Arial" w:hAnsi="Arial" w:cs="Arial"/>
-                          <w:color w:val="000000"/>
-                          <w:kern w:val="24"/>
-                          <w:sz w:val="32"/>
-                          <w:szCs w:val="32"/>
-                        </w:rPr>
-                      </w:pPr>
-                      <w:r>
-                        <w:rPr>
-                          <w:rFonts w:ascii="Arial" w:hAnsi="Arial" w:cs="Arial"/>
-                          <w:color w:val="000000"/>
-                          <w:kern w:val="24"/>
-                          <w:sz w:val="32"/>
-                          <w:szCs w:val="32"/>
-                        </w:rPr>
-                        <w:t xml:space="preserve">Under the supervision of </w:t>
-                      </w:r>
-                    </w:p>
-                    <w:p>
-                      <w:pPr>
-                        <w:spacing w:line="504" w:lineRule="exact"/>
-                        <w:jc w:val="center"/>
-                        <w:rPr>
-                          <w:rFonts w:ascii="Arial" w:hAnsi="Arial" w:cs="Arial"/>
-                          <w:b/>
-                          <w:bCs/>
-                          <w:color w:val="000000"/>
-                          <w:kern w:val="24"/>
-                          <w:sz w:val="32"/>
-                          <w:szCs w:val="32"/>
-                        </w:rPr>
-                      </w:pPr>
-                      <w:r>
-                        <w:rPr>
-                          <w:rFonts w:ascii="Arial" w:hAnsi="Arial" w:cs="Arial"/>
-                          <w:b/>
-                          <w:bCs/>
-                          <w:color w:val="000000"/>
-                          <w:kern w:val="24"/>
-                          <w:sz w:val="32"/>
-                          <w:szCs w:val="32"/>
-                        </w:rPr>
-                        <w:t xml:space="preserve">Dr. </w:t>
-                      </w:r>
-                      <w:proofErr w:type="spellStart"/>
-                      <w:r>
-                        <w:rPr>
-                          <w:rFonts w:ascii="Arial" w:hAnsi="Arial" w:cs="Arial"/>
-                          <w:b/>
-                          <w:bCs/>
-                          <w:color w:val="000000"/>
-                          <w:kern w:val="24"/>
-                          <w:sz w:val="32"/>
-                          <w:szCs w:val="32"/>
-                        </w:rPr>
-                        <w:t>Pongkarn</w:t>
-                      </w:r>
-                      <w:proofErr w:type="spellEnd"/>
-                      <w:r>
-                        <w:rPr>
-                          <w:rFonts w:ascii="Arial" w:hAnsi="Arial" w:cs="Arial"/>
-                          <w:b/>
-                          <w:bCs/>
-                          <w:color w:val="000000"/>
-                          <w:kern w:val="24"/>
-                          <w:sz w:val="32"/>
-                          <w:szCs w:val="32"/>
-                        </w:rPr>
-                        <w:t xml:space="preserve"> </w:t>
-                      </w:r>
-                      <w:proofErr w:type="spellStart"/>
-                      <w:r>
-                        <w:rPr>
-                          <w:rFonts w:ascii="Arial" w:hAnsi="Arial" w:cs="Arial"/>
-                          <w:b/>
-                          <w:bCs/>
-                          <w:color w:val="000000"/>
-                          <w:kern w:val="24"/>
-                          <w:sz w:val="32"/>
-                          <w:szCs w:val="32"/>
-                        </w:rPr>
-                        <w:t>Chakthranont</w:t>
-                      </w:r>
-                      <w:proofErr w:type="spellEnd"/>
-                    </w:p>
-                  </w:txbxContent>
-                </v:textbox>
-              </v:shape>
-            </w:pict>
-          </mc:Fallback>
-        </mc:AlternateContent>
-      </w:r>
-      <w:r>
-        <w:rPr>
-          <w:rFonts w:ascii="Arial" w:hAnsi="Arial" w:cs="Arial"/>
-          <w:noProof/>
-        </w:rPr>
-        <mc:AlternateContent>
-          <mc:Choice Requires="wps">
-            <w:drawing>
-              <wp:anchor distT="0" distB="0" distL="114300" distR="114300" simplePos="0" relativeHeight="251666432" behindDoc="0" locked="0" layoutInCell="1" allowOverlap="1" wp14:anchorId="568792A5" wp14:editId="5B771FA3">
-                <wp:simplePos x="0" y="0"/>
-                <wp:positionH relativeFrom="column">
-                  <wp:posOffset>-213360</wp:posOffset>
-                </wp:positionH>
-                <wp:positionV relativeFrom="paragraph">
-                  <wp:posOffset>3200400</wp:posOffset>
-                </wp:positionV>
-                <wp:extent cx="6355080" cy="504825"/>
-                <wp:effectExtent l="0" t="0" r="0" b="0"/>
-                <wp:wrapNone/>
-                <wp:docPr id="14" name="TextBox 14"/>
-                <wp:cNvGraphicFramePr/>
-                <a:graphic xmlns:a="http://schemas.openxmlformats.org/drawingml/2006/main">
-                  <a:graphicData uri="http://schemas.microsoft.com/office/word/2010/wordprocessingShape">
-                    <wps:wsp>
-                      <wps:cNvSpPr txBox="1"/>
-                      <wps:spPr>
-                        <a:xfrm>
-                          <a:off x="0" y="0"/>
-                          <a:ext cx="6355080" cy="504825"/>
-                        </a:xfrm>
-                        <a:prstGeom prst="rect">
-                          <a:avLst/>
-                        </a:prstGeom>
-                      </wps:spPr>
-                      <wps:txbx>
-                        <w:txbxContent>
-                          <w:p>
-                            <w:pPr>
-                              <w:spacing w:line="276" w:lineRule="auto"/>
-                              <w:jc w:val="center"/>
-                              <w:rPr>
-                                <w:rFonts w:ascii="Arial" w:hAnsi="Arial" w:cs="Arial"/>
-                                <w:color w:val="000000"/>
-                                <w:kern w:val="24"/>
-                                <w:sz w:val="32"/>
-                                <w:szCs w:val="32"/>
-                              </w:rPr>
-                            </w:pPr>
-                            <w:r>
-                              <w:rPr>
-                                <w:rFonts w:ascii="Arial" w:hAnsi="Arial" w:cs="Arial"/>
-                                <w:color w:val="000000"/>
-                                <w:kern w:val="24"/>
-                                <w:sz w:val="32"/>
-                                <w:szCs w:val="32"/>
-                              </w:rPr>
-                              <w:t>Contract Number: NCR-NN-2026-25421-EN</w:t>
-                            </w:r>
-                          </w:p>
-                          <w:p>
-                            <w:pPr>
-                              <w:spacing w:line="276" w:lineRule="auto"/>
-                              <w:jc w:val="center"/>
-                              <w:rPr>
-                                <w:rFonts w:ascii="Arial" w:hAnsi="Arial" w:cs="Arial"/>
-                                <w:color w:val="000000"/>
-                                <w:kern w:val="24"/>
-                                <w:sz w:val="32"/>
-                                <w:szCs w:val="32"/>
-                              </w:rPr>
-                            </w:pPr>
-                            <w:r>
-                              <w:rPr>
-                                <w:rFonts w:ascii="Arial" w:hAnsi="Arial" w:cs="Arial"/>
-                                <w:color w:val="000000"/>
-                                <w:kern w:val="24"/>
-                                <w:sz w:val="32"/>
-                                <w:szCs w:val="32"/>
-                              </w:rPr>
-                              <w:t>June</w:t>
-                            </w:r>
-                            <w:r>
-                              <w:rPr>
-                                <w:rFonts w:ascii="Arial" w:hAnsi="Arial" w:cs="Arial"/>
-                                <w:color w:val="000000"/>
-                                <w:kern w:val="24"/>
-                                <w:sz w:val="32"/>
-                                <w:szCs w:val="32"/>
-                              </w:rPr>
-                              <w:t xml:space="preserve"> 2026 report</w:t>
-                            </w:r>
-                          </w:p>
-                        </w:txbxContent>
-                      </wps:txbx>
-                      <wps:bodyPr wrap="square" lIns="0" tIns="0" rIns="0" bIns="0" rtlCol="0" anchor="t">
-                        <a:spAutoFit/>
-                      </wps:bodyPr>
-                    </wps:wsp>
-                  </a:graphicData>
-                </a:graphic>
-                <wp14:sizeRelH relativeFrom="margin">
-                  <wp14:pctWidth>0</wp14:pctWidth>
-                </wp14:sizeRelH>
-              </wp:anchor>
-            </w:drawing>
-          </mc:Choice>
-          <mc:Fallback>
-            <w:pict>
-              <v:shapetype w14:anchorId="568792A5" id="_x0000_t202" coordsize="21600,21600" o:spt="202" path="m,l,21600r21600,l21600,xe">
-                <v:stroke joinstyle="miter"/>
-                <v:path gradientshapeok="t" o:connecttype="rect"/>
-              </v:shapetype>
-              <v:shape id="TextBox 14" o:spid="_x0000_s1029" type="#_x0000_t202" style="position:absolute;left:0;text-align:left;margin-left:-16.8pt;margin-top:252pt;width:500.4pt;height:39.75pt;z-index:251666432;visibility:visible;mso-wrap-style:square;mso-width-percent:0;mso-wrap-distance-left:9pt;mso-wrap-distance-top:0;mso-wrap-distance-right:9pt;mso-wrap-distance-bottom:0;mso-position-horizontal:absolute;mso-position-horizontal-relative:text;mso-position-vertical:absolute;mso-position-vertical-relative:text;mso-width-percent:0;mso-width-relative:margin;v-text-anchor:top" o:gfxdata="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" filled="f" stroked="f">
-                <v:textbox style="mso-fit-shape-to-text:t" inset="0,0,0,0">
-                  <w:txbxContent>
-                    <w:p>
-                      <w:pPr>
-                        <w:spacing w:line="276" w:lineRule="auto"/>
-                        <w:jc w:val="center"/>
-                        <w:rPr>
-                          <w:rFonts w:ascii="Arial" w:hAnsi="Arial" w:cs="Arial"/>
-                          <w:color w:val="000000"/>
-                          <w:kern w:val="24"/>
-                          <w:sz w:val="32"/>
-                          <w:szCs w:val="32"/>
-                        </w:rPr>
-                      </w:pPr>
-                      <w:r>
-                        <w:rPr>
-                          <w:rFonts w:ascii="Arial" w:hAnsi="Arial" w:cs="Arial"/>
-                          <w:color w:val="000000"/>
-                          <w:kern w:val="24"/>
-                          <w:sz w:val="32"/>
-                          <w:szCs w:val="32"/>
-                        </w:rPr>
-                        <w:t>Contract Number: NCR-NN-2026-25421-EN</w:t>
-                      </w:r>
-                    </w:p>
-                    <w:p>
-                      <w:pPr>
-                        <w:spacing w:line="276" w:lineRule="auto"/>
-                        <w:jc w:val="center"/>
-                        <w:rPr>
-                          <w:rFonts w:ascii="Arial" w:hAnsi="Arial" w:cs="Arial"/>
-                          <w:color w:val="000000"/>
-                          <w:kern w:val="24"/>
-                          <w:sz w:val="32"/>
-                          <w:szCs w:val="32"/>
-                        </w:rPr>
-                      </w:pPr>
-                      <w:r>
-                        <w:rPr>
-                          <w:rFonts w:ascii="Arial" w:hAnsi="Arial" w:cs="Arial"/>
-                          <w:color w:val="000000"/>
-                          <w:kern w:val="24"/>
-                          <w:sz w:val="32"/>
-                          <w:szCs w:val="32"/>
-                        </w:rPr>
-                        <w:t>June</w:t>
-                      </w:r>
-                      <w:r>
-                        <w:rPr>
-                          <w:rFonts w:ascii="Arial" w:hAnsi="Arial" w:cs="Arial"/>
-                          <w:color w:val="000000"/>
-                          <w:kern w:val="24"/>
-                          <w:sz w:val="32"/>
-                          <w:szCs w:val="32"/>
-                        </w:rPr>
-                        <w:t xml:space="preserve"> 2026 report</w:t>
-                      </w:r>
-                    </w:p>
-                  </w:txbxContent>
-                </v:textbox>
-              </v:shape>
-            </w:pict>
-          </mc:Fallback>
-        </mc:AlternateContent>
-      </w:r>
-      <w:r>
-        <w:rPr>
-          <w:rFonts w:ascii="Arial" w:hAnsi="Arial" w:cs="Arial"/>
-        </w:rPr>
-        <w:br w:type="page"/>
-      </w:r>
-      <w:r>
-        <w:rPr>
-          <w:rFonts w:ascii="Arial" w:hAnsi="Arial" w:cs="Arial"/>
+          <w:rFonts w:ascii="Arial" w:hAnsi="Arial"/>
           <w:b/>
-          <w:bCs/>
           <w:sz w:val="28"/>
-          <w:szCs w:val="28"/>
-        </w:rPr>
-        <w:lastRenderedPageBreak/>
-        <w:t>June</w:t>
-      </w:r>
-      <w:r>
-        <w:rPr>
-          <w:rFonts w:ascii="Arial" w:hAnsi="Arial" w:cs="Arial"/>
-          <w:b/>
-          <w:bCs/>
-          <w:sz w:val="28"/>
-          <w:szCs w:val="28"/>
-        </w:rPr>
-        <w:t xml:space="preserve"> monthly report</w:t>
+        </w:rPr>
+        <w:t>June monthly report</w:t>
       </w:r>
     </w:p>
     <w:p>
@@ -1049,27 +50,10 @@
       </w:pPr>
       <w:r>
         <w:rPr>
-          <w:rFonts w:ascii="Arial" w:hAnsi="Arial" w:cs="Arial"/>
+          <w:rFonts w:ascii="Arial" w:hAnsi="Arial"/>
           <w:b/>
-          <w:bCs/>
-        </w:rPr>
-        <w:t xml:space="preserve">To-do list </w:t>
-      </w:r>
-      <w:r>
-        <w:rPr>
-          <w:rFonts w:ascii="Arial" w:hAnsi="Arial" w:cs="Arial"/>
-          <w:b/>
-          <w:bCs/>
-        </w:rPr>
-        <w:t xml:space="preserve">in </w:t>
-      </w:r>
-      <w:r>
-        <w:rPr>
-          <w:rFonts w:ascii="Arial" w:hAnsi="Arial" w:cs="Arial"/>
-          <w:b/>
-          <w:bCs/>
-        </w:rPr>
-        <w:t>June</w:t>
+        </w:rPr>
+        <w:t>To-do list in June</w:t>
       </w:r>
     </w:p>
     <w:p>
@@ -1089,253 +73,113 @@
       </w:pPr>
       <w:r>
         <w:rPr>
-          <w:rFonts w:ascii="Arial" w:hAnsi="Arial" w:cs="Arial"/>
-          <w:color w:val="000000"/>
-          <w:lang w:val="en-TH" w:bidi="km-KH"/>
+          <w:rFonts w:ascii="Arial" w:hAnsi="Arial"/>
         </w:rPr>
         <w:t>100cm</w:t>
       </w:r>
       <w:r>
         <w:rPr>
-          <w:rFonts w:ascii="Arial" w:hAnsi="Arial" w:cs="Arial"/>
-          <w:color w:val="000000"/>
+          <w:rFonts w:ascii="Arial" w:hAnsi="Arial"/>
           <w:vertAlign w:val="superscript"/>
-          <w:lang w:val="en-TH" w:bidi="km-KH"/>
         </w:rPr>
         <w:t>2</w:t>
       </w:r>
       <w:r>
         <w:rPr>
-          <w:rFonts w:ascii="Arial" w:hAnsi="Arial" w:cs="Arial"/>
-          <w:color w:val="000000"/>
-          <w:lang w:val="en-TH" w:bidi="km-KH"/>
+          <w:rFonts w:ascii="Arial" w:hAnsi="Arial"/>
         </w:rPr>
         <w:t xml:space="preserve"> MEA electrolyzer – CO</w:t>
       </w:r>
       <w:r>
         <w:rPr>
-          <w:rFonts w:ascii="Arial" w:hAnsi="Arial" w:cs="Arial"/>
-          <w:color w:val="000000"/>
+          <w:rFonts w:ascii="Arial" w:hAnsi="Arial"/>
           <w:vertAlign w:val="subscript"/>
-          <w:lang w:val="en-TH" w:bidi="km-KH"/>
         </w:rPr>
         <w:t>2</w:t>
       </w:r>
       <w:r>
         <w:rPr>
-          <w:rFonts w:ascii="Arial" w:hAnsi="Arial" w:cs="Arial"/>
-          <w:color w:val="000000"/>
-          <w:lang w:val="en-TH" w:bidi="km-KH"/>
-        </w:rPr>
-        <w:t xml:space="preserve"> electrolysis of</w:t>
-      </w:r>
-      <w:r>
-        <w:rPr>
-          <w:rFonts w:ascii="Arial" w:hAnsi="Arial" w:cs="Arial"/>
-          <w:color w:val="000000"/>
-          <w:lang w:val="en-TH" w:bidi="km-KH"/>
-        </w:rPr>
-        <w:t xml:space="preserve"> AgNPs (50nm, ~0.6mg/cm</w:t>
-      </w:r>
-      <w:r>
-        <w:rPr>
-          <w:rFonts w:ascii="Arial" w:hAnsi="Arial" w:cs="Arial"/>
-          <w:color w:val="000000"/>
+          <w:rFonts w:ascii="Arial" w:hAnsi="Arial"/>
+        </w:rPr>
+        <w:t xml:space="preserve"> electrolysis of AgNPs (50nm, ~0.6mg/cm</w:t>
+      </w:r>
+      <w:r>
+        <w:rPr>
+          <w:rFonts w:ascii="Arial" w:hAnsi="Arial"/>
           <w:vertAlign w:val="superscript"/>
-          <w:lang w:val="en-TH" w:bidi="km-KH"/>
         </w:rPr>
         <w:t>2</w:t>
       </w:r>
       <w:r>
         <w:rPr>
-          <w:rFonts w:ascii="Arial" w:hAnsi="Arial" w:cs="Arial"/>
-          <w:color w:val="000000"/>
-          <w:lang w:val="en-TH" w:bidi="km-KH"/>
-        </w:rPr>
-        <w:t xml:space="preserve">) catalyst </w:t>
-      </w:r>
-      <w:r>
-        <w:rPr>
-          <w:rFonts w:ascii="Arial" w:hAnsi="Arial" w:cs="Arial"/>
-          <w:color w:val="000000"/>
-          <w:lang w:val="en-TH" w:bidi="km-KH"/>
-        </w:rPr>
-        <w:t xml:space="preserve">in </w:t>
-      </w:r>
-      <w:r>
-        <w:rPr>
-          <w:rFonts w:ascii="Arial" w:hAnsi="Arial" w:cs="Arial"/>
-          <w:color w:val="000000"/>
-          <w:lang w:val="en-TH" w:bidi="km-KH"/>
-        </w:rPr>
-        <w:t>AEM</w:t>
-      </w:r>
-      <w:r>
-        <w:rPr>
-          <w:rFonts w:ascii="Arial" w:hAnsi="Arial" w:cs="Arial"/>
-          <w:color w:val="000000"/>
-          <w:lang w:val="en-TH" w:bidi="km-KH"/>
-        </w:rPr>
-        <w:t xml:space="preserve"> system with 350µm/250µm silicone gaskets and </w:t>
-      </w:r>
-      <w:r>
-        <w:rPr>
-          <w:rFonts w:ascii="Arial" w:hAnsi="Arial" w:cs="Arial"/>
-          <w:color w:val="000000"/>
-          <w:lang w:val="en-TH" w:bidi="km-KH"/>
-        </w:rPr>
-        <w:t>8</w:t>
-      </w:r>
-      <w:r>
-        <w:rPr>
-          <w:rFonts w:ascii="Arial" w:hAnsi="Arial" w:cs="Arial"/>
-          <w:color w:val="000000"/>
-          <w:lang w:val="en-TH" w:bidi="km-KH"/>
-        </w:rPr>
-        <w:t xml:space="preserve"> ft.lbs under </w:t>
-      </w:r>
-      <w:r>
-        <w:rPr>
-          <w:rFonts w:ascii="Arial" w:hAnsi="Arial" w:cs="Arial"/>
-          <w:color w:val="000000"/>
-          <w:lang w:val="en-TH" w:bidi="km-KH"/>
-        </w:rPr>
-        <w:t>50mM CH</w:t>
-      </w:r>
-      <w:r>
-        <w:rPr>
-          <w:rFonts w:ascii="Arial" w:hAnsi="Arial" w:cs="Arial"/>
-          <w:color w:val="000000"/>
+          <w:rFonts w:ascii="Arial" w:hAnsi="Arial"/>
+        </w:rPr>
+        <w:t>) catalyst in AEM system with 350µm/250µm silicone gaskets and 8 ft.lbs under 50mM CH</w:t>
+      </w:r>
+      <w:r>
+        <w:rPr>
+          <w:rFonts w:ascii="Arial" w:hAnsi="Arial"/>
           <w:vertAlign w:val="subscript"/>
-          <w:lang w:val="en-TH" w:bidi="km-KH"/>
         </w:rPr>
         <w:t>3</w:t>
       </w:r>
       <w:r>
         <w:rPr>
-          <w:rFonts w:ascii="Arial" w:hAnsi="Arial" w:cs="Arial"/>
-          <w:color w:val="000000"/>
-          <w:lang w:val="en-TH" w:bidi="km-KH"/>
-        </w:rPr>
-        <w:t>COOH humidified</w:t>
-      </w:r>
-      <w:r>
-        <w:rPr>
-          <w:rFonts w:ascii="Arial" w:hAnsi="Arial" w:cs="Arial"/>
-          <w:color w:val="000000"/>
-          <w:lang w:val="en-TH" w:bidi="km-KH"/>
-        </w:rPr>
-        <w:t xml:space="preserve"> </w:t>
-      </w:r>
-      <w:r>
-        <w:rPr>
-          <w:rFonts w:ascii="Arial" w:hAnsi="Arial" w:cs="Arial"/>
+          <w:rFonts w:ascii="Arial" w:hAnsi="Arial"/>
+        </w:rPr>
+        <w:t xml:space="preserve">COOH humidified </w:t>
+      </w:r>
+      <w:r>
+        <w:rPr>
+          <w:rFonts w:ascii="Arial" w:hAnsi="Arial"/>
           <w:b/>
-          <w:bCs/>
-          <w:color w:val="000000"/>
-          <w:lang w:val="en-TH" w:bidi="km-KH"/>
         </w:rPr>
         <w:t>800ml/min CO</w:t>
       </w:r>
       <w:r>
         <w:rPr>
-          <w:rFonts w:ascii="Arial" w:hAnsi="Arial" w:cs="Arial"/>
+          <w:rFonts w:ascii="Arial" w:hAnsi="Arial"/>
           <w:b/>
-          <w:bCs/>
-          <w:color w:val="000000"/>
           <w:vertAlign w:val="subscript"/>
-          <w:lang w:val="en-TH" w:bidi="km-KH"/>
         </w:rPr>
         <w:t>2</w:t>
       </w:r>
       <w:r>
         <w:rPr>
-          <w:rFonts w:ascii="Arial" w:hAnsi="Arial" w:cs="Arial"/>
-          <w:color w:val="000000"/>
-          <w:lang w:val="en-TH" w:bidi="km-KH"/>
-        </w:rPr>
-        <w:t xml:space="preserve">, </w:t>
-      </w:r>
-      <w:r>
-        <w:rPr>
-          <w:rFonts w:ascii="Arial" w:hAnsi="Arial" w:cs="Arial"/>
-          <w:color w:val="000000"/>
-          <w:lang w:val="en-TH" w:bidi="km-KH"/>
-        </w:rPr>
-        <w:t xml:space="preserve">100 </w:t>
-      </w:r>
-      <w:r>
-        <w:rPr>
-          <w:rFonts w:ascii="Arial" w:hAnsi="Arial" w:cs="Arial"/>
-          <w:color w:val="000000"/>
-          <w:lang w:val="en-TH" w:bidi="km-KH"/>
-        </w:rPr>
-        <w:t>ml/min of 0.</w:t>
-      </w:r>
-      <w:r>
-        <w:rPr>
-          <w:rFonts w:ascii="Arial" w:hAnsi="Arial" w:cs="Arial"/>
-          <w:color w:val="000000"/>
-          <w:lang w:val="en-TH" w:bidi="km-KH"/>
-        </w:rPr>
-        <w:t>1</w:t>
-      </w:r>
-      <w:r>
-        <w:rPr>
-          <w:rFonts w:ascii="Arial" w:hAnsi="Arial" w:cs="Arial"/>
-          <w:color w:val="000000"/>
-          <w:lang w:val="en-TH" w:bidi="km-KH"/>
-        </w:rPr>
-        <w:t>M K</w:t>
-      </w:r>
-      <w:r>
-        <w:rPr>
-          <w:rFonts w:ascii="Arial" w:hAnsi="Arial" w:cs="Arial"/>
-          <w:color w:val="000000"/>
-          <w:lang w:val="en-TH" w:bidi="km-KH"/>
-        </w:rPr>
-        <w:t>HCO</w:t>
-      </w:r>
-      <w:r>
-        <w:rPr>
-          <w:rFonts w:ascii="Arial" w:hAnsi="Arial" w:cs="Arial"/>
-          <w:color w:val="000000"/>
+          <w:rFonts w:ascii="Arial" w:hAnsi="Arial"/>
+        </w:rPr>
+        <w:t>, 100 ml/min of 0.1M KHCO</w:t>
+      </w:r>
+      <w:r>
+        <w:rPr>
+          <w:rFonts w:ascii="Arial" w:hAnsi="Arial"/>
           <w:vertAlign w:val="subscript"/>
-          <w:lang w:val="en-TH" w:bidi="km-KH"/>
         </w:rPr>
         <w:t>3</w:t>
       </w:r>
       <w:r>
         <w:rPr>
-          <w:rFonts w:ascii="Arial" w:hAnsi="Arial" w:cs="Arial"/>
-          <w:color w:val="000000"/>
-          <w:lang w:val="en-TH" w:bidi="km-KH"/>
+          <w:rFonts w:ascii="Arial" w:hAnsi="Arial"/>
         </w:rPr>
         <w:t>, and IrO</w:t>
       </w:r>
       <w:r>
         <w:rPr>
-          <w:rFonts w:ascii="Arial" w:hAnsi="Arial" w:cs="Arial"/>
-          <w:color w:val="000000"/>
+          <w:rFonts w:ascii="Arial" w:hAnsi="Arial"/>
           <w:vertAlign w:val="subscript"/>
-          <w:lang w:val="en-TH" w:bidi="km-KH"/>
         </w:rPr>
         <w:t>2</w:t>
       </w:r>
       <w:r>
         <w:rPr>
-          <w:rFonts w:ascii="Arial" w:hAnsi="Arial" w:cs="Arial"/>
-          <w:color w:val="000000"/>
-          <w:lang w:val="en-TH" w:bidi="km-KH"/>
+          <w:rFonts w:ascii="Arial" w:hAnsi="Arial"/>
         </w:rPr>
         <w:t>-TiPt anode at 100mA/cm</w:t>
       </w:r>
       <w:r>
         <w:rPr>
-          <w:rFonts w:ascii="Arial" w:hAnsi="Arial" w:cs="Arial"/>
-          <w:color w:val="000000"/>
+          <w:rFonts w:ascii="Arial" w:hAnsi="Arial"/>
           <w:vertAlign w:val="superscript"/>
-          <w:lang w:val="en-TH" w:bidi="km-KH"/>
         </w:rPr>
         <w:t>2</w:t>
       </w:r>
@@ -1357,307 +201,122 @@
       </w:pPr>
       <w:r>
         <w:rPr>
-          <w:rFonts w:ascii="Arial" w:hAnsi="Arial" w:cs="Arial"/>
+          <w:rFonts w:ascii="Arial" w:hAnsi="Arial"/>
           <w:b/>
-          <w:bCs/>
-          <w:color w:val="000000"/>
-          <w:lang w:val="en-TH" w:bidi="km-KH"/>
         </w:rPr>
         <w:t>100cm</w:t>
       </w:r>
       <w:r>
         <w:rPr>
-          <w:rFonts w:ascii="Arial" w:hAnsi="Arial" w:cs="Arial"/>
+          <w:rFonts w:ascii="Arial" w:hAnsi="Arial"/>
           <w:b/>
-          <w:bCs/>
-          <w:color w:val="000000"/>
           <w:vertAlign w:val="superscript"/>
-          <w:lang w:val="en-TH" w:bidi="km-KH"/>
         </w:rPr>
         <w:t>2</w:t>
       </w:r>
       <w:r>
         <w:rPr>
-          <w:rFonts w:ascii="Arial" w:hAnsi="Arial" w:cs="Arial"/>
+          <w:rFonts w:ascii="Arial" w:hAnsi="Arial"/>
           <w:b/>
-          <w:bCs/>
-          <w:color w:val="000000"/>
-          <w:lang w:val="en-TH" w:bidi="km-KH"/>
-        </w:rPr>
-        <w:t xml:space="preserve"> MEA electrolyzer operation in </w:t>
-      </w:r>
-      <w:r>
-        <w:rPr>
-          <w:rFonts w:ascii="Arial" w:hAnsi="Arial" w:cs="Arial"/>
+        </w:rPr>
+        <w:t xml:space="preserve"> MEA electrolyzer operation in 30 position</w:t>
+      </w:r>
+      <w:r>
+        <w:rPr>
+          <w:rFonts w:ascii="Arial" w:hAnsi="Arial"/>
+        </w:rPr>
+        <w:t xml:space="preserve"> – CO</w:t>
+      </w:r>
+      <w:r>
+        <w:rPr>
+          <w:rFonts w:ascii="Arial" w:hAnsi="Arial"/>
+          <w:vertAlign w:val="subscript"/>
+        </w:rPr>
+        <w:t>2</w:t>
+      </w:r>
+      <w:r>
+        <w:rPr>
+          <w:rFonts w:ascii="Arial" w:hAnsi="Arial"/>
+        </w:rPr>
+        <w:t xml:space="preserve"> electrolysis of AgNPs (50nm, ~0.6mg/cm</w:t>
+      </w:r>
+      <w:r>
+        <w:rPr>
+          <w:rFonts w:ascii="Arial" w:hAnsi="Arial"/>
+          <w:vertAlign w:val="superscript"/>
+        </w:rPr>
+        <w:t>2</w:t>
+      </w:r>
+      <w:r>
+        <w:rPr>
+          <w:rFonts w:ascii="Arial" w:hAnsi="Arial"/>
+        </w:rPr>
+        <w:t>) catalyst in AEM system with 350µm/250µm silicone gaskets and 8 ft.lbs under 50mM CH</w:t>
+      </w:r>
+      <w:r>
+        <w:rPr>
+          <w:rFonts w:ascii="Arial" w:hAnsi="Arial"/>
+          <w:vertAlign w:val="subscript"/>
+        </w:rPr>
+        <w:t>3</w:t>
+      </w:r>
+      <w:r>
+        <w:rPr>
+          <w:rFonts w:ascii="Arial" w:hAnsi="Arial"/>
+        </w:rPr>
+        <w:t xml:space="preserve">COOH humidified </w:t>
+      </w:r>
+      <w:r>
+        <w:rPr>
+          <w:rFonts w:ascii="Arial" w:hAnsi="Arial"/>
           <w:b/>
-          <w:bCs/>
-          <w:color w:val="000000"/>
-          <w:lang w:val="en-TH" w:bidi="km-KH"/>
-        </w:rPr>
-        <w:t>30</w:t>
-      </w:r>
-      <w:r>
-        <w:rPr>
-          <w:rFonts w:ascii="Arial" w:hAnsi="Arial" w:cs="Arial"/>
+        </w:rPr>
+        <w:t>400ml/min CO</w:t>
+      </w:r>
+      <w:r>
+        <w:rPr>
+          <w:rFonts w:ascii="Arial" w:hAnsi="Arial"/>
           <w:b/>
-          <w:bCs/>
-          <w:color w:val="000000"/>
-          <w:lang w:val="en-TH" w:bidi="km-KH"/>
-        </w:rPr>
-        <w:sym w:font="Symbol" w:char="F0B0"/>
-      </w:r>
-      <w:r>
-        <w:rPr>
-          <w:rFonts w:ascii="Arial" w:hAnsi="Arial" w:cs="Arial"/>
-          <w:b/>
-          <w:bCs/>
-          <w:color w:val="000000"/>
-          <w:lang w:val="en-TH" w:bidi="km-KH"/>
-        </w:rPr>
-        <w:t xml:space="preserve"> position</w:t>
-      </w:r>
-      <w:r>
-        <w:rPr>
-          <w:rFonts w:ascii="Arial" w:hAnsi="Arial" w:cs="Arial"/>
-          <w:color w:val="000000"/>
-          <w:lang w:val="en-TH" w:bidi="km-KH"/>
-        </w:rPr>
-        <w:t xml:space="preserve"> – CO</w:t>
-      </w:r>
-      <w:r>
-        <w:rPr>
-          <w:rFonts w:ascii="Arial" w:hAnsi="Arial" w:cs="Arial"/>
-          <w:color w:val="000000"/>
           <w:vertAlign w:val="subscript"/>
-          <w:lang w:val="en-TH" w:bidi="km-KH"/>
         </w:rPr>
         <w:t>2</w:t>
       </w:r>
       <w:r>
         <w:rPr>
-          <w:rFonts w:ascii="Arial" w:hAnsi="Arial" w:cs="Arial"/>
-          <w:color w:val="000000"/>
-          <w:lang w:val="en-TH" w:bidi="km-KH"/>
-        </w:rPr>
-        <w:t xml:space="preserve"> electrolysis of</w:t>
-      </w:r>
-      <w:r>
-        <w:rPr>
-          <w:rFonts w:ascii="Arial" w:hAnsi="Arial" w:cs="Arial"/>
-          <w:color w:val="000000"/>
-          <w:lang w:val="en-TH" w:bidi="km-KH"/>
-        </w:rPr>
-        <w:t xml:space="preserve"> AgNPs (50nm, ~0.6mg/cm</w:t>
-      </w:r>
-      <w:r>
-        <w:rPr>
-          <w:rFonts w:ascii="Arial" w:hAnsi="Arial" w:cs="Arial"/>
-          <w:color w:val="000000"/>
+          <w:rFonts w:ascii="Arial" w:hAnsi="Arial"/>
+        </w:rPr>
+        <w:t>, 100 ml/min of 0.1M KHCO</w:t>
+      </w:r>
+      <w:r>
+        <w:rPr>
+          <w:rFonts w:ascii="Arial" w:hAnsi="Arial"/>
+          <w:vertAlign w:val="subscript"/>
+        </w:rPr>
+        <w:t>3</w:t>
+      </w:r>
+      <w:r>
+        <w:rPr>
+          <w:rFonts w:ascii="Arial" w:hAnsi="Arial"/>
+        </w:rPr>
+        <w:t>, and IrO</w:t>
+      </w:r>
+      <w:r>
+        <w:rPr>
+          <w:rFonts w:ascii="Arial" w:hAnsi="Arial"/>
+          <w:vertAlign w:val="subscript"/>
+        </w:rPr>
+        <w:t>2</w:t>
+      </w:r>
+      <w:r>
+        <w:rPr>
+          <w:rFonts w:ascii="Arial" w:hAnsi="Arial"/>
+        </w:rPr>
+        <w:t>-TiPt anode at 100mA/cm</w:t>
+      </w:r>
+      <w:r>
+        <w:rPr>
+          <w:rFonts w:ascii="Arial" w:hAnsi="Arial"/>
           <w:vertAlign w:val="superscript"/>
-          <w:lang w:val="en-TH" w:bidi="km-KH"/>
-        </w:rPr>
-        <w:t>2</w:t>
-      </w:r>
-      <w:r>
-        <w:rPr>
-          <w:rFonts w:ascii="Arial" w:hAnsi="Arial" w:cs="Arial"/>
-          <w:color w:val="000000"/>
-          <w:lang w:val="en-TH" w:bidi="km-KH"/>
-        </w:rPr>
-        <w:t xml:space="preserve">) catalyst </w:t>
-      </w:r>
-      <w:r>
-        <w:rPr>
-          <w:rFonts w:ascii="Arial" w:hAnsi="Arial" w:cs="Arial"/>
-          <w:color w:val="000000"/>
-          <w:lang w:val="en-TH" w:bidi="km-KH"/>
-        </w:rPr>
-        <w:t xml:space="preserve">in </w:t>
-      </w:r>
-      <w:r>
-        <w:rPr>
-          <w:rFonts w:ascii="Arial" w:hAnsi="Arial" w:cs="Arial"/>
-          <w:color w:val="000000"/>
-          <w:lang w:val="en-TH" w:bidi="km-KH"/>
-        </w:rPr>
-        <w:t>AEM</w:t>
-      </w:r>
-      <w:r>
-        <w:rPr>
-          <w:rFonts w:ascii="Arial" w:hAnsi="Arial" w:cs="Arial"/>
-          <w:color w:val="000000"/>
-          <w:lang w:val="en-TH" w:bidi="km-KH"/>
-        </w:rPr>
-        <w:t xml:space="preserve"> system with 350µm/250µm silicone gaskets and </w:t>
-      </w:r>
-      <w:r>
-        <w:rPr>
-          <w:rFonts w:ascii="Arial" w:hAnsi="Arial" w:cs="Arial"/>
-          <w:color w:val="000000"/>
-          <w:lang w:val="en-TH" w:bidi="km-KH"/>
-        </w:rPr>
-        <w:t>8</w:t>
-      </w:r>
-      <w:r>
-        <w:rPr>
-          <w:rFonts w:ascii="Arial" w:hAnsi="Arial" w:cs="Arial"/>
-          <w:color w:val="000000"/>
-          <w:lang w:val="en-TH" w:bidi="km-KH"/>
-        </w:rPr>
-        <w:t xml:space="preserve"> ft.lbs under </w:t>
-      </w:r>
-      <w:r>
-        <w:rPr>
-          <w:rFonts w:ascii="Arial" w:hAnsi="Arial" w:cs="Arial"/>
-          <w:color w:val="000000"/>
-          <w:lang w:val="en-TH" w:bidi="km-KH"/>
-        </w:rPr>
-        <w:t>50mM CH</w:t>
-      </w:r>
-      <w:r>
-        <w:rPr>
-          <w:rFonts w:ascii="Arial" w:hAnsi="Arial" w:cs="Arial"/>
-          <w:color w:val="000000"/>
-          <w:vertAlign w:val="subscript"/>
-          <w:lang w:val="en-TH" w:bidi="km-KH"/>
-        </w:rPr>
-        <w:t>3</w:t>
-      </w:r>
-      <w:r>
-        <w:rPr>
-          <w:rFonts w:ascii="Arial" w:hAnsi="Arial" w:cs="Arial"/>
-          <w:color w:val="000000"/>
-          <w:lang w:val="en-TH" w:bidi="km-KH"/>
-        </w:rPr>
-        <w:t>COOH humidified</w:t>
-      </w:r>
-      <w:r>
-        <w:rPr>
-          <w:rFonts w:ascii="Arial" w:hAnsi="Arial" w:cs="Arial"/>
-          <w:color w:val="000000"/>
-          <w:lang w:val="en-TH" w:bidi="km-KH"/>
-        </w:rPr>
-        <w:t xml:space="preserve"> </w:t>
-      </w:r>
-      <w:r>
-        <w:rPr>
-          <w:rFonts w:ascii="Arial" w:hAnsi="Arial" w:cs="Arial"/>
-          <w:b/>
-          <w:bCs/>
-          <w:color w:val="000000"/>
-          <w:lang w:val="en-TH" w:bidi="km-KH"/>
-        </w:rPr>
-        <w:t>4</w:t>
-      </w:r>
-      <w:r>
-        <w:rPr>
-          <w:rFonts w:ascii="Arial" w:hAnsi="Arial" w:cs="Arial"/>
-          <w:b/>
-          <w:bCs/>
-          <w:color w:val="000000"/>
-          <w:lang w:val="en-TH" w:bidi="km-KH"/>
-        </w:rPr>
-        <w:t>00ml/min CO</w:t>
-      </w:r>
-      <w:r>
-        <w:rPr>
-          <w:rFonts w:ascii="Arial" w:hAnsi="Arial" w:cs="Arial"/>
-          <w:b/>
-          <w:bCs/>
-          <w:color w:val="000000"/>
-          <w:vertAlign w:val="subscript"/>
-          <w:lang w:val="en-TH" w:bidi="km-KH"/>
-        </w:rPr>
-        <w:t>2</w:t>
-      </w:r>
-      <w:r>
-        <w:rPr>
-          <w:rFonts w:ascii="Arial" w:hAnsi="Arial" w:cs="Arial"/>
-          <w:color w:val="000000"/>
-          <w:lang w:val="en-TH" w:bidi="km-KH"/>
-        </w:rPr>
-        <w:t xml:space="preserve">, </w:t>
-      </w:r>
-      <w:r>
-        <w:rPr>
-          <w:rFonts w:ascii="Arial" w:hAnsi="Arial" w:cs="Arial"/>
-          <w:color w:val="000000"/>
-          <w:lang w:val="en-TH" w:bidi="km-KH"/>
-        </w:rPr>
-        <w:t xml:space="preserve">100 </w:t>
-      </w:r>
-      <w:r>
-        <w:rPr>
-          <w:rFonts w:ascii="Arial" w:hAnsi="Arial" w:cs="Arial"/>
-          <w:color w:val="000000"/>
-          <w:lang w:val="en-TH" w:bidi="km-KH"/>
-        </w:rPr>
-        <w:t>ml/min of 0.</w:t>
-      </w:r>
-      <w:r>
-        <w:rPr>
-          <w:rFonts w:ascii="Arial" w:hAnsi="Arial" w:cs="Arial"/>
-          <w:color w:val="000000"/>
-          <w:lang w:val="en-TH" w:bidi="km-KH"/>
-        </w:rPr>
-        <w:t>1</w:t>
-      </w:r>
-      <w:r>
-        <w:rPr>
-          <w:rFonts w:ascii="Arial" w:hAnsi="Arial" w:cs="Arial"/>
-          <w:color w:val="000000"/>
-          <w:lang w:val="en-TH" w:bidi="km-KH"/>
-        </w:rPr>
-        <w:t>M K</w:t>
-      </w:r>
-      <w:r>
-        <w:rPr>
-          <w:rFonts w:ascii="Arial" w:hAnsi="Arial" w:cs="Arial"/>
-          <w:color w:val="000000"/>
-          <w:lang w:val="en-TH" w:bidi="km-KH"/>
-        </w:rPr>
-        <w:t>HCO</w:t>
-      </w:r>
-      <w:r>
-        <w:rPr>
-          <w:rFonts w:ascii="Arial" w:hAnsi="Arial" w:cs="Arial"/>
-          <w:color w:val="000000"/>
-          <w:vertAlign w:val="subscript"/>
-          <w:lang w:val="en-TH" w:bidi="km-KH"/>
-        </w:rPr>
-        <w:t>3</w:t>
-      </w:r>
-      <w:r>
-        <w:rPr>
-          <w:rFonts w:ascii="Arial" w:hAnsi="Arial" w:cs="Arial"/>
-          <w:color w:val="000000"/>
-          <w:lang w:val="en-TH" w:bidi="km-KH"/>
-        </w:rPr>
-        <w:t>, and IrO</w:t>
-      </w:r>
-      <w:r>
-        <w:rPr>
-          <w:rFonts w:ascii="Arial" w:hAnsi="Arial" w:cs="Arial"/>
-          <w:color w:val="000000"/>
-          <w:vertAlign w:val="subscript"/>
-          <w:lang w:val="en-TH" w:bidi="km-KH"/>
-        </w:rPr>
-        <w:t>2</w:t>
-      </w:r>
-      <w:r>
-        <w:rPr>
-          <w:rFonts w:ascii="Arial" w:hAnsi="Arial" w:cs="Arial"/>
-          <w:color w:val="000000"/>
-          <w:lang w:val="en-TH" w:bidi="km-KH"/>
-        </w:rPr>
-        <w:t>-TiPt anode at 100mA/cm</w:t>
-      </w:r>
-      <w:r>
-        <w:rPr>
-          <w:rFonts w:ascii="Arial" w:hAnsi="Arial" w:cs="Arial"/>
-          <w:color w:val="000000"/>
-          <w:vertAlign w:val="superscript"/>
-          <w:lang w:val="en-TH" w:bidi="km-KH"/>
         </w:rPr>
         <w:t>2</w:t>
       </w:r>
@@ -1678,35 +337,10 @@
       </w:pPr>
       <w:r>
         <w:rPr>
-          <w:rFonts w:ascii="Arial" w:hAnsi="Arial" w:cs="Arial"/>
+          <w:rFonts w:ascii="Arial" w:hAnsi="Arial"/>
           <w:b/>
-          <w:bCs/>
-        </w:rPr>
-        <w:t>Experimental</w:t>
-      </w:r>
-      <w:r>
-        <w:rPr>
-          <w:rFonts w:ascii="Arial" w:hAnsi="Arial" w:cs="Arial"/>
-          <w:b/>
-          <w:bCs/>
-        </w:rPr>
-        <w:t xml:space="preserve"> </w:t>
-      </w:r>
-      <w:r>
-        <w:rPr>
-          <w:rFonts w:ascii="Arial" w:hAnsi="Arial" w:cs="Arial"/>
-          <w:b/>
-          <w:bCs/>
-        </w:rPr>
-        <w:t>P</w:t>
-      </w:r>
-      <w:r>
-        <w:rPr>
-          <w:rFonts w:ascii="Arial" w:hAnsi="Arial" w:cs="Arial"/>
-          <w:b/>
-          <w:bCs/>
-        </w:rPr>
-        <w:t>rocedure</w:t>
+        </w:rPr>
+        <w:t>Experimental Procedure</w:t>
       </w:r>
     </w:p>
     <w:p>
@@ -1722,33 +356,11 @@
       </w:pPr>
       <w:r>
         <w:rPr>
-          <w:rFonts w:ascii="Arial" w:hAnsi="Arial" w:cs="Browallia New"/>
+          <w:rFonts w:ascii="Arial" w:hAnsi="Arial"/>
           <w:b/>
-          <w:bCs/>
-          <w:sz w:val="22"/>
-          <w:szCs w:val="28"/>
-        </w:rPr>
-        <w:t xml:space="preserve">Synthesis of </w:t>
-      </w:r>
-      <w:r>
-        <w:rPr>
-          <w:rFonts w:ascii="Arial" w:hAnsi="Arial" w:cs="Browallia New"/>
-          <w:b/>
-          <w:bCs/>
-          <w:sz w:val="22"/>
-          <w:szCs w:val="28"/>
-        </w:rPr>
-        <w:t>0.5</w:t>
-      </w:r>
-      <w:r>
-        <w:rPr>
-          <w:rFonts w:ascii="Arial" w:hAnsi="Arial" w:cs="Browallia New"/>
-          <w:b/>
-          <w:bCs/>
-          <w:sz w:val="22"/>
-          <w:szCs w:val="28"/>
-        </w:rPr>
-        <w:t>NiSAC by pyrolysis method</w:t>
+          <w:sz w:val="22"/>
+        </w:rPr>
+        <w:t>Synthesis of 0.5NiSAC by pyrolysis method</w:t>
       </w:r>
     </w:p>
     <w:p>
@@ -1772,226 +384,22 @@
           <w:rFonts w:ascii="Arial" w:hAnsi="Arial"/>
           <w:sz w:val="22"/>
         </w:rPr>
-        <w:t xml:space="preserve">The synthesis of </w:t>
-      </w:r>
-      <w:r>
-        <w:rPr>
-          <w:rFonts w:ascii="Arial" w:hAnsi="Arial"/>
-          <w:sz w:val="22"/>
-        </w:rPr>
-        <w:t>0.5</w:t>
-      </w:r>
-      <w:r>
-        <w:rPr>
-          <w:rFonts w:ascii="Arial" w:hAnsi="Arial"/>
-          <w:sz w:val="22"/>
-        </w:rPr>
-        <w:t>Ni</w:t>
-      </w:r>
-      <w:r>
-        <w:rPr>
-          <w:rFonts w:ascii="Arial" w:hAnsi="Arial"/>
-          <w:sz w:val="22"/>
-        </w:rPr>
-        <w:t>SAC catalyst was</w:t>
-      </w:r>
-      <w:r>
-        <w:rPr>
-          <w:rFonts w:ascii="Arial" w:hAnsi="Arial"/>
-          <w:sz w:val="22"/>
-        </w:rPr>
-        <w:t xml:space="preserve"> followed </w:t>
-      </w:r>
-      <w:r>
-        <w:rPr>
-          <w:rFonts w:ascii="Arial" w:hAnsi="Arial"/>
-          <w:sz w:val="22"/>
-        </w:rPr>
-        <w:t>by our previous work</w:t>
-      </w:r>
-      <w:r>
-        <w:rPr>
-          <w:rFonts w:ascii="Arial" w:hAnsi="Arial"/>
-          <w:sz w:val="22"/>
-        </w:rPr>
-        <w:t>. Initially, nickel phthalocyanine (</w:t>
-      </w:r>
-      <w:r>
-        <w:rPr>
-          <w:rFonts w:ascii="Arial" w:hAnsi="Arial"/>
-          <w:sz w:val="22"/>
-        </w:rPr>
-        <w:t>NiPc</w:t>
-      </w:r>
-      <w:r>
-        <w:rPr>
-          <w:rFonts w:ascii="Arial" w:hAnsi="Arial"/>
-          <w:sz w:val="22"/>
-        </w:rPr>
-        <w:t xml:space="preserve">), urea, and dicyanamide precursors were stoichiometrically weighed according to mass ratios of </w:t>
-      </w:r>
-      <w:r>
-        <w:rPr>
-          <w:rFonts w:ascii="Arial" w:hAnsi="Arial"/>
-          <w:sz w:val="22"/>
-        </w:rPr>
-        <w:t>0.5</w:t>
-      </w:r>
-      <w:r>
-        <w:rPr>
-          <w:rFonts w:ascii="Arial" w:hAnsi="Arial"/>
-          <w:sz w:val="22"/>
-        </w:rPr>
-        <w:t>:5:5</w:t>
-      </w:r>
-      <w:r>
-        <w:rPr>
-          <w:rFonts w:ascii="Arial" w:hAnsi="Arial"/>
-          <w:sz w:val="22"/>
-        </w:rPr>
-        <w:t xml:space="preserve">. </w:t>
-      </w:r>
-      <w:r>
-        <w:rPr>
-          <w:rFonts w:ascii="Arial" w:hAnsi="Arial"/>
-          <w:sz w:val="22"/>
-        </w:rPr>
-        <w:t xml:space="preserve">Subsequently, the mixture was thoroughly </w:t>
-      </w:r>
-      <w:r>
-        <w:rPr>
-          <w:rFonts w:ascii="Arial" w:hAnsi="Arial"/>
-          <w:sz w:val="22"/>
-        </w:rPr>
-        <w:t xml:space="preserve">mixed and ground </w:t>
-      </w:r>
-      <w:r>
-        <w:rPr>
-          <w:rFonts w:ascii="Arial" w:hAnsi="Arial"/>
-          <w:sz w:val="22"/>
-        </w:rPr>
-        <w:t xml:space="preserve">until a </w:t>
-      </w:r>
-      <w:r>
-        <w:rPr>
-          <w:rFonts w:ascii="Arial" w:hAnsi="Arial"/>
-          <w:sz w:val="22"/>
-        </w:rPr>
-        <w:t>homogeneous</w:t>
-      </w:r>
-      <w:r>
-        <w:rPr>
-          <w:rFonts w:ascii="Arial" w:hAnsi="Arial"/>
-          <w:sz w:val="22"/>
-        </w:rPr>
-        <w:t xml:space="preserve"> midnight blue powder was obtained. The </w:t>
-      </w:r>
-      <w:r>
-        <w:rPr>
-          <w:rFonts w:ascii="Arial" w:hAnsi="Arial"/>
-          <w:sz w:val="22"/>
-        </w:rPr>
-        <w:t>fine</w:t>
-      </w:r>
-      <w:r>
-        <w:rPr>
-          <w:rFonts w:ascii="Arial" w:hAnsi="Arial"/>
-          <w:sz w:val="22"/>
-        </w:rPr>
-        <w:t xml:space="preserve"> powder was then transferred into a quartz boat covered with a capsule lid and subjected to polymerization at 800</w:t>
-      </w:r>
-      <w:r>
-        <w:rPr>
-          <w:rFonts w:ascii="Arial" w:hAnsi="Arial"/>
-          <w:sz w:val="22"/>
-        </w:rPr>
-        <w:t xml:space="preserve"> - 900</w:t>
-      </w:r>
-      <w:r>
-        <w:rPr>
-          <w:rFonts w:ascii="Arial" w:hAnsi="Arial"/>
-          <w:sz w:val="22"/>
-        </w:rPr>
-        <w:t xml:space="preserve"> °C (</w:t>
-      </w:r>
-      <w:r>
-        <w:rPr>
-          <w:rFonts w:ascii="Arial" w:hAnsi="Arial"/>
-          <w:sz w:val="22"/>
-        </w:rPr>
-        <w:t>ramp</w:t>
-      </w:r>
-      <w:r>
-        <w:rPr>
-          <w:rFonts w:ascii="Arial" w:hAnsi="Arial"/>
-          <w:sz w:val="22"/>
-        </w:rPr>
-        <w:t xml:space="preserve"> rate = 10 °C·min</w:t>
-      </w:r>
-      <w:r>
-        <w:rPr>
-          <w:rFonts w:ascii="Cambria Math" w:hAnsi="Cambria Math"/>
+        <w:t>The synthesis of 0.5NiSAC catalyst was followed by our previous work. Initially, nickel phthalocyanine (NiPc), urea, and dicyanamide precursors were stoichiometrically weighed according to mass ratios of 0.5:5:5. Subsequently, the mixture was thoroughly mixed and ground until a homogeneous midnight blue powder was obtained. The fine powder was then transferred into a quartz boat covered with a capsule lid and subjected to polymerization at 800 - 900 °C (ramp rate = 10 °C·min</w:t>
+      </w:r>
+      <w:r>
+        <w:rPr>
+          <w:rFonts w:ascii="Arial" w:hAnsi="Arial"/>
           <w:sz w:val="22"/>
           <w:vertAlign w:val="superscript"/>
         </w:rPr>
-        <w:t>-</w:t>
-      </w:r>
-      <w:r>
-        <w:rPr>
-          <w:rFonts w:ascii="Arial" w:hAnsi="Arial"/>
-          <w:sz w:val="22"/>
-          <w:vertAlign w:val="superscript"/>
-        </w:rPr>
-        <w:t>1</w:t>
-      </w:r>
-      <w:r>
-        <w:rPr>
-          <w:rFonts w:ascii="Arial" w:hAnsi="Arial"/>
-          <w:sz w:val="22"/>
-        </w:rPr>
-        <w:t xml:space="preserve">) in a horizontal tube furnace under an argon atmosphere (flow rate </w:t>
-      </w:r>
-      <w:r>
-        <w:rPr>
-          <w:rFonts w:ascii="Arial" w:hAnsi="Arial"/>
-          <w:sz w:val="22"/>
-        </w:rPr>
-        <w:t xml:space="preserve">&gt; </w:t>
-      </w:r>
-      <w:r>
-        <w:rPr>
-          <w:rFonts w:ascii="Arial" w:hAnsi="Arial"/>
-          <w:sz w:val="22"/>
-        </w:rPr>
-        <w:t xml:space="preserve">200 </w:t>
-      </w:r>
-      <w:r>
-        <w:rPr>
-          <w:rFonts w:ascii="Arial" w:hAnsi="Arial"/>
-          <w:sz w:val="22"/>
-        </w:rPr>
-        <w:t>sccm</w:t>
-      </w:r>
-      <w:r>
-        <w:rPr>
-          <w:rFonts w:ascii="Arial" w:hAnsi="Arial"/>
-          <w:sz w:val="22"/>
-        </w:rPr>
-        <w:t>) 2</w:t>
-      </w:r>
-      <w:r>
-        <w:rPr>
-          <w:rFonts w:ascii="Arial" w:hAnsi="Arial"/>
-          <w:sz w:val="22"/>
-        </w:rPr>
-        <w:t xml:space="preserve"> - 4</w:t>
-      </w:r>
-      <w:r>
-        <w:rPr>
-          <w:rFonts w:ascii="Arial" w:hAnsi="Arial"/>
-          <w:sz w:val="22"/>
-        </w:rPr>
-        <w:t xml:space="preserve"> h.</w:t>
+        <w:t>-1</w:t>
+      </w:r>
+      <w:r>
+        <w:rPr>
+          <w:rFonts w:ascii="Arial" w:hAnsi="Arial"/>
+          <w:sz w:val="22"/>
+        </w:rPr>
+        <w:t>) in a horizontal tube furnace under an argon atmosphere (flow rate &gt; 200 sccm) 2 - 4 h.</w:t>
       </w:r>
     </w:p>
     <w:p>
@@ -2019,55 +427,15 @@
           <w:szCs w:val="22"/>
         </w:rPr>
       </w:pPr>
-      <w:r>
-        <w:rPr>
-          <w:rFonts w:ascii="Arial" w:eastAsiaTheme="minorHAnsi" w:hAnsi="Arial" w:cs="Arial"/>
+      <w:proofErr w:type="spellStart"/>
+      <w:proofErr w:type="spellEnd"/>
+      <w:r>
+        <w:rPr>
+          <w:rFonts w:ascii="Arial" w:hAnsi="Arial"/>
           <w:b/>
-          <w:bCs/>
-          <w:sz w:val="22"/>
-          <w:szCs w:val="22"/>
-          <w:lang w:bidi="km-KH"/>
-          <w14:ligatures w14:val="standardContextual"/>
-        </w:rPr>
-        <w:t xml:space="preserve">Preparation of </w:t>
-      </w:r>
-      <w:proofErr w:type="spellStart"/>
-      <w:r>
-        <w:rPr>
-          <w:rFonts w:ascii="Arial" w:eastAsiaTheme="minorHAnsi" w:hAnsi="Arial" w:cs="Arial"/>
-          <w:b/>
-          <w:bCs/>
-          <w:sz w:val="22"/>
-          <w:szCs w:val="22"/>
-          <w:lang w:bidi="km-KH"/>
-          <w14:ligatures w14:val="standardContextual"/>
-        </w:rPr>
-        <w:t>AgNPs</w:t>
-      </w:r>
-      <w:proofErr w:type="spellEnd"/>
-      <w:r>
-        <w:rPr>
-          <w:rFonts w:ascii="Arial" w:eastAsiaTheme="minorHAnsi" w:hAnsi="Arial" w:cs="Arial"/>
-          <w:b/>
-          <w:bCs/>
-          <w:sz w:val="22"/>
-          <w:szCs w:val="22"/>
-          <w:lang w:bidi="km-KH"/>
-          <w14:ligatures w14:val="standardContextual"/>
-        </w:rPr>
-        <w:t xml:space="preserve"> </w:t>
-      </w:r>
-      <w:r>
-        <w:rPr>
-          <w:rFonts w:ascii="Arial" w:eastAsiaTheme="minorHAnsi" w:hAnsi="Arial" w:cs="Arial"/>
-          <w:b/>
-          <w:bCs/>
-          <w:sz w:val="22"/>
-          <w:szCs w:val="22"/>
-          <w:lang w:bidi="km-KH"/>
-          <w14:ligatures w14:val="standardContextual"/>
-        </w:rPr>
-        <w:t>cathode via spray coating method</w:t>
+          <w:sz w:val="22"/>
+        </w:rPr>
+        <w:t>Preparation of AgNPs cathode via spray coating method</w:t>
       </w:r>
     </w:p>
     <w:p>
@@ -2095,77 +463,7 @@
           <w:rFonts w:ascii="Arial" w:hAnsi="Arial"/>
           <w:sz w:val="22"/>
         </w:rPr>
-        <w:t xml:space="preserve">The NiSAC gas-diffusion electrode was fabricated by spray coating onto </w:t>
-      </w:r>
-      <w:r>
-        <w:rPr>
-          <w:rFonts w:ascii="Arial" w:hAnsi="Arial"/>
-          <w:sz w:val="22"/>
-        </w:rPr>
-        <w:t>Sigracet</w:t>
-      </w:r>
-      <w:r>
-        <w:rPr>
-          <w:rFonts w:ascii="Arial" w:hAnsi="Arial"/>
-          <w:sz w:val="22"/>
-        </w:rPr>
-        <w:t xml:space="preserve"> 39BB carbon paper or hydrophilic carbon cloth substrates. Typically, 150 mg of</w:t>
-      </w:r>
-      <w:r>
-        <w:rPr>
-          <w:rFonts w:ascii="Arial" w:hAnsi="Arial"/>
-          <w:sz w:val="22"/>
-        </w:rPr>
-        <w:t xml:space="preserve"> </w:t>
-      </w:r>
-      <w:r>
-        <w:rPr>
-          <w:rFonts w:ascii="Arial" w:hAnsi="Arial"/>
-          <w:sz w:val="22"/>
-        </w:rPr>
-        <w:t>AgNPs</w:t>
-      </w:r>
-      <w:r>
-        <w:rPr>
-          <w:rFonts w:ascii="Arial" w:hAnsi="Arial"/>
-          <w:sz w:val="22"/>
-        </w:rPr>
-        <w:t xml:space="preserve"> </w:t>
-      </w:r>
-      <w:r>
-        <w:rPr>
-          <w:rFonts w:ascii="Arial" w:hAnsi="Arial"/>
-          <w:sz w:val="22"/>
-        </w:rPr>
-        <w:t xml:space="preserve">and 381 </w:t>
-      </w:r>
-      <w:r>
-        <w:rPr>
-          <w:rFonts w:ascii="Arial" w:hAnsi="Arial"/>
-          <w:sz w:val="22"/>
-        </w:rPr>
-        <w:t>μL</w:t>
-      </w:r>
-      <w:r>
-        <w:rPr>
-          <w:rFonts w:ascii="Arial" w:hAnsi="Arial"/>
-          <w:sz w:val="22"/>
-        </w:rPr>
-        <w:t xml:space="preserve"> of XC-2 ionomer were ultrasonically dispersed in 10 mL of isopropanol (IPA) for at least 1 h to form a homogeneous dark colloidal suspension. The ink suspension was subsequently spray-coated onto a </w:t>
-      </w:r>
-      <w:r>
-        <w:rPr>
-          <w:rFonts w:ascii="Arial" w:hAnsi="Arial"/>
-          <w:sz w:val="22"/>
-        </w:rPr>
-        <w:t>12 x 12</w:t>
-      </w:r>
-      <w:r>
-        <w:rPr>
-          <w:rFonts w:ascii="Arial" w:hAnsi="Arial"/>
-          <w:sz w:val="22"/>
-        </w:rPr>
-        <w:t xml:space="preserve"> cm</w:t>
+        <w:t>The NiSAC gas-diffusion electrode was fabricated by spray coating onto Sigracet 39BB carbon paper or hydrophilic carbon cloth substrates. Typically, 150 mg of AgNPs and 381 μL of XC-2 ionomer were ultrasonically dispersed in 10 mL of isopropanol (IPA) for at least 1 h to form a homogeneous dark colloidal suspension. The ink suspension was subsequently spray-coated onto a 12 x 12 cm</w:t>
       </w:r>
       <w:r>
         <w:rPr>
@@ -2184,11 +482,18 @@
       </w:r>
       <w:r>
         <w:rPr>
-          <w:rFonts w:ascii="Cambria Math" w:hAnsi="Cambria Math"/>
+          <w:rFonts w:ascii="Arial" w:hAnsi="Arial"/>
           <w:sz w:val="22"/>
           <w:vertAlign w:val="superscript"/>
         </w:rPr>
-        <w:t>-</w:t>
+        <w:t>-1</w:t>
+      </w:r>
+      <w:r>
+        <w:rPr>
+          <w:rFonts w:ascii="Arial" w:hAnsi="Arial"/>
+          <w:sz w:val="22"/>
+        </w:rPr>
+        <w:t xml:space="preserve"> on a hotplate maintained at 130°C, yielding a catalyst mass loading of 0.5 ± 0.1 mg.cm</w:t>
       </w:r>
       <w:r>
         <w:rPr>
@@ -2196,93 +501,14 @@
           <w:sz w:val="22"/>
           <w:vertAlign w:val="superscript"/>
         </w:rPr>
-        <w:t>1</w:t>
-      </w:r>
-      <w:r>
-        <w:rPr>
-          <w:rFonts w:ascii="Arial" w:hAnsi="Arial"/>
-          <w:sz w:val="22"/>
-        </w:rPr>
-        <w:t xml:space="preserve"> on a hotplate maintained at 1</w:t>
-      </w:r>
-      <w:r>
-        <w:rPr>
-          <w:rFonts w:ascii="Arial" w:hAnsi="Arial"/>
-          <w:sz w:val="22"/>
-        </w:rPr>
-        <w:t>3</w:t>
-      </w:r>
-      <w:r>
-        <w:rPr>
-          <w:rFonts w:ascii="Arial" w:hAnsi="Arial"/>
-          <w:sz w:val="22"/>
-        </w:rPr>
-        <w:t xml:space="preserve">0°C, yielding a catalyst mass loading of </w:t>
-      </w:r>
-      <w:r>
-        <w:rPr>
-          <w:rFonts w:ascii="Arial" w:hAnsi="Arial"/>
-          <w:sz w:val="22"/>
-        </w:rPr>
-        <w:t>0.5</w:t>
-      </w:r>
-      <w:r>
-        <w:rPr>
-          <w:rFonts w:ascii="Arial" w:hAnsi="Arial"/>
-          <w:sz w:val="22"/>
-        </w:rPr>
-        <w:t xml:space="preserve"> ± 0.1 mg</w:t>
-      </w:r>
-      <w:r>
-        <w:rPr>
-          <w:rFonts w:ascii="Arial" w:hAnsi="Arial"/>
-          <w:sz w:val="22"/>
-        </w:rPr>
-        <w:t>.</w:t>
-      </w:r>
-      <w:r>
-        <w:rPr>
-          <w:rFonts w:ascii="Arial" w:hAnsi="Arial"/>
-          <w:sz w:val="22"/>
-        </w:rPr>
-        <w:t>cm</w:t>
-      </w:r>
-      <w:r>
-        <w:rPr>
-          <w:rFonts w:ascii="Cambria Math" w:hAnsi="Cambria Math"/>
-          <w:sz w:val="22"/>
-          <w:vertAlign w:val="superscript"/>
-        </w:rPr>
-        <w:t>-</w:t>
-      </w:r>
-      <w:r>
-        <w:rPr>
-          <w:rFonts w:ascii="Arial" w:hAnsi="Arial"/>
-          <w:sz w:val="22"/>
-          <w:vertAlign w:val="superscript"/>
-        </w:rPr>
-        <w:t>2</w:t>
-      </w:r>
-      <w:r>
-        <w:rPr>
-          <w:rFonts w:ascii="Arial" w:hAnsi="Arial"/>
-          <w:sz w:val="22"/>
-        </w:rPr>
-        <w:t xml:space="preserve"> </w:t>
-      </w:r>
-      <w:r>
-        <w:rPr>
-          <w:rFonts w:ascii="Arial" w:hAnsi="Arial"/>
-          <w:sz w:val="22"/>
-        </w:rPr>
-        <w:t>AgNPs</w:t>
-      </w:r>
-      <w:r>
-        <w:rPr>
-          <w:rFonts w:ascii="Arial" w:hAnsi="Arial"/>
-          <w:sz w:val="22"/>
-        </w:rPr>
-        <w:t>.</w:t>
+        <w:t>-2</w:t>
+      </w:r>
+      <w:r>
+        <w:rPr>
+          <w:rFonts w:ascii="Arial" w:hAnsi="Arial"/>
+          <w:sz w:val="22"/>
+        </w:rPr>
+        <w:t xml:space="preserve"> AgNPs.</w:t>
       </w:r>
     </w:p>
     <w:p>
@@ -2309,7 +535,20 @@
           <w:szCs w:val="28"/>
         </w:rPr>
       </w:pPr>
-      <w:r>
+      <w:proofErr w:type="spellStart"/>
+      <w:proofErr w:type="spellEnd"/>
+      <w:r>
+        <w:rPr>
+          <w:rFonts w:ascii="Arial" w:hAnsi="Arial"/>
+          <w:b/>
+          <w:sz w:val="22"/>
+        </w:rPr>
+        <w:t>Electrochemical measurements in membrane-electrode assembly (MEA) electrolyzer</w:t>
+      </w:r>
+    </w:p>
+    <w:p>
+      <w:pPr>
+        <w:spacing w:line="360" w:lineRule="auto"/>
         <w:rPr>
           <w:rFonts w:ascii="Arial" w:hAnsi="Arial" w:cs="Browallia New"/>
           <w:b/>
@@ -2317,534 +556,190 @@
           <w:sz w:val="22"/>
           <w:szCs w:val="28"/>
         </w:rPr>
-        <w:t xml:space="preserve">Electrochemical measurements in membrane-electrode assembly (MEA) </w:t>
-      </w:r>
+      </w:pPr>
       <w:proofErr w:type="spellStart"/>
-      <w:r>
-        <w:rPr>
-          <w:rFonts w:ascii="Arial" w:hAnsi="Arial" w:cs="Browallia New"/>
+      <w:proofErr w:type="spellEnd"/>
+      <w:r>
+        <w:rPr>
+          <w:rFonts w:ascii="Arial" w:hAnsi="Arial"/>
           <w:b/>
-          <w:bCs/>
-          <w:sz w:val="22"/>
-          <w:szCs w:val="28"/>
-        </w:rPr>
-        <w:t>electrolyzer</w:t>
-      </w:r>
-      <w:proofErr w:type="spellEnd"/>
+          <w:sz w:val="22"/>
+        </w:rPr>
+        <w:t>5 and 100cm</w:t>
+      </w:r>
+      <w:r>
+        <w:rPr>
+          <w:rFonts w:ascii="Arial" w:hAnsi="Arial"/>
+          <w:b/>
+          <w:sz w:val="22"/>
+          <w:vertAlign w:val="superscript"/>
+        </w:rPr>
+        <w:t>2</w:t>
+      </w:r>
+      <w:r>
+        <w:rPr>
+          <w:rFonts w:ascii="Arial" w:hAnsi="Arial"/>
+          <w:b/>
+          <w:sz w:val="22"/>
+        </w:rPr>
+        <w:t xml:space="preserve"> MEA electrolyzer operational set-up</w:t>
+      </w:r>
     </w:p>
     <w:p>
       <w:pPr>
         <w:spacing w:line="360" w:lineRule="auto"/>
-        <w:rPr>
-          <w:rFonts w:ascii="Arial" w:hAnsi="Arial" w:cs="Browallia New"/>
-          <w:b/>
-          <w:bCs/>
-          <w:sz w:val="22"/>
-          <w:szCs w:val="28"/>
-        </w:rPr>
-      </w:pPr>
-      <w:r>
-        <w:rPr>
-          <w:rFonts w:ascii="Arial" w:hAnsi="Arial" w:cs="Browallia New"/>
-          <w:b/>
-          <w:bCs/>
-          <w:sz w:val="22"/>
-          <w:szCs w:val="28"/>
-        </w:rPr>
-        <w:t xml:space="preserve">5 and </w:t>
-      </w:r>
-      <w:r>
-        <w:rPr>
-          <w:rFonts w:ascii="Arial" w:hAnsi="Arial" w:cs="Browallia New"/>
-          <w:b/>
-          <w:bCs/>
-          <w:sz w:val="22"/>
-          <w:szCs w:val="28"/>
-        </w:rPr>
-        <w:t>100cm</w:t>
-      </w:r>
-      <w:r>
-        <w:rPr>
-          <w:rFonts w:ascii="Arial" w:hAnsi="Arial" w:cs="Browallia New"/>
-          <w:b/>
-          <w:bCs/>
-          <w:sz w:val="22"/>
-          <w:szCs w:val="28"/>
+        <w:jc w:val="both"/>
+        <w:rPr>
+          <w:rFonts w:ascii="Arial" w:hAnsi="Arial" w:cs="Arial"/>
+          <w:sz w:val="22"/>
+          <w:szCs w:val="22"/>
+        </w:rPr>
+      </w:pPr>
+      <w:proofErr w:type="spellStart"/>
+      <w:proofErr w:type="spellEnd"/>
+      <w:proofErr w:type="spellStart"/>
+      <w:proofErr w:type="spellEnd"/>
+      <w:r>
+        <w:rPr>
+          <w:rFonts w:ascii="Arial" w:hAnsi="Arial"/>
+          <w:sz w:val="22"/>
+        </w:rPr>
+        <w:t>A 100 cm</w:t>
+      </w:r>
+      <w:r>
+        <w:rPr>
+          <w:rFonts w:ascii="Arial" w:hAnsi="Arial"/>
+          <w:sz w:val="22"/>
           <w:vertAlign w:val="superscript"/>
         </w:rPr>
         <w:t>2</w:t>
       </w:r>
       <w:r>
         <w:rPr>
-          <w:rFonts w:ascii="Arial" w:hAnsi="Arial" w:cs="Browallia New"/>
-          <w:b/>
-          <w:bCs/>
-          <w:sz w:val="22"/>
-          <w:szCs w:val="28"/>
-        </w:rPr>
-        <w:t xml:space="preserve"> MEA </w:t>
-      </w:r>
-      <w:proofErr w:type="spellStart"/>
-      <w:r>
-        <w:rPr>
-          <w:rFonts w:ascii="Arial" w:hAnsi="Arial" w:cs="Browallia New"/>
-          <w:b/>
-          <w:bCs/>
-          <w:sz w:val="22"/>
-          <w:szCs w:val="28"/>
-        </w:rPr>
-        <w:t>electrolyzer</w:t>
-      </w:r>
-      <w:proofErr w:type="spellEnd"/>
-      <w:r>
-        <w:rPr>
-          <w:rFonts w:ascii="Arial" w:hAnsi="Arial" w:cs="Browallia New"/>
-          <w:b/>
-          <w:bCs/>
-          <w:sz w:val="22"/>
-          <w:szCs w:val="28"/>
-        </w:rPr>
-        <w:t xml:space="preserve"> operational set-up</w:t>
-      </w:r>
-    </w:p>
-    <w:p>
-      <w:pPr>
-        <w:spacing w:line="360" w:lineRule="auto"/>
-        <w:jc w:val="both"/>
-        <w:rPr>
-          <w:rFonts w:ascii="Arial" w:hAnsi="Arial" w:cs="Arial"/>
-          <w:sz w:val="22"/>
-          <w:szCs w:val="22"/>
-        </w:rPr>
-      </w:pPr>
-      <w:r>
-        <w:rPr>
-          <w:rFonts w:ascii="Arial" w:hAnsi="Arial" w:cs="Arial"/>
-          <w:sz w:val="22"/>
-          <w:szCs w:val="22"/>
-        </w:rPr>
-        <w:t xml:space="preserve">A </w:t>
-      </w:r>
-      <w:r>
-        <w:rPr>
-          <w:rFonts w:ascii="Arial" w:hAnsi="Arial" w:cs="Arial"/>
-          <w:sz w:val="22"/>
-          <w:szCs w:val="22"/>
-        </w:rPr>
-        <w:t>100</w:t>
-      </w:r>
-      <w:r>
-        <w:rPr>
-          <w:rFonts w:ascii="Arial" w:hAnsi="Arial" w:cs="Arial"/>
-          <w:sz w:val="22"/>
-          <w:szCs w:val="22"/>
-        </w:rPr>
-        <w:t xml:space="preserve"> cm</w:t>
-      </w:r>
-      <w:r>
-        <w:rPr>
-          <w:rFonts w:ascii="Arial" w:hAnsi="Arial" w:cs="Arial"/>
-          <w:sz w:val="22"/>
-          <w:szCs w:val="22"/>
+          <w:rFonts w:ascii="Arial" w:hAnsi="Arial"/>
+          <w:sz w:val="22"/>
+        </w:rPr>
+        <w:t xml:space="preserve"> MEA electrolyzer was used to evaluate the CO</w:t>
+      </w:r>
+      <w:r>
+        <w:rPr>
+          <w:rFonts w:ascii="Arial" w:hAnsi="Arial"/>
+          <w:sz w:val="22"/>
+          <w:vertAlign w:val="subscript"/>
+        </w:rPr>
+        <w:t>2</w:t>
+      </w:r>
+      <w:r>
+        <w:rPr>
+          <w:rFonts w:ascii="Arial" w:hAnsi="Arial"/>
+          <w:sz w:val="22"/>
+        </w:rPr>
+        <w:t>RR performance under modulated operating conditions. The IrO</w:t>
+      </w:r>
+      <w:r>
+        <w:rPr>
+          <w:rFonts w:ascii="Arial" w:hAnsi="Arial"/>
+          <w:sz w:val="22"/>
+          <w:vertAlign w:val="subscript"/>
+        </w:rPr>
+        <w:t>2</w:t>
+      </w:r>
+      <w:r>
+        <w:rPr>
+          <w:rFonts w:ascii="Arial" w:hAnsi="Arial"/>
+          <w:sz w:val="22"/>
+        </w:rPr>
+        <w:t>-TiPt felt (10.5 x 10.5 cm</w:t>
+      </w:r>
+      <w:r>
+        <w:rPr>
+          <w:rFonts w:ascii="Arial" w:hAnsi="Arial"/>
+          <w:sz w:val="22"/>
           <w:vertAlign w:val="superscript"/>
         </w:rPr>
         <w:t>2</w:t>
       </w:r>
       <w:r>
         <w:rPr>
-          <w:rFonts w:ascii="Arial" w:hAnsi="Arial" w:cs="Arial"/>
-          <w:sz w:val="22"/>
-          <w:szCs w:val="22"/>
-        </w:rPr>
-        <w:t xml:space="preserve"> MEA </w:t>
-      </w:r>
-      <w:proofErr w:type="spellStart"/>
-      <w:r>
-        <w:rPr>
-          <w:rFonts w:ascii="Arial" w:hAnsi="Arial" w:cs="Arial"/>
-          <w:sz w:val="22"/>
-          <w:szCs w:val="22"/>
-        </w:rPr>
-        <w:t>electrolyzer</w:t>
-      </w:r>
-      <w:proofErr w:type="spellEnd"/>
-      <w:r>
-        <w:rPr>
-          <w:rFonts w:ascii="Arial" w:hAnsi="Arial" w:cs="Arial"/>
-          <w:sz w:val="22"/>
-          <w:szCs w:val="22"/>
-        </w:rPr>
-        <w:t xml:space="preserve"> was used to evaluate the CO2RR performance under modulated operating conditions. The</w:t>
-      </w:r>
-      <w:r>
-        <w:rPr>
-          <w:rFonts w:ascii="Arial" w:hAnsi="Arial" w:cs="Arial"/>
-          <w:sz w:val="22"/>
-          <w:szCs w:val="22"/>
-        </w:rPr>
-        <w:t xml:space="preserve"> IrO</w:t>
-      </w:r>
-      <w:r>
-        <w:rPr>
-          <w:rFonts w:ascii="Arial" w:hAnsi="Arial" w:cs="Arial"/>
-          <w:sz w:val="22"/>
-          <w:szCs w:val="22"/>
+          <w:rFonts w:ascii="Arial" w:hAnsi="Arial"/>
+          <w:sz w:val="22"/>
+        </w:rPr>
+        <w:t>), AEM (12 x 12 cm</w:t>
+      </w:r>
+      <w:r>
+        <w:rPr>
+          <w:rFonts w:ascii="Arial" w:hAnsi="Arial"/>
+          <w:sz w:val="22"/>
+          <w:vertAlign w:val="superscript"/>
+        </w:rPr>
+        <w:t>2</w:t>
+      </w:r>
+      <w:r>
+        <w:rPr>
+          <w:rFonts w:ascii="Arial" w:hAnsi="Arial"/>
+          <w:sz w:val="22"/>
+        </w:rPr>
+        <w:t>), and AgNPs (10.5 x 10.5 cm</w:t>
+      </w:r>
+      <w:r>
+        <w:rPr>
+          <w:rFonts w:ascii="Arial" w:hAnsi="Arial"/>
+          <w:sz w:val="22"/>
+          <w:vertAlign w:val="superscript"/>
+        </w:rPr>
+        <w:t>2</w:t>
+      </w:r>
+      <w:r>
+        <w:rPr>
+          <w:rFonts w:ascii="Arial" w:hAnsi="Arial"/>
+          <w:sz w:val="22"/>
+        </w:rPr>
+        <w:t>) were employed as the anode, membrane, and cathode electrode, respectively. The MEA was assembled with 0.25µm PTFE gasket and tightened at a compression force of 8 ft.lb. 10 L of 0.1 M KHCO</w:t>
+      </w:r>
+      <w:r>
+        <w:rPr>
+          <w:rFonts w:ascii="Arial" w:hAnsi="Arial"/>
+          <w:sz w:val="22"/>
           <w:vertAlign w:val="subscript"/>
         </w:rPr>
+        <w:t>3</w:t>
+      </w:r>
+      <w:r>
+        <w:rPr>
+          <w:rFonts w:ascii="Arial" w:hAnsi="Arial"/>
+          <w:sz w:val="22"/>
+        </w:rPr>
+        <w:t xml:space="preserve"> was recirculated and used throughout the experiment as the anolyte at 100 ml/min. The humidified CO</w:t>
+      </w:r>
+      <w:r>
+        <w:rPr>
+          <w:rFonts w:ascii="Arial" w:hAnsi="Arial"/>
+          <w:sz w:val="22"/>
+          <w:vertAlign w:val="subscript"/>
+        </w:rPr>
         <w:t>2</w:t>
       </w:r>
       <w:r>
         <w:rPr>
-          <w:rFonts w:ascii="Arial" w:hAnsi="Arial" w:cs="Arial"/>
-          <w:sz w:val="22"/>
-          <w:szCs w:val="22"/>
-        </w:rPr>
-        <w:t>-TiPt felt (10.5 x 10.5 cm</w:t>
-      </w:r>
-      <w:r>
-        <w:rPr>
-          <w:rFonts w:ascii="Arial" w:hAnsi="Arial" w:cs="Arial"/>
-          <w:sz w:val="22"/>
-          <w:szCs w:val="22"/>
-          <w:vertAlign w:val="superscript"/>
+          <w:rFonts w:ascii="Arial" w:hAnsi="Arial"/>
+          <w:sz w:val="22"/>
+        </w:rPr>
+        <w:t xml:space="preserve"> gas stream was introduced into the cathodic inlet with a total CO</w:t>
+      </w:r>
+      <w:r>
+        <w:rPr>
+          <w:rFonts w:ascii="Arial" w:hAnsi="Arial"/>
+          <w:sz w:val="22"/>
+          <w:vertAlign w:val="subscript"/>
         </w:rPr>
         <w:t>2</w:t>
       </w:r>
       <w:r>
         <w:rPr>
-          <w:rFonts w:ascii="Arial" w:hAnsi="Arial" w:cs="Arial"/>
-          <w:sz w:val="22"/>
-          <w:szCs w:val="22"/>
-        </w:rPr>
-        <w:t>),</w:t>
-      </w:r>
-      <w:r>
-        <w:rPr>
-          <w:rFonts w:ascii="Arial" w:hAnsi="Arial" w:cs="Arial"/>
-          <w:sz w:val="22"/>
-          <w:szCs w:val="22"/>
-        </w:rPr>
-        <w:t xml:space="preserve"> </w:t>
-      </w:r>
-      <w:r>
-        <w:rPr>
-          <w:rFonts w:ascii="Arial" w:hAnsi="Arial" w:cs="Arial"/>
-          <w:sz w:val="22"/>
-          <w:szCs w:val="22"/>
-        </w:rPr>
-        <w:t>AEM (12 x 12 cm</w:t>
-      </w:r>
-      <w:r>
-        <w:rPr>
-          <w:rFonts w:ascii="Arial" w:hAnsi="Arial" w:cs="Arial"/>
-          <w:sz w:val="22"/>
-          <w:szCs w:val="22"/>
-          <w:vertAlign w:val="superscript"/>
-        </w:rPr>
-        <w:t>2</w:t>
-      </w:r>
-      <w:r>
-        <w:rPr>
-          <w:rFonts w:ascii="Arial" w:hAnsi="Arial" w:cs="Arial"/>
-          <w:sz w:val="22"/>
-          <w:szCs w:val="22"/>
-        </w:rPr>
-        <w:t>)</w:t>
-      </w:r>
-      <w:r>
-        <w:rPr>
-          <w:rFonts w:ascii="Arial" w:hAnsi="Arial" w:cs="Arial"/>
-          <w:sz w:val="22"/>
-          <w:szCs w:val="22"/>
-        </w:rPr>
-        <w:t xml:space="preserve">, and </w:t>
-      </w:r>
-      <w:proofErr w:type="spellStart"/>
-      <w:r>
-        <w:rPr>
-          <w:rFonts w:ascii="Arial" w:hAnsi="Arial" w:cs="Arial"/>
-          <w:sz w:val="22"/>
-          <w:szCs w:val="22"/>
-        </w:rPr>
-        <w:t>AgNPs</w:t>
-      </w:r>
-      <w:proofErr w:type="spellEnd"/>
-      <w:r>
-        <w:rPr>
-          <w:rFonts w:ascii="Arial" w:hAnsi="Arial" w:cs="Arial"/>
-          <w:sz w:val="22"/>
-          <w:szCs w:val="22"/>
-        </w:rPr>
-        <w:t xml:space="preserve"> (10.5 x 10.5 cm</w:t>
-      </w:r>
-      <w:r>
-        <w:rPr>
-          <w:rFonts w:ascii="Arial" w:hAnsi="Arial" w:cs="Arial"/>
-          <w:sz w:val="22"/>
-          <w:szCs w:val="22"/>
-          <w:vertAlign w:val="superscript"/>
-        </w:rPr>
-        <w:t>2</w:t>
-      </w:r>
-      <w:r>
-        <w:rPr>
-          <w:rFonts w:ascii="Arial" w:hAnsi="Arial" w:cs="Arial"/>
-          <w:sz w:val="22"/>
-          <w:szCs w:val="22"/>
-        </w:rPr>
-        <w:t xml:space="preserve">) </w:t>
-      </w:r>
-      <w:r>
-        <w:rPr>
-          <w:rFonts w:ascii="Arial" w:hAnsi="Arial" w:cs="Arial"/>
-          <w:sz w:val="22"/>
-          <w:szCs w:val="22"/>
-        </w:rPr>
-        <w:t xml:space="preserve">were employed as the anode, membrane, and cathode electrode, respectively. </w:t>
-      </w:r>
-      <w:r>
-        <w:rPr>
-          <w:rFonts w:ascii="Arial" w:hAnsi="Arial" w:cs="Arial"/>
-          <w:sz w:val="22"/>
-          <w:szCs w:val="22"/>
-        </w:rPr>
-        <w:t xml:space="preserve">The MEA was assembled with 0.25µm PTFE gasket and tightened at a compression force of </w:t>
-      </w:r>
-      <w:r>
-        <w:rPr>
-          <w:rFonts w:ascii="Arial" w:hAnsi="Arial" w:cs="Arial"/>
-          <w:sz w:val="22"/>
-          <w:szCs w:val="22"/>
-        </w:rPr>
-        <w:lastRenderedPageBreak/>
-        <w:t>8</w:t>
-      </w:r>
-      <w:r>
-        <w:rPr>
-          <w:rFonts w:ascii="Arial" w:hAnsi="Arial" w:cs="Arial"/>
-          <w:sz w:val="22"/>
-          <w:szCs w:val="22"/>
-        </w:rPr>
-        <w:t xml:space="preserve"> ft.lb. </w:t>
-      </w:r>
-      <w:r>
-        <w:rPr>
-          <w:rFonts w:ascii="Arial" w:hAnsi="Arial" w:cs="Browallia New"/>
-          <w:sz w:val="22"/>
-          <w:szCs w:val="28"/>
-        </w:rPr>
-        <w:t>10 L</w:t>
-      </w:r>
-      <w:r>
-        <w:rPr>
-          <w:rFonts w:ascii="Arial" w:hAnsi="Arial" w:cs="Arial"/>
-          <w:sz w:val="22"/>
-          <w:szCs w:val="22"/>
-        </w:rPr>
-        <w:t xml:space="preserve"> of </w:t>
-      </w:r>
-      <w:r>
-        <w:rPr>
-          <w:rFonts w:ascii="Arial" w:hAnsi="Arial" w:cs="Arial"/>
-          <w:sz w:val="22"/>
-          <w:szCs w:val="22"/>
-        </w:rPr>
-        <w:t>0.</w:t>
-      </w:r>
-      <w:r>
-        <w:rPr>
-          <w:rFonts w:ascii="Arial" w:hAnsi="Arial" w:cs="Arial"/>
-          <w:sz w:val="22"/>
-          <w:szCs w:val="22"/>
-        </w:rPr>
-        <w:t>1</w:t>
-      </w:r>
-      <w:r>
-        <w:rPr>
-          <w:rFonts w:ascii="Arial" w:hAnsi="Arial" w:cs="Arial"/>
-          <w:sz w:val="22"/>
-          <w:szCs w:val="22"/>
-        </w:rPr>
-        <w:t xml:space="preserve"> M</w:t>
-      </w:r>
-      <w:r>
-        <w:rPr>
-          <w:rFonts w:ascii="Arial" w:hAnsi="Arial" w:cs="Arial"/>
-          <w:sz w:val="22"/>
-          <w:szCs w:val="22"/>
-        </w:rPr>
-        <w:t xml:space="preserve"> K</w:t>
-      </w:r>
-      <w:r>
-        <w:rPr>
-          <w:rFonts w:ascii="Arial" w:hAnsi="Arial" w:cs="Arial"/>
-          <w:sz w:val="22"/>
-          <w:szCs w:val="22"/>
-        </w:rPr>
-        <w:t>HCO</w:t>
-      </w:r>
-      <w:r>
-        <w:rPr>
-          <w:rFonts w:ascii="Arial" w:hAnsi="Arial" w:cs="Arial"/>
-          <w:sz w:val="22"/>
-          <w:szCs w:val="22"/>
-          <w:vertAlign w:val="subscript"/>
-        </w:rPr>
-        <w:t>3</w:t>
-      </w:r>
-      <w:r>
-        <w:rPr>
-          <w:rFonts w:ascii="Arial" w:hAnsi="Arial" w:cs="Arial"/>
-          <w:sz w:val="22"/>
-          <w:szCs w:val="22"/>
-        </w:rPr>
-        <w:t xml:space="preserve"> </w:t>
-      </w:r>
-      <w:r>
-        <w:rPr>
-          <w:rFonts w:ascii="Arial" w:hAnsi="Arial" w:cs="Arial"/>
-          <w:sz w:val="22"/>
-          <w:szCs w:val="22"/>
-        </w:rPr>
-        <w:t>w</w:t>
-      </w:r>
-      <w:r>
-        <w:rPr>
-          <w:rFonts w:ascii="Arial" w:hAnsi="Arial" w:cs="Arial"/>
-          <w:sz w:val="22"/>
-          <w:szCs w:val="22"/>
-        </w:rPr>
-        <w:t>as</w:t>
-      </w:r>
-      <w:r>
-        <w:rPr>
-          <w:rFonts w:ascii="Arial" w:hAnsi="Arial" w:cs="Arial"/>
-          <w:sz w:val="22"/>
-          <w:szCs w:val="22"/>
-        </w:rPr>
-        <w:t xml:space="preserve"> recirculated and used throughout the experiment as the anolyte at </w:t>
-      </w:r>
-      <w:r>
-        <w:rPr>
-          <w:rFonts w:ascii="Arial" w:hAnsi="Arial" w:cs="Arial"/>
-          <w:sz w:val="22"/>
-          <w:szCs w:val="22"/>
-        </w:rPr>
-        <w:t>1</w:t>
-      </w:r>
-      <w:r>
-        <w:rPr>
-          <w:rFonts w:ascii="Arial" w:hAnsi="Arial" w:cs="Arial"/>
-          <w:sz w:val="22"/>
-          <w:szCs w:val="22"/>
-        </w:rPr>
-        <w:t>0</w:t>
-      </w:r>
-      <w:r>
-        <w:rPr>
-          <w:rFonts w:ascii="Arial" w:hAnsi="Arial" w:cs="Arial"/>
-          <w:sz w:val="22"/>
-          <w:szCs w:val="22"/>
-        </w:rPr>
-        <w:t>0</w:t>
-      </w:r>
-      <w:r>
-        <w:rPr>
-          <w:rFonts w:ascii="Arial" w:hAnsi="Arial" w:cs="Arial"/>
-          <w:sz w:val="22"/>
-          <w:szCs w:val="22"/>
-        </w:rPr>
-        <w:t xml:space="preserve"> ml/min.</w:t>
-      </w:r>
-      <w:r>
-        <w:rPr>
-          <w:rFonts w:ascii="Arial" w:hAnsi="Arial" w:cs="Arial"/>
-          <w:sz w:val="22"/>
-          <w:szCs w:val="22"/>
-        </w:rPr>
-        <w:t xml:space="preserve"> The humidified CO</w:t>
-      </w:r>
-      <w:r>
-        <w:rPr>
-          <w:rFonts w:ascii="Arial" w:hAnsi="Arial" w:cs="Arial"/>
-          <w:sz w:val="22"/>
-          <w:szCs w:val="22"/>
-          <w:vertAlign w:val="subscript"/>
-        </w:rPr>
-        <w:t>2</w:t>
-      </w:r>
-      <w:r>
-        <w:rPr>
-          <w:rFonts w:ascii="Arial" w:hAnsi="Arial" w:cs="Arial"/>
-          <w:sz w:val="22"/>
-          <w:szCs w:val="22"/>
-        </w:rPr>
-        <w:t xml:space="preserve"> gas stream </w:t>
-      </w:r>
-      <w:r>
-        <w:rPr>
-          <w:rFonts w:ascii="Arial" w:hAnsi="Arial" w:cs="Arial"/>
-          <w:sz w:val="22"/>
-          <w:szCs w:val="22"/>
-        </w:rPr>
-        <w:t xml:space="preserve">was introduced into the cathodic inlet </w:t>
-      </w:r>
-      <w:r>
-        <w:rPr>
-          <w:rFonts w:ascii="Arial" w:hAnsi="Arial" w:cs="Arial"/>
-          <w:sz w:val="22"/>
-          <w:szCs w:val="22"/>
-        </w:rPr>
-        <w:t>with a total CO</w:t>
-      </w:r>
-      <w:r>
-        <w:rPr>
-          <w:rFonts w:ascii="Arial" w:hAnsi="Arial" w:cs="Arial"/>
-          <w:sz w:val="22"/>
-          <w:szCs w:val="22"/>
-          <w:vertAlign w:val="subscript"/>
-        </w:rPr>
-        <w:t>2</w:t>
-      </w:r>
-      <w:r>
-        <w:rPr>
-          <w:rFonts w:ascii="Arial" w:hAnsi="Arial" w:cs="Arial"/>
-          <w:sz w:val="22"/>
-          <w:szCs w:val="22"/>
-        </w:rPr>
-        <w:t xml:space="preserve"> flow rate of 200-</w:t>
-      </w:r>
-      <w:r>
-        <w:rPr>
-          <w:rFonts w:ascii="Arial" w:hAnsi="Arial" w:cs="Arial"/>
-          <w:sz w:val="22"/>
-          <w:szCs w:val="22"/>
-        </w:rPr>
-        <w:t>800</w:t>
-      </w:r>
-      <w:r>
-        <w:rPr>
-          <w:rFonts w:ascii="Arial" w:hAnsi="Arial" w:cs="Arial"/>
-          <w:sz w:val="22"/>
-          <w:szCs w:val="22"/>
-        </w:rPr>
-        <w:t xml:space="preserve"> ml/min.</w:t>
-      </w:r>
-      <w:r>
-        <w:rPr>
-          <w:rFonts w:ascii="Arial" w:hAnsi="Arial" w:cs="Arial"/>
-          <w:sz w:val="22"/>
-          <w:szCs w:val="22"/>
-        </w:rPr>
-        <w:t xml:space="preserve"> Prior the test, the electrochemical impedance spectroscopy (EIS) and Cyclic voltammetry were measured. Meanwhile, t</w:t>
-      </w:r>
-      <w:r>
-        <w:rPr>
-          <w:rFonts w:ascii="Arial" w:hAnsi="Arial" w:cs="Arial"/>
-          <w:sz w:val="22"/>
-          <w:szCs w:val="22"/>
-        </w:rPr>
-        <w:t>he cathodic outlet was directly injected into an online gas-chromatography for gas products analysis.</w:t>
+          <w:rFonts w:ascii="Arial" w:hAnsi="Arial"/>
+          <w:sz w:val="22"/>
+        </w:rPr>
+        <w:t xml:space="preserve"> flow rate of 200-800 ml/min. Prior the test, the electrochemical impedance spectroscopy (EIS) and Cyclic voltammetry were measured. Meanwhile, the cathodic outlet was directly injected into an online gas-chromatography for gas products analysis.</w:t>
       </w:r>
     </w:p>
     <w:p>
@@ -2874,19 +769,10 @@
       </w:pPr>
       <w:r>
         <w:rPr>
-          <w:rFonts w:ascii="Arial" w:hAnsi="Arial" w:cs="Arial"/>
+          <w:rFonts w:ascii="Arial" w:hAnsi="Arial"/>
           <w:b/>
-          <w:bCs/>
-        </w:rPr>
-        <w:t>Result</w:t>
-      </w:r>
-      <w:r>
-        <w:rPr>
-          <w:rFonts w:ascii="Arial" w:hAnsi="Arial" w:cs="Arial"/>
-          <w:b/>
-          <w:bCs/>
-        </w:rPr>
-        <w:t>s</w:t>
+        </w:rPr>
+        <w:t>Results</w:t>
       </w:r>
     </w:p>
     <w:p>
@@ -3220,6 +1106,8 @@
         <w:spacing w:line="360" w:lineRule="auto"/>
         <w:jc w:val="both"/>
       </w:pPr>
+      <w:proofErr w:type="spellStart"/>
+      <w:proofErr w:type="spellEnd"/>
       <w:r>
         <w:rPr>
           <w:rFonts w:ascii="Arial" w:hAnsi="Arial"/>
@@ -3398,7 +1286,7 @@
           <w:rFonts w:ascii="Arial" w:hAnsi="Arial"/>
           <w:sz w:val="22"/>
         </w:rPr>
-        <w:t xml:space="preserve"> runs with a PiperION AEM.</w:t>
+        <w:t xml:space="preserve"> runs with a PiperION AEM (20µm).</w:t>
       </w:r>
     </w:p>
     <w:p>
@@ -3919,14 +1807,7 @@
           <w:rFonts w:ascii="Arial" w:hAnsi="Arial"/>
           <w:sz w:val="22"/>
         </w:rPr>
-        <w:t xml:space="preserve"> operation </w:t>
-      </w:r>
-      <w:r>
-        <w:rPr>
-          <w:rFonts w:ascii="Arial" w:hAnsi="Arial"/>
-          <w:sz w:val="22"/>
-        </w:rPr>
-        <w:t>to ~195–200 h, with mild GDE salt deposition remaining the residual degradation pathway to be addressed.</w:t>
+        <w:t xml:space="preserve"> operation to ~195–200 h, with mild GDE salt deposition remaining the residual degradation pathway to be addressed.</w:t>
       </w:r>
     </w:p>
     <w:p>
@@ -4289,13 +2170,10 @@
       </w:pPr>
       <w:r>
         <w:rPr>
-          <w:rFonts w:ascii="Arial" w:hAnsi="Arial" w:cs="Arial"/>
+          <w:rFonts w:ascii="Arial" w:hAnsi="Arial"/>
           <w:b/>
-          <w:bCs/>
-          <w:sz w:val="22"/>
-          <w:szCs w:val="22"/>
-        </w:rPr>
-        <w:lastRenderedPageBreak/>
+          <w:sz w:val="22"/>
+        </w:rPr>
         <w:t>Upcoming tasks</w:t>
       </w:r>
     </w:p>
@@ -4316,253 +2194,113 @@
       </w:pPr>
       <w:r>
         <w:rPr>
-          <w:rFonts w:ascii="Arial" w:hAnsi="Arial" w:cs="Arial"/>
-          <w:color w:val="000000"/>
-          <w:lang w:val="en-TH" w:bidi="km-KH"/>
+          <w:rFonts w:ascii="Arial" w:hAnsi="Arial"/>
         </w:rPr>
         <w:t>100cm</w:t>
       </w:r>
       <w:r>
         <w:rPr>
-          <w:rFonts w:ascii="Arial" w:hAnsi="Arial" w:cs="Arial"/>
-          <w:color w:val="000000"/>
+          <w:rFonts w:ascii="Arial" w:hAnsi="Arial"/>
           <w:vertAlign w:val="superscript"/>
-          <w:lang w:val="en-TH" w:bidi="km-KH"/>
         </w:rPr>
         <w:t>2</w:t>
       </w:r>
       <w:r>
         <w:rPr>
-          <w:rFonts w:ascii="Arial" w:hAnsi="Arial" w:cs="Arial"/>
-          <w:color w:val="000000"/>
-          <w:lang w:val="en-TH" w:bidi="km-KH"/>
+          <w:rFonts w:ascii="Arial" w:hAnsi="Arial"/>
         </w:rPr>
         <w:t xml:space="preserve"> MEA electrolyzer – CO</w:t>
       </w:r>
       <w:r>
         <w:rPr>
-          <w:rFonts w:ascii="Arial" w:hAnsi="Arial" w:cs="Arial"/>
-          <w:color w:val="000000"/>
+          <w:rFonts w:ascii="Arial" w:hAnsi="Arial"/>
           <w:vertAlign w:val="subscript"/>
-          <w:lang w:val="en-TH" w:bidi="km-KH"/>
         </w:rPr>
         <w:t>2</w:t>
       </w:r>
       <w:r>
         <w:rPr>
-          <w:rFonts w:ascii="Arial" w:hAnsi="Arial" w:cs="Arial"/>
-          <w:color w:val="000000"/>
-          <w:lang w:val="en-TH" w:bidi="km-KH"/>
-        </w:rPr>
-        <w:t xml:space="preserve"> electrolysis of</w:t>
-      </w:r>
-      <w:r>
-        <w:rPr>
-          <w:rFonts w:ascii="Arial" w:hAnsi="Arial" w:cs="Arial"/>
-          <w:color w:val="000000"/>
-          <w:lang w:val="en-TH" w:bidi="km-KH"/>
-        </w:rPr>
-        <w:t xml:space="preserve"> AgNPs (50nm, ~0.6mg/cm</w:t>
-      </w:r>
-      <w:r>
-        <w:rPr>
-          <w:rFonts w:ascii="Arial" w:hAnsi="Arial" w:cs="Arial"/>
-          <w:color w:val="000000"/>
+          <w:rFonts w:ascii="Arial" w:hAnsi="Arial"/>
+        </w:rPr>
+        <w:t xml:space="preserve"> electrolysis of AgNPs (50nm, ~0.6mg/cm</w:t>
+      </w:r>
+      <w:r>
+        <w:rPr>
+          <w:rFonts w:ascii="Arial" w:hAnsi="Arial"/>
           <w:vertAlign w:val="superscript"/>
-          <w:lang w:val="en-TH" w:bidi="km-KH"/>
         </w:rPr>
         <w:t>2</w:t>
       </w:r>
       <w:r>
         <w:rPr>
-          <w:rFonts w:ascii="Arial" w:hAnsi="Arial" w:cs="Arial"/>
-          <w:color w:val="000000"/>
-          <w:lang w:val="en-TH" w:bidi="km-KH"/>
-        </w:rPr>
-        <w:t xml:space="preserve">) catalyst </w:t>
-      </w:r>
-      <w:r>
-        <w:rPr>
-          <w:rFonts w:ascii="Arial" w:hAnsi="Arial" w:cs="Arial"/>
-          <w:color w:val="000000"/>
-          <w:lang w:val="en-TH" w:bidi="km-KH"/>
-        </w:rPr>
-        <w:t xml:space="preserve">in </w:t>
-      </w:r>
-      <w:r>
-        <w:rPr>
-          <w:rFonts w:ascii="Arial" w:hAnsi="Arial" w:cs="Arial"/>
-          <w:color w:val="000000"/>
-          <w:lang w:val="en-TH" w:bidi="km-KH"/>
-        </w:rPr>
-        <w:t>AEM</w:t>
-      </w:r>
-      <w:r>
-        <w:rPr>
-          <w:rFonts w:ascii="Arial" w:hAnsi="Arial" w:cs="Arial"/>
-          <w:color w:val="000000"/>
-          <w:lang w:val="en-TH" w:bidi="km-KH"/>
-        </w:rPr>
-        <w:t xml:space="preserve"> system with 350µm/250µm silicone gaskets and </w:t>
-      </w:r>
-      <w:r>
-        <w:rPr>
-          <w:rFonts w:ascii="Arial" w:hAnsi="Arial" w:cs="Arial"/>
-          <w:color w:val="000000"/>
-          <w:lang w:val="en-TH" w:bidi="km-KH"/>
-        </w:rPr>
-        <w:t>8</w:t>
-      </w:r>
-      <w:r>
-        <w:rPr>
-          <w:rFonts w:ascii="Arial" w:hAnsi="Arial" w:cs="Arial"/>
-          <w:color w:val="000000"/>
-          <w:lang w:val="en-TH" w:bidi="km-KH"/>
-        </w:rPr>
-        <w:t xml:space="preserve"> ft.lbs under </w:t>
-      </w:r>
-      <w:r>
-        <w:rPr>
-          <w:rFonts w:ascii="Arial" w:hAnsi="Arial" w:cs="Arial"/>
-          <w:color w:val="000000"/>
-          <w:lang w:val="en-TH" w:bidi="km-KH"/>
-        </w:rPr>
-        <w:t>50mM CH</w:t>
-      </w:r>
-      <w:r>
-        <w:rPr>
-          <w:rFonts w:ascii="Arial" w:hAnsi="Arial" w:cs="Arial"/>
-          <w:color w:val="000000"/>
+          <w:rFonts w:ascii="Arial" w:hAnsi="Arial"/>
+        </w:rPr>
+        <w:t>) catalyst in AEM system with 350µm/250µm silicone gaskets and 8 ft.lbs under 50mM CH</w:t>
+      </w:r>
+      <w:r>
+        <w:rPr>
+          <w:rFonts w:ascii="Arial" w:hAnsi="Arial"/>
           <w:vertAlign w:val="subscript"/>
-          <w:lang w:val="en-TH" w:bidi="km-KH"/>
         </w:rPr>
         <w:t>3</w:t>
       </w:r>
       <w:r>
         <w:rPr>
-          <w:rFonts w:ascii="Arial" w:hAnsi="Arial" w:cs="Arial"/>
-          <w:color w:val="000000"/>
-          <w:lang w:val="en-TH" w:bidi="km-KH"/>
-        </w:rPr>
-        <w:t>COOH humidified</w:t>
-      </w:r>
-      <w:r>
-        <w:rPr>
-          <w:rFonts w:ascii="Arial" w:hAnsi="Arial" w:cs="Arial"/>
-          <w:color w:val="000000"/>
-          <w:lang w:val="en-TH" w:bidi="km-KH"/>
-        </w:rPr>
-        <w:t xml:space="preserve"> </w:t>
-      </w:r>
-      <w:r>
-        <w:rPr>
-          <w:rFonts w:ascii="Arial" w:hAnsi="Arial" w:cs="Arial"/>
+          <w:rFonts w:ascii="Arial" w:hAnsi="Arial"/>
+        </w:rPr>
+        <w:t xml:space="preserve">COOH humidified </w:t>
+      </w:r>
+      <w:r>
+        <w:rPr>
+          <w:rFonts w:ascii="Arial" w:hAnsi="Arial"/>
           <w:b/>
-          <w:bCs/>
-          <w:color w:val="000000"/>
-          <w:lang w:val="en-TH" w:bidi="km-KH"/>
         </w:rPr>
         <w:t>800ml/min CO</w:t>
       </w:r>
       <w:r>
         <w:rPr>
-          <w:rFonts w:ascii="Arial" w:hAnsi="Arial" w:cs="Arial"/>
+          <w:rFonts w:ascii="Arial" w:hAnsi="Arial"/>
           <w:b/>
-          <w:bCs/>
-          <w:color w:val="000000"/>
           <w:vertAlign w:val="subscript"/>
-          <w:lang w:val="en-TH" w:bidi="km-KH"/>
         </w:rPr>
         <w:t>2</w:t>
       </w:r>
       <w:r>
         <w:rPr>
-          <w:rFonts w:ascii="Arial" w:hAnsi="Arial" w:cs="Arial"/>
-          <w:color w:val="000000"/>
-          <w:lang w:val="en-TH" w:bidi="km-KH"/>
-        </w:rPr>
-        <w:t xml:space="preserve">, </w:t>
-      </w:r>
-      <w:r>
-        <w:rPr>
-          <w:rFonts w:ascii="Arial" w:hAnsi="Arial" w:cs="Arial"/>
-          <w:color w:val="000000"/>
-          <w:lang w:val="en-TH" w:bidi="km-KH"/>
-        </w:rPr>
-        <w:t xml:space="preserve">100 </w:t>
-      </w:r>
-      <w:r>
-        <w:rPr>
-          <w:rFonts w:ascii="Arial" w:hAnsi="Arial" w:cs="Arial"/>
-          <w:color w:val="000000"/>
-          <w:lang w:val="en-TH" w:bidi="km-KH"/>
-        </w:rPr>
-        <w:t>ml/min of 0.</w:t>
-      </w:r>
-      <w:r>
-        <w:rPr>
-          <w:rFonts w:ascii="Arial" w:hAnsi="Arial" w:cs="Arial"/>
-          <w:color w:val="000000"/>
-          <w:lang w:val="en-TH" w:bidi="km-KH"/>
-        </w:rPr>
-        <w:t>1</w:t>
-      </w:r>
-      <w:r>
-        <w:rPr>
-          <w:rFonts w:ascii="Arial" w:hAnsi="Arial" w:cs="Arial"/>
-          <w:color w:val="000000"/>
-          <w:lang w:val="en-TH" w:bidi="km-KH"/>
-        </w:rPr>
-        <w:t>M K</w:t>
-      </w:r>
-      <w:r>
-        <w:rPr>
-          <w:rFonts w:ascii="Arial" w:hAnsi="Arial" w:cs="Arial"/>
-          <w:color w:val="000000"/>
-          <w:lang w:val="en-TH" w:bidi="km-KH"/>
-        </w:rPr>
-        <w:t>HCO</w:t>
-      </w:r>
-      <w:r>
-        <w:rPr>
-          <w:rFonts w:ascii="Arial" w:hAnsi="Arial" w:cs="Arial"/>
-          <w:color w:val="000000"/>
+          <w:rFonts w:ascii="Arial" w:hAnsi="Arial"/>
+        </w:rPr>
+        <w:t>, 100 ml/min of 0.1M KHCO</w:t>
+      </w:r>
+      <w:r>
+        <w:rPr>
+          <w:rFonts w:ascii="Arial" w:hAnsi="Arial"/>
           <w:vertAlign w:val="subscript"/>
-          <w:lang w:val="en-TH" w:bidi="km-KH"/>
         </w:rPr>
         <w:t>3</w:t>
       </w:r>
       <w:r>
         <w:rPr>
-          <w:rFonts w:ascii="Arial" w:hAnsi="Arial" w:cs="Arial"/>
-          <w:color w:val="000000"/>
-          <w:lang w:val="en-TH" w:bidi="km-KH"/>
+          <w:rFonts w:ascii="Arial" w:hAnsi="Arial"/>
         </w:rPr>
         <w:t>, and IrO</w:t>
       </w:r>
       <w:r>
         <w:rPr>
-          <w:rFonts w:ascii="Arial" w:hAnsi="Arial" w:cs="Arial"/>
-          <w:color w:val="000000"/>
+          <w:rFonts w:ascii="Arial" w:hAnsi="Arial"/>
           <w:vertAlign w:val="subscript"/>
-          <w:lang w:val="en-TH" w:bidi="km-KH"/>
         </w:rPr>
         <w:t>2</w:t>
       </w:r>
       <w:r>
         <w:rPr>
-          <w:rFonts w:ascii="Arial" w:hAnsi="Arial" w:cs="Arial"/>
-          <w:color w:val="000000"/>
-          <w:lang w:val="en-TH" w:bidi="km-KH"/>
+          <w:rFonts w:ascii="Arial" w:hAnsi="Arial"/>
         </w:rPr>
         <w:t>-TiPt anode at 100mA/cm</w:t>
       </w:r>
       <w:r>
         <w:rPr>
-          <w:rFonts w:ascii="Arial" w:hAnsi="Arial" w:cs="Arial"/>
-          <w:color w:val="000000"/>
+          <w:rFonts w:ascii="Arial" w:hAnsi="Arial"/>
           <w:vertAlign w:val="superscript"/>
-          <w:lang w:val="en-TH" w:bidi="km-KH"/>
         </w:rPr>
         <w:t>2</w:t>
       </w:r>
@@ -4584,317 +2322,122 @@
       </w:pPr>
       <w:r>
         <w:rPr>
-          <w:rFonts w:ascii="Arial" w:hAnsi="Arial" w:cs="Arial"/>
+          <w:rFonts w:ascii="Arial" w:hAnsi="Arial"/>
           <w:b/>
-          <w:bCs/>
-          <w:color w:val="000000"/>
-          <w:lang w:val="en-TH" w:bidi="km-KH"/>
         </w:rPr>
         <w:t>100cm</w:t>
       </w:r>
       <w:r>
         <w:rPr>
-          <w:rFonts w:ascii="Arial" w:hAnsi="Arial" w:cs="Arial"/>
+          <w:rFonts w:ascii="Arial" w:hAnsi="Arial"/>
           <w:b/>
-          <w:bCs/>
-          <w:color w:val="000000"/>
           <w:vertAlign w:val="superscript"/>
-          <w:lang w:val="en-TH" w:bidi="km-KH"/>
         </w:rPr>
         <w:t>2</w:t>
       </w:r>
       <w:r>
         <w:rPr>
-          <w:rFonts w:ascii="Arial" w:hAnsi="Arial" w:cs="Arial"/>
+          <w:rFonts w:ascii="Arial" w:hAnsi="Arial"/>
           <w:b/>
-          <w:bCs/>
-          <w:color w:val="000000"/>
-          <w:lang w:val="en-TH" w:bidi="km-KH"/>
-        </w:rPr>
-        <w:t xml:space="preserve"> MEA electrolyzer operation in 45</w:t>
-      </w:r>
-      <w:r>
-        <w:rPr>
-          <w:rFonts w:ascii="Arial" w:hAnsi="Arial" w:cs="Arial"/>
+        </w:rPr>
+        <w:t xml:space="preserve"> MEA electrolyzer operation in 45 position</w:t>
+      </w:r>
+      <w:r>
+        <w:rPr>
+          <w:rFonts w:ascii="Arial" w:hAnsi="Arial"/>
+        </w:rPr>
+        <w:t xml:space="preserve"> – CO</w:t>
+      </w:r>
+      <w:r>
+        <w:rPr>
+          <w:rFonts w:ascii="Arial" w:hAnsi="Arial"/>
+          <w:vertAlign w:val="subscript"/>
+        </w:rPr>
+        <w:t>2</w:t>
+      </w:r>
+      <w:r>
+        <w:rPr>
+          <w:rFonts w:ascii="Arial" w:hAnsi="Arial"/>
+        </w:rPr>
+        <w:t xml:space="preserve"> electrolysis of AgNPs (50nm, ~0.6mg/cm</w:t>
+      </w:r>
+      <w:r>
+        <w:rPr>
+          <w:rFonts w:ascii="Arial" w:hAnsi="Arial"/>
+          <w:vertAlign w:val="superscript"/>
+        </w:rPr>
+        <w:t>2</w:t>
+      </w:r>
+      <w:r>
+        <w:rPr>
+          <w:rFonts w:ascii="Arial" w:hAnsi="Arial"/>
+        </w:rPr>
+        <w:t>) catalyst in AEM system with 350µm/250µm silicone gaskets and 8 ft.lbs under 50mM CH</w:t>
+      </w:r>
+      <w:r>
+        <w:rPr>
+          <w:rFonts w:ascii="Arial" w:hAnsi="Arial"/>
+          <w:vertAlign w:val="subscript"/>
+        </w:rPr>
+        <w:t>3</w:t>
+      </w:r>
+      <w:r>
+        <w:rPr>
+          <w:rFonts w:ascii="Arial" w:hAnsi="Arial"/>
+        </w:rPr>
+        <w:t xml:space="preserve">COOH humidified </w:t>
+      </w:r>
+      <w:r>
+        <w:rPr>
+          <w:rFonts w:ascii="Arial" w:hAnsi="Arial"/>
           <w:b/>
-          <w:bCs/>
-          <w:color w:val="000000"/>
-          <w:lang w:val="en-TH" w:bidi="km-KH"/>
-        </w:rPr>
-        <w:sym w:font="Symbol" w:char="F0B0"/>
-      </w:r>
-      <w:r>
-        <w:rPr>
-          <w:rFonts w:ascii="Arial" w:hAnsi="Arial" w:cs="Arial"/>
+        </w:rPr>
+        <w:t>400 or 800 ml/min CO</w:t>
+      </w:r>
+      <w:r>
+        <w:rPr>
+          <w:rFonts w:ascii="Arial" w:hAnsi="Arial"/>
           <w:b/>
-          <w:bCs/>
-          <w:color w:val="000000"/>
-          <w:lang w:val="en-TH" w:bidi="km-KH"/>
-        </w:rPr>
-        <w:t xml:space="preserve"> position</w:t>
-      </w:r>
-      <w:r>
-        <w:rPr>
-          <w:rFonts w:ascii="Arial" w:hAnsi="Arial" w:cs="Arial"/>
-          <w:color w:val="000000"/>
-          <w:lang w:val="en-TH" w:bidi="km-KH"/>
-        </w:rPr>
-        <w:t xml:space="preserve"> – CO</w:t>
-      </w:r>
-      <w:r>
-        <w:rPr>
-          <w:rFonts w:ascii="Arial" w:hAnsi="Arial" w:cs="Arial"/>
-          <w:color w:val="000000"/>
           <w:vertAlign w:val="subscript"/>
-          <w:lang w:val="en-TH" w:bidi="km-KH"/>
         </w:rPr>
         <w:t>2</w:t>
       </w:r>
       <w:r>
         <w:rPr>
-          <w:rFonts w:ascii="Arial" w:hAnsi="Arial" w:cs="Arial"/>
-          <w:color w:val="000000"/>
-          <w:lang w:val="en-TH" w:bidi="km-KH"/>
-        </w:rPr>
-        <w:t xml:space="preserve"> electrolysis of</w:t>
-      </w:r>
-      <w:r>
-        <w:rPr>
-          <w:rFonts w:ascii="Arial" w:hAnsi="Arial" w:cs="Arial"/>
-          <w:color w:val="000000"/>
-          <w:lang w:val="en-TH" w:bidi="km-KH"/>
-        </w:rPr>
-        <w:t xml:space="preserve"> AgNPs (50nm, ~0.6mg/cm</w:t>
-      </w:r>
-      <w:r>
-        <w:rPr>
-          <w:rFonts w:ascii="Arial" w:hAnsi="Arial" w:cs="Arial"/>
-          <w:color w:val="000000"/>
+          <w:rFonts w:ascii="Arial" w:hAnsi="Arial"/>
+        </w:rPr>
+        <w:t>, 100 ml/min of 0.1M KHCO</w:t>
+      </w:r>
+      <w:r>
+        <w:rPr>
+          <w:rFonts w:ascii="Arial" w:hAnsi="Arial"/>
+          <w:vertAlign w:val="subscript"/>
+        </w:rPr>
+        <w:t>3</w:t>
+      </w:r>
+      <w:r>
+        <w:rPr>
+          <w:rFonts w:ascii="Arial" w:hAnsi="Arial"/>
+        </w:rPr>
+        <w:t>, and IrO</w:t>
+      </w:r>
+      <w:r>
+        <w:rPr>
+          <w:rFonts w:ascii="Arial" w:hAnsi="Arial"/>
+          <w:vertAlign w:val="subscript"/>
+        </w:rPr>
+        <w:t>2</w:t>
+      </w:r>
+      <w:r>
+        <w:rPr>
+          <w:rFonts w:ascii="Arial" w:hAnsi="Arial"/>
+        </w:rPr>
+        <w:t>-TiPt anode at 100mA/cm</w:t>
+      </w:r>
+      <w:r>
+        <w:rPr>
+          <w:rFonts w:ascii="Arial" w:hAnsi="Arial"/>
           <w:vertAlign w:val="superscript"/>
-          <w:lang w:val="en-TH" w:bidi="km-KH"/>
-        </w:rPr>
-        <w:t>2</w:t>
-      </w:r>
-      <w:r>
-        <w:rPr>
-          <w:rFonts w:ascii="Arial" w:hAnsi="Arial" w:cs="Arial"/>
-          <w:color w:val="000000"/>
-          <w:lang w:val="en-TH" w:bidi="km-KH"/>
-        </w:rPr>
-        <w:t xml:space="preserve">) catalyst </w:t>
-      </w:r>
-      <w:r>
-        <w:rPr>
-          <w:rFonts w:ascii="Arial" w:hAnsi="Arial" w:cs="Arial"/>
-          <w:color w:val="000000"/>
-          <w:lang w:val="en-TH" w:bidi="km-KH"/>
-        </w:rPr>
-        <w:t xml:space="preserve">in </w:t>
-      </w:r>
-      <w:r>
-        <w:rPr>
-          <w:rFonts w:ascii="Arial" w:hAnsi="Arial" w:cs="Arial"/>
-          <w:color w:val="000000"/>
-          <w:lang w:val="en-TH" w:bidi="km-KH"/>
-        </w:rPr>
-        <w:t>AEM</w:t>
-      </w:r>
-      <w:r>
-        <w:rPr>
-          <w:rFonts w:ascii="Arial" w:hAnsi="Arial" w:cs="Arial"/>
-          <w:color w:val="000000"/>
-          <w:lang w:val="en-TH" w:bidi="km-KH"/>
-        </w:rPr>
-        <w:t xml:space="preserve"> system with 350µm/250µm silicone gaskets and </w:t>
-      </w:r>
-      <w:r>
-        <w:rPr>
-          <w:rFonts w:ascii="Arial" w:hAnsi="Arial" w:cs="Arial"/>
-          <w:color w:val="000000"/>
-          <w:lang w:val="en-TH" w:bidi="km-KH"/>
-        </w:rPr>
-        <w:t>8</w:t>
-      </w:r>
-      <w:r>
-        <w:rPr>
-          <w:rFonts w:ascii="Arial" w:hAnsi="Arial" w:cs="Arial"/>
-          <w:color w:val="000000"/>
-          <w:lang w:val="en-TH" w:bidi="km-KH"/>
-        </w:rPr>
-        <w:t xml:space="preserve"> ft.lbs under </w:t>
-      </w:r>
-      <w:r>
-        <w:rPr>
-          <w:rFonts w:ascii="Arial" w:hAnsi="Arial" w:cs="Arial"/>
-          <w:color w:val="000000"/>
-          <w:lang w:val="en-TH" w:bidi="km-KH"/>
-        </w:rPr>
-        <w:t>50mM CH</w:t>
-      </w:r>
-      <w:r>
-        <w:rPr>
-          <w:rFonts w:ascii="Arial" w:hAnsi="Arial" w:cs="Arial"/>
-          <w:color w:val="000000"/>
-          <w:vertAlign w:val="subscript"/>
-          <w:lang w:val="en-TH" w:bidi="km-KH"/>
-        </w:rPr>
-        <w:t>3</w:t>
-      </w:r>
-      <w:r>
-        <w:rPr>
-          <w:rFonts w:ascii="Arial" w:hAnsi="Arial" w:cs="Arial"/>
-          <w:color w:val="000000"/>
-          <w:lang w:val="en-TH" w:bidi="km-KH"/>
-        </w:rPr>
-        <w:t>COOH humidified</w:t>
-      </w:r>
-      <w:r>
-        <w:rPr>
-          <w:rFonts w:ascii="Arial" w:hAnsi="Arial" w:cs="Arial"/>
-          <w:color w:val="000000"/>
-          <w:lang w:val="en-TH" w:bidi="km-KH"/>
-        </w:rPr>
-        <w:t xml:space="preserve"> </w:t>
-      </w:r>
-      <w:r>
-        <w:rPr>
-          <w:rFonts w:ascii="Arial" w:hAnsi="Arial" w:cs="Arial"/>
-          <w:b/>
-          <w:bCs/>
-          <w:color w:val="000000"/>
-          <w:lang w:val="en-TH" w:bidi="km-KH"/>
-        </w:rPr>
-        <w:t>4</w:t>
-      </w:r>
-      <w:r>
-        <w:rPr>
-          <w:rFonts w:ascii="Arial" w:hAnsi="Arial" w:cs="Arial"/>
-          <w:b/>
-          <w:bCs/>
-          <w:color w:val="000000"/>
-          <w:lang w:val="en-TH" w:bidi="km-KH"/>
-        </w:rPr>
-        <w:t>00</w:t>
-      </w:r>
-      <w:r>
-        <w:rPr>
-          <w:rFonts w:ascii="Arial" w:hAnsi="Arial" w:cs="Arial"/>
-          <w:b/>
-          <w:bCs/>
-          <w:color w:val="000000"/>
-          <w:lang w:val="en-TH" w:bidi="km-KH"/>
-        </w:rPr>
-        <w:t xml:space="preserve"> or 800 </w:t>
-      </w:r>
-      <w:r>
-        <w:rPr>
-          <w:rFonts w:ascii="Arial" w:hAnsi="Arial" w:cs="Arial"/>
-          <w:b/>
-          <w:bCs/>
-          <w:color w:val="000000"/>
-          <w:lang w:val="en-TH" w:bidi="km-KH"/>
-        </w:rPr>
-        <w:t>ml/min CO</w:t>
-      </w:r>
-      <w:r>
-        <w:rPr>
-          <w:rFonts w:ascii="Arial" w:hAnsi="Arial" w:cs="Arial"/>
-          <w:b/>
-          <w:bCs/>
-          <w:color w:val="000000"/>
-          <w:vertAlign w:val="subscript"/>
-          <w:lang w:val="en-TH" w:bidi="km-KH"/>
-        </w:rPr>
-        <w:t>2</w:t>
-      </w:r>
-      <w:r>
-        <w:rPr>
-          <w:rFonts w:ascii="Arial" w:hAnsi="Arial" w:cs="Arial"/>
-          <w:color w:val="000000"/>
-          <w:lang w:val="en-TH" w:bidi="km-KH"/>
-        </w:rPr>
-        <w:t xml:space="preserve">, </w:t>
-      </w:r>
-      <w:r>
-        <w:rPr>
-          <w:rFonts w:ascii="Arial" w:hAnsi="Arial" w:cs="Arial"/>
-          <w:color w:val="000000"/>
-          <w:lang w:val="en-TH" w:bidi="km-KH"/>
-        </w:rPr>
-        <w:t xml:space="preserve">100 </w:t>
-      </w:r>
-      <w:r>
-        <w:rPr>
-          <w:rFonts w:ascii="Arial" w:hAnsi="Arial" w:cs="Arial"/>
-          <w:color w:val="000000"/>
-          <w:lang w:val="en-TH" w:bidi="km-KH"/>
-        </w:rPr>
-        <w:t>ml/min of 0.</w:t>
-      </w:r>
-      <w:r>
-        <w:rPr>
-          <w:rFonts w:ascii="Arial" w:hAnsi="Arial" w:cs="Arial"/>
-          <w:color w:val="000000"/>
-          <w:lang w:val="en-TH" w:bidi="km-KH"/>
-        </w:rPr>
-        <w:t>1</w:t>
-      </w:r>
-      <w:r>
-        <w:rPr>
-          <w:rFonts w:ascii="Arial" w:hAnsi="Arial" w:cs="Arial"/>
-          <w:color w:val="000000"/>
-          <w:lang w:val="en-TH" w:bidi="km-KH"/>
-        </w:rPr>
-        <w:t>M K</w:t>
-      </w:r>
-      <w:r>
-        <w:rPr>
-          <w:rFonts w:ascii="Arial" w:hAnsi="Arial" w:cs="Arial"/>
-          <w:color w:val="000000"/>
-          <w:lang w:val="en-TH" w:bidi="km-KH"/>
-        </w:rPr>
-        <w:t>HCO</w:t>
-      </w:r>
-      <w:r>
-        <w:rPr>
-          <w:rFonts w:ascii="Arial" w:hAnsi="Arial" w:cs="Arial"/>
-          <w:color w:val="000000"/>
-          <w:vertAlign w:val="subscript"/>
-          <w:lang w:val="en-TH" w:bidi="km-KH"/>
-        </w:rPr>
-        <w:t>3</w:t>
-      </w:r>
-      <w:r>
-        <w:rPr>
-          <w:rFonts w:ascii="Arial" w:hAnsi="Arial" w:cs="Arial"/>
-          <w:color w:val="000000"/>
-          <w:lang w:val="en-TH" w:bidi="km-KH"/>
-        </w:rPr>
-        <w:t>, and IrO</w:t>
-      </w:r>
-      <w:r>
-        <w:rPr>
-          <w:rFonts w:ascii="Arial" w:hAnsi="Arial" w:cs="Arial"/>
-          <w:color w:val="000000"/>
-          <w:vertAlign w:val="subscript"/>
-          <w:lang w:val="en-TH" w:bidi="km-KH"/>
-        </w:rPr>
-        <w:t>2</w:t>
-      </w:r>
-      <w:r>
-        <w:rPr>
-          <w:rFonts w:ascii="Arial" w:hAnsi="Arial" w:cs="Arial"/>
-          <w:color w:val="000000"/>
-          <w:lang w:val="en-TH" w:bidi="km-KH"/>
-        </w:rPr>
-        <w:t>-TiPt anode at 100mA/cm</w:t>
-      </w:r>
-      <w:r>
-        <w:rPr>
-          <w:rFonts w:ascii="Arial" w:hAnsi="Arial" w:cs="Arial"/>
-          <w:color w:val="000000"/>
-          <w:vertAlign w:val="superscript"/>
-          <w:lang w:val="en-TH" w:bidi="km-KH"/>
         </w:rPr>
         <w:t>2</w:t>
       </w:r>

</xml_diff>

<commit_message>
Fix native sub/superscript in Results body paragraphs and headings
Convert remaining Unicode glyphs (CO₂, cm², mA·cm⁻², ml·min⁻¹, CH₃,
KHCO₃, N₂, K⁺) in the Results section body and subsection headings to
native Word formatting in Arial.

Co-Authored-By: Claude Opus 4.8 <noreply@anthropic.com>
</commit_message>
<xml_diff>
--- a/writing.agent/plotted graphs/June/6_June report - Sothearoth Heng.docx
+++ b/writing.agent/plotted graphs/June/6_June report - Sothearoth Heng.docx
@@ -202,14 +202,12 @@
       <w:r>
         <w:rPr>
           <w:rFonts w:ascii="Arial" w:hAnsi="Arial"/>
-          <w:b/>
         </w:rPr>
         <w:t>100cm</w:t>
       </w:r>
       <w:r>
         <w:rPr>
           <w:rFonts w:ascii="Arial" w:hAnsi="Arial"/>
-          <w:b/>
           <w:vertAlign w:val="superscript"/>
         </w:rPr>
         <w:t>2</w:t>
@@ -217,15 +215,8 @@
       <w:r>
         <w:rPr>
           <w:rFonts w:ascii="Arial" w:hAnsi="Arial"/>
-          <w:b/>
-        </w:rPr>
-        <w:t xml:space="preserve"> MEA electrolyzer operation in 30 position</w:t>
-      </w:r>
-      <w:r>
-        <w:rPr>
-          <w:rFonts w:ascii="Arial" w:hAnsi="Arial"/>
-        </w:rPr>
-        <w:t xml:space="preserve"> – CO</w:t>
+        </w:rPr>
+        <w:t xml:space="preserve"> MEA electrolyzer operation in 30 position – CO</w:t>
       </w:r>
       <w:r>
         <w:rPr>

</xml_diff>